<commit_message>
Icono del programa (yunque) en el ejecutable, las ventanas, el instalador y los accesos directos
</commit_message>
<xml_diff>
--- a/Documentacion/Manuales/Manual-de-instalacion.docx
+++ b/Documentacion/Manuales/Manual-de-instalacion.docx
@@ -164,7 +164,7 @@
         </w:numPr>
         <w:spacing w:before="15" w:after="15"/>
         <w:ind w:left="930"/>
-        <w:divId w:val="1553466295"/>
+        <w:divId w:val="1001159149"/>
         <w:rPr>
           <w:rFonts w:ascii="Calibri" w:eastAsia="Times New Roman" w:hAnsi="Calibri" w:cs="Calibri"/>
           <w:color w:val="1C2430"/>
@@ -192,7 +192,7 @@
         </w:numPr>
         <w:spacing w:before="15" w:after="15"/>
         <w:ind w:left="1140"/>
-        <w:divId w:val="1553466295"/>
+        <w:divId w:val="1001159149"/>
         <w:rPr>
           <w:rFonts w:ascii="Calibri" w:eastAsia="Times New Roman" w:hAnsi="Calibri" w:cs="Calibri"/>
           <w:color w:val="1C2430"/>
@@ -220,7 +220,7 @@
         </w:numPr>
         <w:spacing w:before="15" w:after="15"/>
         <w:ind w:left="1140"/>
-        <w:divId w:val="1553466295"/>
+        <w:divId w:val="1001159149"/>
         <w:rPr>
           <w:rFonts w:ascii="Calibri" w:eastAsia="Times New Roman" w:hAnsi="Calibri" w:cs="Calibri"/>
           <w:color w:val="1C2430"/>
@@ -248,7 +248,7 @@
         </w:numPr>
         <w:spacing w:before="15" w:after="15"/>
         <w:ind w:left="1140"/>
-        <w:divId w:val="1553466295"/>
+        <w:divId w:val="1001159149"/>
         <w:rPr>
           <w:rFonts w:ascii="Calibri" w:eastAsia="Times New Roman" w:hAnsi="Calibri" w:cs="Calibri"/>
           <w:color w:val="1C2430"/>
@@ -276,7 +276,7 @@
         </w:numPr>
         <w:spacing w:before="15" w:after="15"/>
         <w:ind w:left="930"/>
-        <w:divId w:val="1553466295"/>
+        <w:divId w:val="1001159149"/>
         <w:rPr>
           <w:rFonts w:ascii="Calibri" w:eastAsia="Times New Roman" w:hAnsi="Calibri" w:cs="Calibri"/>
           <w:color w:val="1C2430"/>
@@ -304,7 +304,7 @@
         </w:numPr>
         <w:spacing w:before="15" w:after="15"/>
         <w:ind w:left="1140"/>
-        <w:divId w:val="1553466295"/>
+        <w:divId w:val="1001159149"/>
         <w:rPr>
           <w:rFonts w:ascii="Calibri" w:eastAsia="Times New Roman" w:hAnsi="Calibri" w:cs="Calibri"/>
           <w:color w:val="1C2430"/>
@@ -332,7 +332,7 @@
         </w:numPr>
         <w:spacing w:before="15" w:after="15"/>
         <w:ind w:left="1140"/>
-        <w:divId w:val="1553466295"/>
+        <w:divId w:val="1001159149"/>
         <w:rPr>
           <w:rFonts w:ascii="Calibri" w:eastAsia="Times New Roman" w:hAnsi="Calibri" w:cs="Calibri"/>
           <w:color w:val="1C2430"/>
@@ -360,7 +360,7 @@
         </w:numPr>
         <w:spacing w:before="15" w:after="15"/>
         <w:ind w:left="930"/>
-        <w:divId w:val="1553466295"/>
+        <w:divId w:val="1001159149"/>
         <w:rPr>
           <w:rFonts w:ascii="Calibri" w:eastAsia="Times New Roman" w:hAnsi="Calibri" w:cs="Calibri"/>
           <w:color w:val="1C2430"/>
@@ -388,7 +388,7 @@
         </w:numPr>
         <w:spacing w:before="15" w:after="15"/>
         <w:ind w:left="1140"/>
-        <w:divId w:val="1553466295"/>
+        <w:divId w:val="1001159149"/>
         <w:rPr>
           <w:rFonts w:ascii="Calibri" w:eastAsia="Times New Roman" w:hAnsi="Calibri" w:cs="Calibri"/>
           <w:color w:val="1C2430"/>
@@ -416,7 +416,7 @@
         </w:numPr>
         <w:spacing w:before="15" w:after="15"/>
         <w:ind w:left="930"/>
-        <w:divId w:val="1553466295"/>
+        <w:divId w:val="1001159149"/>
         <w:rPr>
           <w:rFonts w:ascii="Calibri" w:eastAsia="Times New Roman" w:hAnsi="Calibri" w:cs="Calibri"/>
           <w:color w:val="1C2430"/>
@@ -444,7 +444,7 @@
         </w:numPr>
         <w:spacing w:before="15" w:after="15"/>
         <w:ind w:left="1140"/>
-        <w:divId w:val="1553466295"/>
+        <w:divId w:val="1001159149"/>
         <w:rPr>
           <w:rFonts w:ascii="Calibri" w:eastAsia="Times New Roman" w:hAnsi="Calibri" w:cs="Calibri"/>
           <w:color w:val="1C2430"/>
@@ -472,7 +472,7 @@
         </w:numPr>
         <w:spacing w:before="15" w:after="15"/>
         <w:ind w:left="1140"/>
-        <w:divId w:val="1553466295"/>
+        <w:divId w:val="1001159149"/>
         <w:rPr>
           <w:rFonts w:ascii="Calibri" w:eastAsia="Times New Roman" w:hAnsi="Calibri" w:cs="Calibri"/>
           <w:color w:val="1C2430"/>
@@ -500,7 +500,7 @@
         </w:numPr>
         <w:spacing w:before="15" w:after="15"/>
         <w:ind w:left="1140"/>
-        <w:divId w:val="1553466295"/>
+        <w:divId w:val="1001159149"/>
         <w:rPr>
           <w:rFonts w:ascii="Calibri" w:eastAsia="Times New Roman" w:hAnsi="Calibri" w:cs="Calibri"/>
           <w:color w:val="1C2430"/>
@@ -528,7 +528,7 @@
         </w:numPr>
         <w:spacing w:before="15" w:after="15"/>
         <w:ind w:left="1140"/>
-        <w:divId w:val="1553466295"/>
+        <w:divId w:val="1001159149"/>
         <w:rPr>
           <w:rFonts w:ascii="Calibri" w:eastAsia="Times New Roman" w:hAnsi="Calibri" w:cs="Calibri"/>
           <w:color w:val="1C2430"/>
@@ -556,7 +556,7 @@
         </w:numPr>
         <w:spacing w:before="15" w:after="15"/>
         <w:ind w:left="930"/>
-        <w:divId w:val="1553466295"/>
+        <w:divId w:val="1001159149"/>
         <w:rPr>
           <w:rFonts w:ascii="Calibri" w:eastAsia="Times New Roman" w:hAnsi="Calibri" w:cs="Calibri"/>
           <w:color w:val="1C2430"/>
@@ -584,7 +584,7 @@
         </w:numPr>
         <w:spacing w:before="15" w:after="15"/>
         <w:ind w:left="1140"/>
-        <w:divId w:val="1553466295"/>
+        <w:divId w:val="1001159149"/>
         <w:rPr>
           <w:rFonts w:ascii="Calibri" w:eastAsia="Times New Roman" w:hAnsi="Calibri" w:cs="Calibri"/>
           <w:color w:val="1C2430"/>
@@ -612,7 +612,7 @@
         </w:numPr>
         <w:spacing w:before="15" w:after="15"/>
         <w:ind w:left="1140"/>
-        <w:divId w:val="1553466295"/>
+        <w:divId w:val="1001159149"/>
         <w:rPr>
           <w:rFonts w:ascii="Calibri" w:eastAsia="Times New Roman" w:hAnsi="Calibri" w:cs="Calibri"/>
           <w:color w:val="1C2430"/>
@@ -640,7 +640,7 @@
         </w:numPr>
         <w:spacing w:before="15" w:after="15"/>
         <w:ind w:left="1140"/>
-        <w:divId w:val="1553466295"/>
+        <w:divId w:val="1001159149"/>
         <w:rPr>
           <w:rFonts w:ascii="Calibri" w:eastAsia="Times New Roman" w:hAnsi="Calibri" w:cs="Calibri"/>
           <w:color w:val="1C2430"/>
@@ -668,7 +668,7 @@
         </w:numPr>
         <w:spacing w:before="15" w:after="15"/>
         <w:ind w:left="1140"/>
-        <w:divId w:val="1553466295"/>
+        <w:divId w:val="1001159149"/>
         <w:rPr>
           <w:rFonts w:ascii="Calibri" w:eastAsia="Times New Roman" w:hAnsi="Calibri" w:cs="Calibri"/>
           <w:color w:val="1C2430"/>
@@ -696,7 +696,7 @@
         </w:numPr>
         <w:spacing w:before="15" w:after="15"/>
         <w:ind w:left="930"/>
-        <w:divId w:val="1553466295"/>
+        <w:divId w:val="1001159149"/>
         <w:rPr>
           <w:rFonts w:ascii="Calibri" w:eastAsia="Times New Roman" w:hAnsi="Calibri" w:cs="Calibri"/>
           <w:color w:val="1C2430"/>
@@ -724,7 +724,7 @@
         </w:numPr>
         <w:spacing w:before="15" w:after="15"/>
         <w:ind w:left="1140"/>
-        <w:divId w:val="1553466295"/>
+        <w:divId w:val="1001159149"/>
         <w:rPr>
           <w:rFonts w:ascii="Calibri" w:eastAsia="Times New Roman" w:hAnsi="Calibri" w:cs="Calibri"/>
           <w:color w:val="1C2430"/>
@@ -752,7 +752,7 @@
         </w:numPr>
         <w:spacing w:before="15" w:after="15"/>
         <w:ind w:left="1140"/>
-        <w:divId w:val="1553466295"/>
+        <w:divId w:val="1001159149"/>
         <w:rPr>
           <w:rFonts w:ascii="Calibri" w:eastAsia="Times New Roman" w:hAnsi="Calibri" w:cs="Calibri"/>
           <w:color w:val="1C2430"/>
@@ -780,7 +780,7 @@
         </w:numPr>
         <w:spacing w:before="15" w:after="15"/>
         <w:ind w:left="1140"/>
-        <w:divId w:val="1553466295"/>
+        <w:divId w:val="1001159149"/>
         <w:rPr>
           <w:rFonts w:ascii="Calibri" w:eastAsia="Times New Roman" w:hAnsi="Calibri" w:cs="Calibri"/>
           <w:color w:val="1C2430"/>
@@ -808,7 +808,7 @@
         </w:numPr>
         <w:spacing w:before="15" w:after="15"/>
         <w:ind w:left="1140"/>
-        <w:divId w:val="1553466295"/>
+        <w:divId w:val="1001159149"/>
         <w:rPr>
           <w:rFonts w:ascii="Calibri" w:eastAsia="Times New Roman" w:hAnsi="Calibri" w:cs="Calibri"/>
           <w:color w:val="1C2430"/>
@@ -836,7 +836,7 @@
         </w:numPr>
         <w:spacing w:before="15" w:after="15"/>
         <w:ind w:left="930"/>
-        <w:divId w:val="1553466295"/>
+        <w:divId w:val="1001159149"/>
         <w:rPr>
           <w:rFonts w:ascii="Calibri" w:eastAsia="Times New Roman" w:hAnsi="Calibri" w:cs="Calibri"/>
           <w:color w:val="1C2430"/>
@@ -864,7 +864,7 @@
         </w:numPr>
         <w:spacing w:before="15" w:after="15"/>
         <w:ind w:left="1140"/>
-        <w:divId w:val="1553466295"/>
+        <w:divId w:val="1001159149"/>
         <w:rPr>
           <w:rFonts w:ascii="Calibri" w:eastAsia="Times New Roman" w:hAnsi="Calibri" w:cs="Calibri"/>
           <w:color w:val="1C2430"/>
@@ -892,7 +892,7 @@
         </w:numPr>
         <w:spacing w:before="15" w:after="15"/>
         <w:ind w:left="1140"/>
-        <w:divId w:val="1553466295"/>
+        <w:divId w:val="1001159149"/>
         <w:rPr>
           <w:rFonts w:ascii="Calibri" w:eastAsia="Times New Roman" w:hAnsi="Calibri" w:cs="Calibri"/>
           <w:color w:val="1C2430"/>
@@ -920,7 +920,7 @@
         </w:numPr>
         <w:spacing w:before="15" w:after="15"/>
         <w:ind w:left="1140"/>
-        <w:divId w:val="1553466295"/>
+        <w:divId w:val="1001159149"/>
         <w:rPr>
           <w:rFonts w:ascii="Calibri" w:eastAsia="Times New Roman" w:hAnsi="Calibri" w:cs="Calibri"/>
           <w:color w:val="1C2430"/>
@@ -948,7 +948,7 @@
         </w:numPr>
         <w:spacing w:before="15" w:after="15"/>
         <w:ind w:left="1140"/>
-        <w:divId w:val="1553466295"/>
+        <w:divId w:val="1001159149"/>
         <w:rPr>
           <w:rFonts w:ascii="Calibri" w:eastAsia="Times New Roman" w:hAnsi="Calibri" w:cs="Calibri"/>
           <w:color w:val="1C2430"/>
@@ -976,7 +976,7 @@
         </w:numPr>
         <w:spacing w:before="15" w:after="15"/>
         <w:ind w:left="930"/>
-        <w:divId w:val="1553466295"/>
+        <w:divId w:val="1001159149"/>
         <w:rPr>
           <w:rFonts w:ascii="Calibri" w:eastAsia="Times New Roman" w:hAnsi="Calibri" w:cs="Calibri"/>
           <w:color w:val="1C2430"/>
@@ -1004,7 +1004,7 @@
         </w:numPr>
         <w:spacing w:before="15" w:after="15"/>
         <w:ind w:left="1140"/>
-        <w:divId w:val="1553466295"/>
+        <w:divId w:val="1001159149"/>
         <w:rPr>
           <w:rFonts w:ascii="Calibri" w:eastAsia="Times New Roman" w:hAnsi="Calibri" w:cs="Calibri"/>
           <w:color w:val="1C2430"/>
@@ -1032,7 +1032,7 @@
         </w:numPr>
         <w:spacing w:before="15" w:after="15"/>
         <w:ind w:left="1140"/>
-        <w:divId w:val="1553466295"/>
+        <w:divId w:val="1001159149"/>
         <w:rPr>
           <w:rFonts w:ascii="Calibri" w:eastAsia="Times New Roman" w:hAnsi="Calibri" w:cs="Calibri"/>
           <w:color w:val="1C2430"/>
@@ -1060,7 +1060,7 @@
         </w:numPr>
         <w:spacing w:before="15" w:after="15"/>
         <w:ind w:left="1140"/>
-        <w:divId w:val="1553466295"/>
+        <w:divId w:val="1001159149"/>
         <w:rPr>
           <w:rFonts w:ascii="Calibri" w:eastAsia="Times New Roman" w:hAnsi="Calibri" w:cs="Calibri"/>
           <w:color w:val="1C2430"/>
@@ -1088,7 +1088,7 @@
         </w:numPr>
         <w:spacing w:before="15" w:after="15"/>
         <w:ind w:left="930"/>
-        <w:divId w:val="1553466295"/>
+        <w:divId w:val="1001159149"/>
         <w:rPr>
           <w:rFonts w:ascii="Calibri" w:eastAsia="Times New Roman" w:hAnsi="Calibri" w:cs="Calibri"/>
           <w:color w:val="1C2430"/>
@@ -1116,7 +1116,7 @@
         </w:numPr>
         <w:spacing w:before="15" w:after="15"/>
         <w:ind w:left="1140"/>
-        <w:divId w:val="1553466295"/>
+        <w:divId w:val="1001159149"/>
         <w:rPr>
           <w:rFonts w:ascii="Calibri" w:eastAsia="Times New Roman" w:hAnsi="Calibri" w:cs="Calibri"/>
           <w:color w:val="1C2430"/>
@@ -1144,7 +1144,7 @@
         </w:numPr>
         <w:spacing w:before="15" w:after="15"/>
         <w:ind w:left="1140"/>
-        <w:divId w:val="1553466295"/>
+        <w:divId w:val="1001159149"/>
         <w:rPr>
           <w:rFonts w:ascii="Calibri" w:eastAsia="Times New Roman" w:hAnsi="Calibri" w:cs="Calibri"/>
           <w:color w:val="1C2430"/>
@@ -1172,7 +1172,7 @@
         </w:numPr>
         <w:spacing w:before="15" w:after="15"/>
         <w:ind w:left="1140"/>
-        <w:divId w:val="1553466295"/>
+        <w:divId w:val="1001159149"/>
         <w:rPr>
           <w:rFonts w:ascii="Calibri" w:eastAsia="Times New Roman" w:hAnsi="Calibri" w:cs="Calibri"/>
           <w:color w:val="1C2430"/>
@@ -1200,7 +1200,7 @@
         </w:numPr>
         <w:spacing w:before="15" w:after="15"/>
         <w:ind w:left="930"/>
-        <w:divId w:val="1553466295"/>
+        <w:divId w:val="1001159149"/>
         <w:rPr>
           <w:rFonts w:ascii="Calibri" w:eastAsia="Times New Roman" w:hAnsi="Calibri" w:cs="Calibri"/>
           <w:color w:val="1C2430"/>
@@ -1228,7 +1228,7 @@
         </w:numPr>
         <w:spacing w:before="15" w:after="15"/>
         <w:ind w:left="1140"/>
-        <w:divId w:val="1553466295"/>
+        <w:divId w:val="1001159149"/>
         <w:rPr>
           <w:rFonts w:ascii="Calibri" w:eastAsia="Times New Roman" w:hAnsi="Calibri" w:cs="Calibri"/>
           <w:color w:val="1C2430"/>
@@ -1256,7 +1256,7 @@
         </w:numPr>
         <w:spacing w:before="15" w:after="15"/>
         <w:ind w:left="1140"/>
-        <w:divId w:val="1553466295"/>
+        <w:divId w:val="1001159149"/>
         <w:rPr>
           <w:rFonts w:ascii="Calibri" w:eastAsia="Times New Roman" w:hAnsi="Calibri" w:cs="Calibri"/>
           <w:color w:val="1C2430"/>
@@ -1284,7 +1284,7 @@
         </w:numPr>
         <w:spacing w:before="15" w:after="15"/>
         <w:ind w:left="1140"/>
-        <w:divId w:val="1553466295"/>
+        <w:divId w:val="1001159149"/>
         <w:rPr>
           <w:rFonts w:ascii="Calibri" w:eastAsia="Times New Roman" w:hAnsi="Calibri" w:cs="Calibri"/>
           <w:color w:val="1C2430"/>
@@ -1312,7 +1312,7 @@
         </w:numPr>
         <w:spacing w:before="15" w:after="15"/>
         <w:ind w:left="1140"/>
-        <w:divId w:val="1553466295"/>
+        <w:divId w:val="1001159149"/>
         <w:rPr>
           <w:rFonts w:ascii="Calibri" w:eastAsia="Times New Roman" w:hAnsi="Calibri" w:cs="Calibri"/>
           <w:color w:val="1C2430"/>
@@ -1340,7 +1340,7 @@
         </w:numPr>
         <w:spacing w:before="15" w:after="15"/>
         <w:ind w:left="1140"/>
-        <w:divId w:val="1553466295"/>
+        <w:divId w:val="1001159149"/>
         <w:rPr>
           <w:rFonts w:ascii="Calibri" w:eastAsia="Times New Roman" w:hAnsi="Calibri" w:cs="Calibri"/>
           <w:color w:val="1C2430"/>
@@ -1368,7 +1368,7 @@
         </w:numPr>
         <w:spacing w:before="15" w:after="15"/>
         <w:ind w:left="1140"/>
-        <w:divId w:val="1553466295"/>
+        <w:divId w:val="1001159149"/>
         <w:rPr>
           <w:rFonts w:ascii="Calibri" w:eastAsia="Times New Roman" w:hAnsi="Calibri" w:cs="Calibri"/>
           <w:color w:val="1C2430"/>
@@ -1396,7 +1396,7 @@
         </w:numPr>
         <w:spacing w:before="15" w:after="15"/>
         <w:ind w:left="1140"/>
-        <w:divId w:val="1553466295"/>
+        <w:divId w:val="1001159149"/>
         <w:rPr>
           <w:rFonts w:ascii="Calibri" w:eastAsia="Times New Roman" w:hAnsi="Calibri" w:cs="Calibri"/>
           <w:color w:val="1C2430"/>
@@ -1424,7 +1424,7 @@
         </w:numPr>
         <w:spacing w:before="15" w:after="15"/>
         <w:ind w:left="1140"/>
-        <w:divId w:val="1553466295"/>
+        <w:divId w:val="1001159149"/>
         <w:rPr>
           <w:rFonts w:ascii="Calibri" w:eastAsia="Times New Roman" w:hAnsi="Calibri" w:cs="Calibri"/>
           <w:color w:val="1C2430"/>
@@ -1452,7 +1452,7 @@
         </w:numPr>
         <w:spacing w:before="15" w:after="15"/>
         <w:ind w:left="930"/>
-        <w:divId w:val="1553466295"/>
+        <w:divId w:val="1001159149"/>
         <w:rPr>
           <w:rFonts w:ascii="Calibri" w:eastAsia="Times New Roman" w:hAnsi="Calibri" w:cs="Calibri"/>
           <w:color w:val="1C2430"/>
@@ -1480,7 +1480,7 @@
         </w:numPr>
         <w:spacing w:before="15" w:after="15"/>
         <w:ind w:left="1140"/>
-        <w:divId w:val="1553466295"/>
+        <w:divId w:val="1001159149"/>
         <w:rPr>
           <w:rFonts w:ascii="Calibri" w:eastAsia="Times New Roman" w:hAnsi="Calibri" w:cs="Calibri"/>
           <w:color w:val="1C2430"/>
@@ -1508,7 +1508,7 @@
         </w:numPr>
         <w:spacing w:before="15" w:after="15"/>
         <w:ind w:left="930"/>
-        <w:divId w:val="1553466295"/>
+        <w:divId w:val="1001159149"/>
         <w:rPr>
           <w:rFonts w:ascii="Calibri" w:eastAsia="Times New Roman" w:hAnsi="Calibri" w:cs="Calibri"/>
           <w:color w:val="1C2430"/>
@@ -1536,7 +1536,7 @@
         </w:numPr>
         <w:spacing w:before="15" w:after="15"/>
         <w:ind w:left="1140"/>
-        <w:divId w:val="1553466295"/>
+        <w:divId w:val="1001159149"/>
         <w:rPr>
           <w:rFonts w:ascii="Calibri" w:eastAsia="Times New Roman" w:hAnsi="Calibri" w:cs="Calibri"/>
           <w:color w:val="1C2430"/>
@@ -1564,7 +1564,7 @@
         </w:numPr>
         <w:spacing w:before="15" w:after="15"/>
         <w:ind w:left="930"/>
-        <w:divId w:val="1553466295"/>
+        <w:divId w:val="1001159149"/>
         <w:rPr>
           <w:rFonts w:ascii="Calibri" w:eastAsia="Times New Roman" w:hAnsi="Calibri" w:cs="Calibri"/>
           <w:color w:val="1C2430"/>
@@ -1592,7 +1592,7 @@
         </w:numPr>
         <w:spacing w:before="15" w:after="15"/>
         <w:ind w:left="1140"/>
-        <w:divId w:val="1553466295"/>
+        <w:divId w:val="1001159149"/>
         <w:rPr>
           <w:rFonts w:ascii="Calibri" w:eastAsia="Times New Roman" w:hAnsi="Calibri" w:cs="Calibri"/>
           <w:color w:val="1C2430"/>
@@ -1620,7 +1620,7 @@
         </w:numPr>
         <w:spacing w:before="15" w:after="15"/>
         <w:ind w:left="1140"/>
-        <w:divId w:val="1553466295"/>
+        <w:divId w:val="1001159149"/>
         <w:rPr>
           <w:rFonts w:ascii="Calibri" w:eastAsia="Times New Roman" w:hAnsi="Calibri" w:cs="Calibri"/>
           <w:color w:val="1C2430"/>
@@ -1648,7 +1648,7 @@
         </w:numPr>
         <w:spacing w:before="15" w:after="15"/>
         <w:ind w:left="930"/>
-        <w:divId w:val="1553466295"/>
+        <w:divId w:val="1001159149"/>
         <w:rPr>
           <w:rFonts w:ascii="Calibri" w:eastAsia="Times New Roman" w:hAnsi="Calibri" w:cs="Calibri"/>
           <w:color w:val="1C2430"/>
@@ -1676,7 +1676,7 @@
         </w:numPr>
         <w:spacing w:before="15" w:after="15"/>
         <w:ind w:left="930"/>
-        <w:divId w:val="1553466295"/>
+        <w:divId w:val="1001159149"/>
         <w:rPr>
           <w:rFonts w:ascii="Calibri" w:eastAsia="Times New Roman" w:hAnsi="Calibri" w:cs="Calibri"/>
           <w:color w:val="1C2430"/>
@@ -3049,7 +3049,7 @@
       <w:pPr>
         <w:shd w:val="clear" w:color="auto" w:fill="FFF8E1"/>
         <w:spacing w:before="120" w:after="120"/>
-        <w:divId w:val="1829207452"/>
+        <w:divId w:val="23018332"/>
         <w:rPr>
           <w:rFonts w:ascii="Calibri" w:eastAsia="Times New Roman" w:hAnsi="Calibri" w:cs="Calibri"/>
           <w:color w:val="1C2430"/>
@@ -4080,7 +4080,7 @@
       <w:pPr>
         <w:shd w:val="clear" w:color="auto" w:fill="E9F6EE"/>
         <w:spacing w:before="120" w:after="120"/>
-        <w:divId w:val="273095247"/>
+        <w:divId w:val="570966921"/>
         <w:rPr>
           <w:rFonts w:ascii="Calibri" w:eastAsia="Times New Roman" w:hAnsi="Calibri" w:cs="Calibri"/>
           <w:color w:val="1C2430"/>
@@ -4254,7 +4254,7 @@
       <w:pPr>
         <w:shd w:val="clear" w:color="auto" w:fill="FFF8E1"/>
         <w:spacing w:before="120" w:after="120"/>
-        <w:divId w:val="399865502"/>
+        <w:divId w:val="215316441"/>
         <w:rPr>
           <w:rFonts w:ascii="Calibri" w:eastAsia="Times New Roman" w:hAnsi="Calibri" w:cs="Calibri"/>
           <w:color w:val="1C2430"/>
@@ -5451,7 +5451,7 @@
       <w:pPr>
         <w:shd w:val="clear" w:color="auto" w:fill="FFF8E1"/>
         <w:spacing w:before="120" w:after="120"/>
-        <w:divId w:val="515310072"/>
+        <w:divId w:val="1453018064"/>
         <w:rPr>
           <w:rFonts w:ascii="Calibri" w:eastAsia="Times New Roman" w:hAnsi="Calibri" w:cs="Calibri"/>
           <w:color w:val="1C2430"/>
@@ -5845,7 +5845,7 @@
       <w:pPr>
         <w:shd w:val="clear" w:color="auto" w:fill="E9F6EE"/>
         <w:spacing w:before="120" w:after="120"/>
-        <w:divId w:val="6031357"/>
+        <w:divId w:val="1689679923"/>
         <w:rPr>
           <w:rFonts w:ascii="Calibri" w:eastAsia="Times New Roman" w:hAnsi="Calibri" w:cs="Calibri"/>
           <w:color w:val="1C2430"/>
@@ -6002,7 +6002,7 @@
       <w:pPr>
         <w:shd w:val="clear" w:color="auto" w:fill="E9F6EE"/>
         <w:spacing w:before="120" w:after="120"/>
-        <w:divId w:val="970138156"/>
+        <w:divId w:val="875848944"/>
         <w:rPr>
           <w:rFonts w:ascii="Calibri" w:eastAsia="Times New Roman" w:hAnsi="Calibri" w:cs="Calibri"/>
           <w:color w:val="1C2430"/>
@@ -6044,7 +6044,7 @@
       <w:pPr>
         <w:shd w:val="clear" w:color="auto" w:fill="FDECEC"/>
         <w:spacing w:before="120" w:after="120"/>
-        <w:divId w:val="219295179"/>
+        <w:divId w:val="35662449"/>
         <w:rPr>
           <w:rFonts w:ascii="Calibri" w:eastAsia="Times New Roman" w:hAnsi="Calibri" w:cs="Calibri"/>
           <w:color w:val="1C2430"/>
@@ -6179,7 +6179,7 @@
       <w:pPr>
         <w:shd w:val="clear" w:color="auto" w:fill="FDECEC"/>
         <w:spacing w:before="120" w:after="120"/>
-        <w:divId w:val="1327321773"/>
+        <w:divId w:val="1384793700"/>
         <w:rPr>
           <w:rFonts w:ascii="Calibri" w:eastAsia="Times New Roman" w:hAnsi="Calibri" w:cs="Calibri"/>
           <w:color w:val="1C2430"/>
@@ -8040,7 +8040,7 @@
       <w:pPr>
         <w:shd w:val="clear" w:color="auto" w:fill="FFF8E1"/>
         <w:spacing w:before="120" w:after="120"/>
-        <w:divId w:val="378436095"/>
+        <w:divId w:val="1428647716"/>
         <w:rPr>
           <w:rFonts w:ascii="Calibri" w:eastAsia="Times New Roman" w:hAnsi="Calibri" w:cs="Calibri"/>
           <w:color w:val="1C2430"/>
@@ -8433,7 +8433,7 @@
       <w:pPr>
         <w:shd w:val="clear" w:color="auto" w:fill="E9F6EE"/>
         <w:spacing w:before="120" w:after="120"/>
-        <w:divId w:val="1107966138"/>
+        <w:divId w:val="1394432203"/>
         <w:rPr>
           <w:rFonts w:ascii="Calibri" w:eastAsia="Times New Roman" w:hAnsi="Calibri" w:cs="Calibri"/>
           <w:color w:val="1C2430"/>
@@ -10205,7 +10205,7 @@
       <w:pPr>
         <w:shd w:val="clear" w:color="auto" w:fill="FDECEC"/>
         <w:spacing w:before="120" w:after="120"/>
-        <w:divId w:val="491528596"/>
+        <w:divId w:val="447970739"/>
         <w:rPr>
           <w:rFonts w:ascii="Calibri" w:eastAsia="Times New Roman" w:hAnsi="Calibri" w:cs="Calibri"/>
           <w:color w:val="1C2430"/>
@@ -10543,7 +10543,7 @@
       <w:pPr>
         <w:shd w:val="clear" w:color="auto" w:fill="FFF8E1"/>
         <w:spacing w:before="120" w:after="120"/>
-        <w:divId w:val="1889341502"/>
+        <w:divId w:val="1065029903"/>
         <w:rPr>
           <w:rFonts w:ascii="Calibri" w:eastAsia="Times New Roman" w:hAnsi="Calibri" w:cs="Calibri"/>
           <w:color w:val="1C2430"/>
@@ -10904,9 +10904,9 @@
 <file path=word/numbering.xml><?xml version="1.0" encoding="utf-8"?>
 <w:numbering xmlns:wpc="http://schemas.microsoft.com/office/word/2010/wordprocessingCanvas" xmlns:cx="http://schemas.microsoft.com/office/drawing/2014/chartex" xmlns:cx1="http://schemas.microsoft.com/office/drawing/2015/9/8/chartex" xmlns:cx2="http://schemas.microsoft.com/office/drawing/2015/10/21/chartex" xmlns:cx3="http://schemas.microsoft.com/office/drawing/2016/5/9/chartex" xmlns:cx4="http://schemas.microsoft.com/office/drawing/2016/5/10/chartex" xmlns:cx5="http://schemas.microsoft.com/office/drawing/2016/5/11/chartex" xmlns:cx6="http://schemas.microsoft.com/office/drawing/2016/5/12/chartex" xmlns:cx7="http://schemas.microsoft.com/office/drawing/2016/5/13/chartex" xmlns:cx8="http://schemas.microsoft.com/office/drawing/2016/5/14/chartex" xmlns:mc="http://schemas.openxmlformats.org/markup-compatibility/2006" xmlns:aink="http://schemas.microsoft.com/office/drawing/2016/ink" xmlns:am3d="http://schemas.microsoft.com/office/drawing/2017/model3d" xmlns:o="urn:schemas-microsoft-com:office:office" xmlns:oel="http://schemas.microsoft.com/office/2019/extlst" xmlns:r="http://schemas.openxmlformats.org/officeDocument/2006/relationships" xmlns:m="http://schemas.openxmlformats.org/officeDocument/2006/math" xmlns:v="urn:schemas-microsoft-com:vml" xmlns:wp14="http://schemas.microsoft.com/office/word/2010/wordprocessingDrawing" xmlns:wp="http://schemas.openxmlformats.org/drawingml/2006/wordprocessingDrawing" xmlns:w10="urn:schemas-microsoft-com:office:word" xmlns:w="http://schemas.openxmlformats.org/wordprocessingml/2006/main" xmlns:w14="http://schemas.microsoft.com/office/word/2010/wordml" xmlns:w15="http://schemas.microsoft.com/office/word/2012/wordml" xmlns:w16cex="http://schemas.microsoft.com/office/word/2018/wordml/cex" xmlns:w16cid="http://schemas.microsoft.com/office/word/2016/wordml/cid" xmlns:w16="http://schemas.microsoft.com/office/word/2018/wordml" xmlns:w16du="http://schemas.microsoft.com/office/word/2023/wordml/word16du" xmlns:w16sdtdh="http://schemas.microsoft.com/office/word/2020/wordml/sdtdatahash" xmlns:w16sdtfl="http://schemas.microsoft.com/office/word/2024/wordml/sdtformatlock" xmlns:w16se="http://schemas.microsoft.com/office/word/2015/wordml/symex" xmlns:wpg="http://schemas.microsoft.com/office/word/2010/wordprocessingGroup" xmlns:wpi="http://schemas.microsoft.com/office/word/2010/wordprocessingInk" xmlns:wne="http://schemas.microsoft.com/office/word/2006/wordml" xmlns:wps="http://schemas.microsoft.com/office/word/2010/wordprocessingShape" mc:Ignorable="w14 w15 w16se w16cid w16 w16cex w16sdtdh w16sdtfl w16du wp14">
   <w:abstractNum w:abstractNumId="0" w15:restartNumberingAfterBreak="0">
-    <w:nsid w:val="01814E54"/>
+    <w:nsid w:val="0120568C"/>
     <w:multiLevelType w:val="multilevel"/>
-    <w:tmpl w:val="432A2F34"/>
+    <w:tmpl w:val="F9CE18A4"/>
     <w:lvl w:ilvl="0">
       <w:start w:val="1"/>
       <w:numFmt w:val="bullet"/>
@@ -11053,9 +11053,9 @@
     </w:lvl>
   </w:abstractNum>
   <w:abstractNum w:abstractNumId="1" w15:restartNumberingAfterBreak="0">
-    <w:nsid w:val="0D6A4419"/>
+    <w:nsid w:val="05971B22"/>
     <w:multiLevelType w:val="multilevel"/>
-    <w:tmpl w:val="61FC5DCC"/>
+    <w:tmpl w:val="2E48EE3E"/>
     <w:lvl w:ilvl="0">
       <w:start w:val="1"/>
       <w:numFmt w:val="decimal"/>
@@ -11166,9 +11166,9 @@
     </w:lvl>
   </w:abstractNum>
   <w:abstractNum w:abstractNumId="2" w15:restartNumberingAfterBreak="0">
-    <w:nsid w:val="0DD83D4B"/>
+    <w:nsid w:val="0C0C511E"/>
     <w:multiLevelType w:val="multilevel"/>
-    <w:tmpl w:val="59BE32B6"/>
+    <w:tmpl w:val="74F2F666"/>
     <w:lvl w:ilvl="0">
       <w:start w:val="1"/>
       <w:numFmt w:val="decimal"/>
@@ -11279,9 +11279,9 @@
     </w:lvl>
   </w:abstractNum>
   <w:abstractNum w:abstractNumId="3" w15:restartNumberingAfterBreak="0">
-    <w:nsid w:val="100D0498"/>
+    <w:nsid w:val="14B7760C"/>
     <w:multiLevelType w:val="multilevel"/>
-    <w:tmpl w:val="C0867BB0"/>
+    <w:tmpl w:val="0F300C92"/>
     <w:lvl w:ilvl="0">
       <w:start w:val="1"/>
       <w:numFmt w:val="decimal"/>
@@ -11392,9 +11392,122 @@
     </w:lvl>
   </w:abstractNum>
   <w:abstractNum w:abstractNumId="4" w15:restartNumberingAfterBreak="0">
-    <w:nsid w:val="10C801F4"/>
+    <w:nsid w:val="16336060"/>
     <w:multiLevelType w:val="multilevel"/>
-    <w:tmpl w:val="382A11A4"/>
+    <w:tmpl w:val="3FE45EE0"/>
+    <w:lvl w:ilvl="0">
+      <w:start w:val="1"/>
+      <w:numFmt w:val="decimal"/>
+      <w:lvlText w:val="%1."/>
+      <w:lvlJc w:val="left"/>
+      <w:pPr>
+        <w:tabs>
+          <w:tab w:val="num" w:pos="720"/>
+        </w:tabs>
+        <w:ind w:left="720" w:hanging="360"/>
+      </w:pPr>
+    </w:lvl>
+    <w:lvl w:ilvl="1" w:tentative="1">
+      <w:start w:val="1"/>
+      <w:numFmt w:val="decimal"/>
+      <w:lvlText w:val="%2."/>
+      <w:lvlJc w:val="left"/>
+      <w:pPr>
+        <w:tabs>
+          <w:tab w:val="num" w:pos="1440"/>
+        </w:tabs>
+        <w:ind w:left="1440" w:hanging="360"/>
+      </w:pPr>
+    </w:lvl>
+    <w:lvl w:ilvl="2" w:tentative="1">
+      <w:start w:val="1"/>
+      <w:numFmt w:val="decimal"/>
+      <w:lvlText w:val="%3."/>
+      <w:lvlJc w:val="left"/>
+      <w:pPr>
+        <w:tabs>
+          <w:tab w:val="num" w:pos="2160"/>
+        </w:tabs>
+        <w:ind w:left="2160" w:hanging="360"/>
+      </w:pPr>
+    </w:lvl>
+    <w:lvl w:ilvl="3" w:tentative="1">
+      <w:start w:val="1"/>
+      <w:numFmt w:val="decimal"/>
+      <w:lvlText w:val="%4."/>
+      <w:lvlJc w:val="left"/>
+      <w:pPr>
+        <w:tabs>
+          <w:tab w:val="num" w:pos="2880"/>
+        </w:tabs>
+        <w:ind w:left="2880" w:hanging="360"/>
+      </w:pPr>
+    </w:lvl>
+    <w:lvl w:ilvl="4" w:tentative="1">
+      <w:start w:val="1"/>
+      <w:numFmt w:val="decimal"/>
+      <w:lvlText w:val="%5."/>
+      <w:lvlJc w:val="left"/>
+      <w:pPr>
+        <w:tabs>
+          <w:tab w:val="num" w:pos="3600"/>
+        </w:tabs>
+        <w:ind w:left="3600" w:hanging="360"/>
+      </w:pPr>
+    </w:lvl>
+    <w:lvl w:ilvl="5" w:tentative="1">
+      <w:start w:val="1"/>
+      <w:numFmt w:val="decimal"/>
+      <w:lvlText w:val="%6."/>
+      <w:lvlJc w:val="left"/>
+      <w:pPr>
+        <w:tabs>
+          <w:tab w:val="num" w:pos="4320"/>
+        </w:tabs>
+        <w:ind w:left="4320" w:hanging="360"/>
+      </w:pPr>
+    </w:lvl>
+    <w:lvl w:ilvl="6" w:tentative="1">
+      <w:start w:val="1"/>
+      <w:numFmt w:val="decimal"/>
+      <w:lvlText w:val="%7."/>
+      <w:lvlJc w:val="left"/>
+      <w:pPr>
+        <w:tabs>
+          <w:tab w:val="num" w:pos="5040"/>
+        </w:tabs>
+        <w:ind w:left="5040" w:hanging="360"/>
+      </w:pPr>
+    </w:lvl>
+    <w:lvl w:ilvl="7" w:tentative="1">
+      <w:start w:val="1"/>
+      <w:numFmt w:val="decimal"/>
+      <w:lvlText w:val="%8."/>
+      <w:lvlJc w:val="left"/>
+      <w:pPr>
+        <w:tabs>
+          <w:tab w:val="num" w:pos="5760"/>
+        </w:tabs>
+        <w:ind w:left="5760" w:hanging="360"/>
+      </w:pPr>
+    </w:lvl>
+    <w:lvl w:ilvl="8" w:tentative="1">
+      <w:start w:val="1"/>
+      <w:numFmt w:val="decimal"/>
+      <w:lvlText w:val="%9."/>
+      <w:lvlJc w:val="left"/>
+      <w:pPr>
+        <w:tabs>
+          <w:tab w:val="num" w:pos="6480"/>
+        </w:tabs>
+        <w:ind w:left="6480" w:hanging="360"/>
+      </w:pPr>
+    </w:lvl>
+  </w:abstractNum>
+  <w:abstractNum w:abstractNumId="5" w15:restartNumberingAfterBreak="0">
+    <w:nsid w:val="18495664"/>
+    <w:multiLevelType w:val="multilevel"/>
+    <w:tmpl w:val="E5F22C5A"/>
     <w:lvl w:ilvl="0">
       <w:start w:val="1"/>
       <w:numFmt w:val="bullet"/>
@@ -11540,10 +11653,575 @@
       </w:rPr>
     </w:lvl>
   </w:abstractNum>
-  <w:abstractNum w:abstractNumId="5" w15:restartNumberingAfterBreak="0">
-    <w:nsid w:val="15BD19BA"/>
+  <w:abstractNum w:abstractNumId="6" w15:restartNumberingAfterBreak="0">
+    <w:nsid w:val="1AFE35C0"/>
     <w:multiLevelType w:val="multilevel"/>
-    <w:tmpl w:val="53DEE4A8"/>
+    <w:tmpl w:val="77F09178"/>
+    <w:lvl w:ilvl="0">
+      <w:start w:val="1"/>
+      <w:numFmt w:val="decimal"/>
+      <w:lvlText w:val="%1."/>
+      <w:lvlJc w:val="left"/>
+      <w:pPr>
+        <w:tabs>
+          <w:tab w:val="num" w:pos="720"/>
+        </w:tabs>
+        <w:ind w:left="720" w:hanging="360"/>
+      </w:pPr>
+    </w:lvl>
+    <w:lvl w:ilvl="1" w:tentative="1">
+      <w:start w:val="1"/>
+      <w:numFmt w:val="decimal"/>
+      <w:lvlText w:val="%2."/>
+      <w:lvlJc w:val="left"/>
+      <w:pPr>
+        <w:tabs>
+          <w:tab w:val="num" w:pos="1440"/>
+        </w:tabs>
+        <w:ind w:left="1440" w:hanging="360"/>
+      </w:pPr>
+    </w:lvl>
+    <w:lvl w:ilvl="2" w:tentative="1">
+      <w:start w:val="1"/>
+      <w:numFmt w:val="decimal"/>
+      <w:lvlText w:val="%3."/>
+      <w:lvlJc w:val="left"/>
+      <w:pPr>
+        <w:tabs>
+          <w:tab w:val="num" w:pos="2160"/>
+        </w:tabs>
+        <w:ind w:left="2160" w:hanging="360"/>
+      </w:pPr>
+    </w:lvl>
+    <w:lvl w:ilvl="3" w:tentative="1">
+      <w:start w:val="1"/>
+      <w:numFmt w:val="decimal"/>
+      <w:lvlText w:val="%4."/>
+      <w:lvlJc w:val="left"/>
+      <w:pPr>
+        <w:tabs>
+          <w:tab w:val="num" w:pos="2880"/>
+        </w:tabs>
+        <w:ind w:left="2880" w:hanging="360"/>
+      </w:pPr>
+    </w:lvl>
+    <w:lvl w:ilvl="4" w:tentative="1">
+      <w:start w:val="1"/>
+      <w:numFmt w:val="decimal"/>
+      <w:lvlText w:val="%5."/>
+      <w:lvlJc w:val="left"/>
+      <w:pPr>
+        <w:tabs>
+          <w:tab w:val="num" w:pos="3600"/>
+        </w:tabs>
+        <w:ind w:left="3600" w:hanging="360"/>
+      </w:pPr>
+    </w:lvl>
+    <w:lvl w:ilvl="5" w:tentative="1">
+      <w:start w:val="1"/>
+      <w:numFmt w:val="decimal"/>
+      <w:lvlText w:val="%6."/>
+      <w:lvlJc w:val="left"/>
+      <w:pPr>
+        <w:tabs>
+          <w:tab w:val="num" w:pos="4320"/>
+        </w:tabs>
+        <w:ind w:left="4320" w:hanging="360"/>
+      </w:pPr>
+    </w:lvl>
+    <w:lvl w:ilvl="6" w:tentative="1">
+      <w:start w:val="1"/>
+      <w:numFmt w:val="decimal"/>
+      <w:lvlText w:val="%7."/>
+      <w:lvlJc w:val="left"/>
+      <w:pPr>
+        <w:tabs>
+          <w:tab w:val="num" w:pos="5040"/>
+        </w:tabs>
+        <w:ind w:left="5040" w:hanging="360"/>
+      </w:pPr>
+    </w:lvl>
+    <w:lvl w:ilvl="7" w:tentative="1">
+      <w:start w:val="1"/>
+      <w:numFmt w:val="decimal"/>
+      <w:lvlText w:val="%8."/>
+      <w:lvlJc w:val="left"/>
+      <w:pPr>
+        <w:tabs>
+          <w:tab w:val="num" w:pos="5760"/>
+        </w:tabs>
+        <w:ind w:left="5760" w:hanging="360"/>
+      </w:pPr>
+    </w:lvl>
+    <w:lvl w:ilvl="8" w:tentative="1">
+      <w:start w:val="1"/>
+      <w:numFmt w:val="decimal"/>
+      <w:lvlText w:val="%9."/>
+      <w:lvlJc w:val="left"/>
+      <w:pPr>
+        <w:tabs>
+          <w:tab w:val="num" w:pos="6480"/>
+        </w:tabs>
+        <w:ind w:left="6480" w:hanging="360"/>
+      </w:pPr>
+    </w:lvl>
+  </w:abstractNum>
+  <w:abstractNum w:abstractNumId="7" w15:restartNumberingAfterBreak="0">
+    <w:nsid w:val="1EE904A3"/>
+    <w:multiLevelType w:val="multilevel"/>
+    <w:tmpl w:val="40CE723C"/>
+    <w:lvl w:ilvl="0">
+      <w:start w:val="1"/>
+      <w:numFmt w:val="decimal"/>
+      <w:lvlText w:val="%1."/>
+      <w:lvlJc w:val="left"/>
+      <w:pPr>
+        <w:tabs>
+          <w:tab w:val="num" w:pos="720"/>
+        </w:tabs>
+        <w:ind w:left="720" w:hanging="360"/>
+      </w:pPr>
+    </w:lvl>
+    <w:lvl w:ilvl="1" w:tentative="1">
+      <w:start w:val="1"/>
+      <w:numFmt w:val="decimal"/>
+      <w:lvlText w:val="%2."/>
+      <w:lvlJc w:val="left"/>
+      <w:pPr>
+        <w:tabs>
+          <w:tab w:val="num" w:pos="1440"/>
+        </w:tabs>
+        <w:ind w:left="1440" w:hanging="360"/>
+      </w:pPr>
+    </w:lvl>
+    <w:lvl w:ilvl="2" w:tentative="1">
+      <w:start w:val="1"/>
+      <w:numFmt w:val="decimal"/>
+      <w:lvlText w:val="%3."/>
+      <w:lvlJc w:val="left"/>
+      <w:pPr>
+        <w:tabs>
+          <w:tab w:val="num" w:pos="2160"/>
+        </w:tabs>
+        <w:ind w:left="2160" w:hanging="360"/>
+      </w:pPr>
+    </w:lvl>
+    <w:lvl w:ilvl="3" w:tentative="1">
+      <w:start w:val="1"/>
+      <w:numFmt w:val="decimal"/>
+      <w:lvlText w:val="%4."/>
+      <w:lvlJc w:val="left"/>
+      <w:pPr>
+        <w:tabs>
+          <w:tab w:val="num" w:pos="2880"/>
+        </w:tabs>
+        <w:ind w:left="2880" w:hanging="360"/>
+      </w:pPr>
+    </w:lvl>
+    <w:lvl w:ilvl="4" w:tentative="1">
+      <w:start w:val="1"/>
+      <w:numFmt w:val="decimal"/>
+      <w:lvlText w:val="%5."/>
+      <w:lvlJc w:val="left"/>
+      <w:pPr>
+        <w:tabs>
+          <w:tab w:val="num" w:pos="3600"/>
+        </w:tabs>
+        <w:ind w:left="3600" w:hanging="360"/>
+      </w:pPr>
+    </w:lvl>
+    <w:lvl w:ilvl="5" w:tentative="1">
+      <w:start w:val="1"/>
+      <w:numFmt w:val="decimal"/>
+      <w:lvlText w:val="%6."/>
+      <w:lvlJc w:val="left"/>
+      <w:pPr>
+        <w:tabs>
+          <w:tab w:val="num" w:pos="4320"/>
+        </w:tabs>
+        <w:ind w:left="4320" w:hanging="360"/>
+      </w:pPr>
+    </w:lvl>
+    <w:lvl w:ilvl="6" w:tentative="1">
+      <w:start w:val="1"/>
+      <w:numFmt w:val="decimal"/>
+      <w:lvlText w:val="%7."/>
+      <w:lvlJc w:val="left"/>
+      <w:pPr>
+        <w:tabs>
+          <w:tab w:val="num" w:pos="5040"/>
+        </w:tabs>
+        <w:ind w:left="5040" w:hanging="360"/>
+      </w:pPr>
+    </w:lvl>
+    <w:lvl w:ilvl="7" w:tentative="1">
+      <w:start w:val="1"/>
+      <w:numFmt w:val="decimal"/>
+      <w:lvlText w:val="%8."/>
+      <w:lvlJc w:val="left"/>
+      <w:pPr>
+        <w:tabs>
+          <w:tab w:val="num" w:pos="5760"/>
+        </w:tabs>
+        <w:ind w:left="5760" w:hanging="360"/>
+      </w:pPr>
+    </w:lvl>
+    <w:lvl w:ilvl="8" w:tentative="1">
+      <w:start w:val="1"/>
+      <w:numFmt w:val="decimal"/>
+      <w:lvlText w:val="%9."/>
+      <w:lvlJc w:val="left"/>
+      <w:pPr>
+        <w:tabs>
+          <w:tab w:val="num" w:pos="6480"/>
+        </w:tabs>
+        <w:ind w:left="6480" w:hanging="360"/>
+      </w:pPr>
+    </w:lvl>
+  </w:abstractNum>
+  <w:abstractNum w:abstractNumId="8" w15:restartNumberingAfterBreak="0">
+    <w:nsid w:val="20EE0053"/>
+    <w:multiLevelType w:val="multilevel"/>
+    <w:tmpl w:val="27F663C2"/>
+    <w:lvl w:ilvl="0">
+      <w:start w:val="1"/>
+      <w:numFmt w:val="decimal"/>
+      <w:lvlText w:val="%1."/>
+      <w:lvlJc w:val="left"/>
+      <w:pPr>
+        <w:tabs>
+          <w:tab w:val="num" w:pos="720"/>
+        </w:tabs>
+        <w:ind w:left="720" w:hanging="360"/>
+      </w:pPr>
+    </w:lvl>
+    <w:lvl w:ilvl="1" w:tentative="1">
+      <w:start w:val="1"/>
+      <w:numFmt w:val="decimal"/>
+      <w:lvlText w:val="%2."/>
+      <w:lvlJc w:val="left"/>
+      <w:pPr>
+        <w:tabs>
+          <w:tab w:val="num" w:pos="1440"/>
+        </w:tabs>
+        <w:ind w:left="1440" w:hanging="360"/>
+      </w:pPr>
+    </w:lvl>
+    <w:lvl w:ilvl="2" w:tentative="1">
+      <w:start w:val="1"/>
+      <w:numFmt w:val="decimal"/>
+      <w:lvlText w:val="%3."/>
+      <w:lvlJc w:val="left"/>
+      <w:pPr>
+        <w:tabs>
+          <w:tab w:val="num" w:pos="2160"/>
+        </w:tabs>
+        <w:ind w:left="2160" w:hanging="360"/>
+      </w:pPr>
+    </w:lvl>
+    <w:lvl w:ilvl="3" w:tentative="1">
+      <w:start w:val="1"/>
+      <w:numFmt w:val="decimal"/>
+      <w:lvlText w:val="%4."/>
+      <w:lvlJc w:val="left"/>
+      <w:pPr>
+        <w:tabs>
+          <w:tab w:val="num" w:pos="2880"/>
+        </w:tabs>
+        <w:ind w:left="2880" w:hanging="360"/>
+      </w:pPr>
+    </w:lvl>
+    <w:lvl w:ilvl="4" w:tentative="1">
+      <w:start w:val="1"/>
+      <w:numFmt w:val="decimal"/>
+      <w:lvlText w:val="%5."/>
+      <w:lvlJc w:val="left"/>
+      <w:pPr>
+        <w:tabs>
+          <w:tab w:val="num" w:pos="3600"/>
+        </w:tabs>
+        <w:ind w:left="3600" w:hanging="360"/>
+      </w:pPr>
+    </w:lvl>
+    <w:lvl w:ilvl="5" w:tentative="1">
+      <w:start w:val="1"/>
+      <w:numFmt w:val="decimal"/>
+      <w:lvlText w:val="%6."/>
+      <w:lvlJc w:val="left"/>
+      <w:pPr>
+        <w:tabs>
+          <w:tab w:val="num" w:pos="4320"/>
+        </w:tabs>
+        <w:ind w:left="4320" w:hanging="360"/>
+      </w:pPr>
+    </w:lvl>
+    <w:lvl w:ilvl="6" w:tentative="1">
+      <w:start w:val="1"/>
+      <w:numFmt w:val="decimal"/>
+      <w:lvlText w:val="%7."/>
+      <w:lvlJc w:val="left"/>
+      <w:pPr>
+        <w:tabs>
+          <w:tab w:val="num" w:pos="5040"/>
+        </w:tabs>
+        <w:ind w:left="5040" w:hanging="360"/>
+      </w:pPr>
+    </w:lvl>
+    <w:lvl w:ilvl="7" w:tentative="1">
+      <w:start w:val="1"/>
+      <w:numFmt w:val="decimal"/>
+      <w:lvlText w:val="%8."/>
+      <w:lvlJc w:val="left"/>
+      <w:pPr>
+        <w:tabs>
+          <w:tab w:val="num" w:pos="5760"/>
+        </w:tabs>
+        <w:ind w:left="5760" w:hanging="360"/>
+      </w:pPr>
+    </w:lvl>
+    <w:lvl w:ilvl="8" w:tentative="1">
+      <w:start w:val="1"/>
+      <w:numFmt w:val="decimal"/>
+      <w:lvlText w:val="%9."/>
+      <w:lvlJc w:val="left"/>
+      <w:pPr>
+        <w:tabs>
+          <w:tab w:val="num" w:pos="6480"/>
+        </w:tabs>
+        <w:ind w:left="6480" w:hanging="360"/>
+      </w:pPr>
+    </w:lvl>
+  </w:abstractNum>
+  <w:abstractNum w:abstractNumId="9" w15:restartNumberingAfterBreak="0">
+    <w:nsid w:val="2B3A1B51"/>
+    <w:multiLevelType w:val="multilevel"/>
+    <w:tmpl w:val="637E70BE"/>
+    <w:lvl w:ilvl="0">
+      <w:start w:val="1"/>
+      <w:numFmt w:val="decimal"/>
+      <w:lvlText w:val="%1."/>
+      <w:lvlJc w:val="left"/>
+      <w:pPr>
+        <w:tabs>
+          <w:tab w:val="num" w:pos="720"/>
+        </w:tabs>
+        <w:ind w:left="720" w:hanging="360"/>
+      </w:pPr>
+    </w:lvl>
+    <w:lvl w:ilvl="1" w:tentative="1">
+      <w:start w:val="1"/>
+      <w:numFmt w:val="decimal"/>
+      <w:lvlText w:val="%2."/>
+      <w:lvlJc w:val="left"/>
+      <w:pPr>
+        <w:tabs>
+          <w:tab w:val="num" w:pos="1440"/>
+        </w:tabs>
+        <w:ind w:left="1440" w:hanging="360"/>
+      </w:pPr>
+    </w:lvl>
+    <w:lvl w:ilvl="2" w:tentative="1">
+      <w:start w:val="1"/>
+      <w:numFmt w:val="decimal"/>
+      <w:lvlText w:val="%3."/>
+      <w:lvlJc w:val="left"/>
+      <w:pPr>
+        <w:tabs>
+          <w:tab w:val="num" w:pos="2160"/>
+        </w:tabs>
+        <w:ind w:left="2160" w:hanging="360"/>
+      </w:pPr>
+    </w:lvl>
+    <w:lvl w:ilvl="3" w:tentative="1">
+      <w:start w:val="1"/>
+      <w:numFmt w:val="decimal"/>
+      <w:lvlText w:val="%4."/>
+      <w:lvlJc w:val="left"/>
+      <w:pPr>
+        <w:tabs>
+          <w:tab w:val="num" w:pos="2880"/>
+        </w:tabs>
+        <w:ind w:left="2880" w:hanging="360"/>
+      </w:pPr>
+    </w:lvl>
+    <w:lvl w:ilvl="4" w:tentative="1">
+      <w:start w:val="1"/>
+      <w:numFmt w:val="decimal"/>
+      <w:lvlText w:val="%5."/>
+      <w:lvlJc w:val="left"/>
+      <w:pPr>
+        <w:tabs>
+          <w:tab w:val="num" w:pos="3600"/>
+        </w:tabs>
+        <w:ind w:left="3600" w:hanging="360"/>
+      </w:pPr>
+    </w:lvl>
+    <w:lvl w:ilvl="5" w:tentative="1">
+      <w:start w:val="1"/>
+      <w:numFmt w:val="decimal"/>
+      <w:lvlText w:val="%6."/>
+      <w:lvlJc w:val="left"/>
+      <w:pPr>
+        <w:tabs>
+          <w:tab w:val="num" w:pos="4320"/>
+        </w:tabs>
+        <w:ind w:left="4320" w:hanging="360"/>
+      </w:pPr>
+    </w:lvl>
+    <w:lvl w:ilvl="6" w:tentative="1">
+      <w:start w:val="1"/>
+      <w:numFmt w:val="decimal"/>
+      <w:lvlText w:val="%7."/>
+      <w:lvlJc w:val="left"/>
+      <w:pPr>
+        <w:tabs>
+          <w:tab w:val="num" w:pos="5040"/>
+        </w:tabs>
+        <w:ind w:left="5040" w:hanging="360"/>
+      </w:pPr>
+    </w:lvl>
+    <w:lvl w:ilvl="7" w:tentative="1">
+      <w:start w:val="1"/>
+      <w:numFmt w:val="decimal"/>
+      <w:lvlText w:val="%8."/>
+      <w:lvlJc w:val="left"/>
+      <w:pPr>
+        <w:tabs>
+          <w:tab w:val="num" w:pos="5760"/>
+        </w:tabs>
+        <w:ind w:left="5760" w:hanging="360"/>
+      </w:pPr>
+    </w:lvl>
+    <w:lvl w:ilvl="8" w:tentative="1">
+      <w:start w:val="1"/>
+      <w:numFmt w:val="decimal"/>
+      <w:lvlText w:val="%9."/>
+      <w:lvlJc w:val="left"/>
+      <w:pPr>
+        <w:tabs>
+          <w:tab w:val="num" w:pos="6480"/>
+        </w:tabs>
+        <w:ind w:left="6480" w:hanging="360"/>
+      </w:pPr>
+    </w:lvl>
+  </w:abstractNum>
+  <w:abstractNum w:abstractNumId="10" w15:restartNumberingAfterBreak="0">
+    <w:nsid w:val="30364055"/>
+    <w:multiLevelType w:val="multilevel"/>
+    <w:tmpl w:val="5BA8C23A"/>
+    <w:lvl w:ilvl="0">
+      <w:start w:val="1"/>
+      <w:numFmt w:val="decimal"/>
+      <w:lvlText w:val="%1."/>
+      <w:lvlJc w:val="left"/>
+      <w:pPr>
+        <w:tabs>
+          <w:tab w:val="num" w:pos="720"/>
+        </w:tabs>
+        <w:ind w:left="720" w:hanging="360"/>
+      </w:pPr>
+    </w:lvl>
+    <w:lvl w:ilvl="1" w:tentative="1">
+      <w:start w:val="1"/>
+      <w:numFmt w:val="decimal"/>
+      <w:lvlText w:val="%2."/>
+      <w:lvlJc w:val="left"/>
+      <w:pPr>
+        <w:tabs>
+          <w:tab w:val="num" w:pos="1440"/>
+        </w:tabs>
+        <w:ind w:left="1440" w:hanging="360"/>
+      </w:pPr>
+    </w:lvl>
+    <w:lvl w:ilvl="2" w:tentative="1">
+      <w:start w:val="1"/>
+      <w:numFmt w:val="decimal"/>
+      <w:lvlText w:val="%3."/>
+      <w:lvlJc w:val="left"/>
+      <w:pPr>
+        <w:tabs>
+          <w:tab w:val="num" w:pos="2160"/>
+        </w:tabs>
+        <w:ind w:left="2160" w:hanging="360"/>
+      </w:pPr>
+    </w:lvl>
+    <w:lvl w:ilvl="3" w:tentative="1">
+      <w:start w:val="1"/>
+      <w:numFmt w:val="decimal"/>
+      <w:lvlText w:val="%4."/>
+      <w:lvlJc w:val="left"/>
+      <w:pPr>
+        <w:tabs>
+          <w:tab w:val="num" w:pos="2880"/>
+        </w:tabs>
+        <w:ind w:left="2880" w:hanging="360"/>
+      </w:pPr>
+    </w:lvl>
+    <w:lvl w:ilvl="4" w:tentative="1">
+      <w:start w:val="1"/>
+      <w:numFmt w:val="decimal"/>
+      <w:lvlText w:val="%5."/>
+      <w:lvlJc w:val="left"/>
+      <w:pPr>
+        <w:tabs>
+          <w:tab w:val="num" w:pos="3600"/>
+        </w:tabs>
+        <w:ind w:left="3600" w:hanging="360"/>
+      </w:pPr>
+    </w:lvl>
+    <w:lvl w:ilvl="5" w:tentative="1">
+      <w:start w:val="1"/>
+      <w:numFmt w:val="decimal"/>
+      <w:lvlText w:val="%6."/>
+      <w:lvlJc w:val="left"/>
+      <w:pPr>
+        <w:tabs>
+          <w:tab w:val="num" w:pos="4320"/>
+        </w:tabs>
+        <w:ind w:left="4320" w:hanging="360"/>
+      </w:pPr>
+    </w:lvl>
+    <w:lvl w:ilvl="6" w:tentative="1">
+      <w:start w:val="1"/>
+      <w:numFmt w:val="decimal"/>
+      <w:lvlText w:val="%7."/>
+      <w:lvlJc w:val="left"/>
+      <w:pPr>
+        <w:tabs>
+          <w:tab w:val="num" w:pos="5040"/>
+        </w:tabs>
+        <w:ind w:left="5040" w:hanging="360"/>
+      </w:pPr>
+    </w:lvl>
+    <w:lvl w:ilvl="7" w:tentative="1">
+      <w:start w:val="1"/>
+      <w:numFmt w:val="decimal"/>
+      <w:lvlText w:val="%8."/>
+      <w:lvlJc w:val="left"/>
+      <w:pPr>
+        <w:tabs>
+          <w:tab w:val="num" w:pos="5760"/>
+        </w:tabs>
+        <w:ind w:left="5760" w:hanging="360"/>
+      </w:pPr>
+    </w:lvl>
+    <w:lvl w:ilvl="8" w:tentative="1">
+      <w:start w:val="1"/>
+      <w:numFmt w:val="decimal"/>
+      <w:lvlText w:val="%9."/>
+      <w:lvlJc w:val="left"/>
+      <w:pPr>
+        <w:tabs>
+          <w:tab w:val="num" w:pos="6480"/>
+        </w:tabs>
+        <w:ind w:left="6480" w:hanging="360"/>
+      </w:pPr>
+    </w:lvl>
+  </w:abstractNum>
+  <w:abstractNum w:abstractNumId="11" w15:restartNumberingAfterBreak="0">
+    <w:nsid w:val="33BE3DEB"/>
+    <w:multiLevelType w:val="multilevel"/>
+    <w:tmpl w:val="457E7C84"/>
     <w:lvl w:ilvl="0">
       <w:start w:val="1"/>
       <w:numFmt w:val="bullet"/>
@@ -11689,575 +12367,10 @@
       </w:rPr>
     </w:lvl>
   </w:abstractNum>
-  <w:abstractNum w:abstractNumId="6" w15:restartNumberingAfterBreak="0">
-    <w:nsid w:val="162A056E"/>
+  <w:abstractNum w:abstractNumId="12" w15:restartNumberingAfterBreak="0">
+    <w:nsid w:val="36C1566F"/>
     <w:multiLevelType w:val="multilevel"/>
-    <w:tmpl w:val="114E645E"/>
-    <w:lvl w:ilvl="0">
-      <w:start w:val="1"/>
-      <w:numFmt w:val="decimal"/>
-      <w:lvlText w:val="%1."/>
-      <w:lvlJc w:val="left"/>
-      <w:pPr>
-        <w:tabs>
-          <w:tab w:val="num" w:pos="720"/>
-        </w:tabs>
-        <w:ind w:left="720" w:hanging="360"/>
-      </w:pPr>
-    </w:lvl>
-    <w:lvl w:ilvl="1" w:tentative="1">
-      <w:start w:val="1"/>
-      <w:numFmt w:val="decimal"/>
-      <w:lvlText w:val="%2."/>
-      <w:lvlJc w:val="left"/>
-      <w:pPr>
-        <w:tabs>
-          <w:tab w:val="num" w:pos="1440"/>
-        </w:tabs>
-        <w:ind w:left="1440" w:hanging="360"/>
-      </w:pPr>
-    </w:lvl>
-    <w:lvl w:ilvl="2" w:tentative="1">
-      <w:start w:val="1"/>
-      <w:numFmt w:val="decimal"/>
-      <w:lvlText w:val="%3."/>
-      <w:lvlJc w:val="left"/>
-      <w:pPr>
-        <w:tabs>
-          <w:tab w:val="num" w:pos="2160"/>
-        </w:tabs>
-        <w:ind w:left="2160" w:hanging="360"/>
-      </w:pPr>
-    </w:lvl>
-    <w:lvl w:ilvl="3" w:tentative="1">
-      <w:start w:val="1"/>
-      <w:numFmt w:val="decimal"/>
-      <w:lvlText w:val="%4."/>
-      <w:lvlJc w:val="left"/>
-      <w:pPr>
-        <w:tabs>
-          <w:tab w:val="num" w:pos="2880"/>
-        </w:tabs>
-        <w:ind w:left="2880" w:hanging="360"/>
-      </w:pPr>
-    </w:lvl>
-    <w:lvl w:ilvl="4" w:tentative="1">
-      <w:start w:val="1"/>
-      <w:numFmt w:val="decimal"/>
-      <w:lvlText w:val="%5."/>
-      <w:lvlJc w:val="left"/>
-      <w:pPr>
-        <w:tabs>
-          <w:tab w:val="num" w:pos="3600"/>
-        </w:tabs>
-        <w:ind w:left="3600" w:hanging="360"/>
-      </w:pPr>
-    </w:lvl>
-    <w:lvl w:ilvl="5" w:tentative="1">
-      <w:start w:val="1"/>
-      <w:numFmt w:val="decimal"/>
-      <w:lvlText w:val="%6."/>
-      <w:lvlJc w:val="left"/>
-      <w:pPr>
-        <w:tabs>
-          <w:tab w:val="num" w:pos="4320"/>
-        </w:tabs>
-        <w:ind w:left="4320" w:hanging="360"/>
-      </w:pPr>
-    </w:lvl>
-    <w:lvl w:ilvl="6" w:tentative="1">
-      <w:start w:val="1"/>
-      <w:numFmt w:val="decimal"/>
-      <w:lvlText w:val="%7."/>
-      <w:lvlJc w:val="left"/>
-      <w:pPr>
-        <w:tabs>
-          <w:tab w:val="num" w:pos="5040"/>
-        </w:tabs>
-        <w:ind w:left="5040" w:hanging="360"/>
-      </w:pPr>
-    </w:lvl>
-    <w:lvl w:ilvl="7" w:tentative="1">
-      <w:start w:val="1"/>
-      <w:numFmt w:val="decimal"/>
-      <w:lvlText w:val="%8."/>
-      <w:lvlJc w:val="left"/>
-      <w:pPr>
-        <w:tabs>
-          <w:tab w:val="num" w:pos="5760"/>
-        </w:tabs>
-        <w:ind w:left="5760" w:hanging="360"/>
-      </w:pPr>
-    </w:lvl>
-    <w:lvl w:ilvl="8" w:tentative="1">
-      <w:start w:val="1"/>
-      <w:numFmt w:val="decimal"/>
-      <w:lvlText w:val="%9."/>
-      <w:lvlJc w:val="left"/>
-      <w:pPr>
-        <w:tabs>
-          <w:tab w:val="num" w:pos="6480"/>
-        </w:tabs>
-        <w:ind w:left="6480" w:hanging="360"/>
-      </w:pPr>
-    </w:lvl>
-  </w:abstractNum>
-  <w:abstractNum w:abstractNumId="7" w15:restartNumberingAfterBreak="0">
-    <w:nsid w:val="17CD488B"/>
-    <w:multiLevelType w:val="multilevel"/>
-    <w:tmpl w:val="6F6CECF4"/>
-    <w:lvl w:ilvl="0">
-      <w:start w:val="1"/>
-      <w:numFmt w:val="decimal"/>
-      <w:lvlText w:val="%1."/>
-      <w:lvlJc w:val="left"/>
-      <w:pPr>
-        <w:tabs>
-          <w:tab w:val="num" w:pos="720"/>
-        </w:tabs>
-        <w:ind w:left="720" w:hanging="360"/>
-      </w:pPr>
-    </w:lvl>
-    <w:lvl w:ilvl="1" w:tentative="1">
-      <w:start w:val="1"/>
-      <w:numFmt w:val="decimal"/>
-      <w:lvlText w:val="%2."/>
-      <w:lvlJc w:val="left"/>
-      <w:pPr>
-        <w:tabs>
-          <w:tab w:val="num" w:pos="1440"/>
-        </w:tabs>
-        <w:ind w:left="1440" w:hanging="360"/>
-      </w:pPr>
-    </w:lvl>
-    <w:lvl w:ilvl="2" w:tentative="1">
-      <w:start w:val="1"/>
-      <w:numFmt w:val="decimal"/>
-      <w:lvlText w:val="%3."/>
-      <w:lvlJc w:val="left"/>
-      <w:pPr>
-        <w:tabs>
-          <w:tab w:val="num" w:pos="2160"/>
-        </w:tabs>
-        <w:ind w:left="2160" w:hanging="360"/>
-      </w:pPr>
-    </w:lvl>
-    <w:lvl w:ilvl="3" w:tentative="1">
-      <w:start w:val="1"/>
-      <w:numFmt w:val="decimal"/>
-      <w:lvlText w:val="%4."/>
-      <w:lvlJc w:val="left"/>
-      <w:pPr>
-        <w:tabs>
-          <w:tab w:val="num" w:pos="2880"/>
-        </w:tabs>
-        <w:ind w:left="2880" w:hanging="360"/>
-      </w:pPr>
-    </w:lvl>
-    <w:lvl w:ilvl="4" w:tentative="1">
-      <w:start w:val="1"/>
-      <w:numFmt w:val="decimal"/>
-      <w:lvlText w:val="%5."/>
-      <w:lvlJc w:val="left"/>
-      <w:pPr>
-        <w:tabs>
-          <w:tab w:val="num" w:pos="3600"/>
-        </w:tabs>
-        <w:ind w:left="3600" w:hanging="360"/>
-      </w:pPr>
-    </w:lvl>
-    <w:lvl w:ilvl="5" w:tentative="1">
-      <w:start w:val="1"/>
-      <w:numFmt w:val="decimal"/>
-      <w:lvlText w:val="%6."/>
-      <w:lvlJc w:val="left"/>
-      <w:pPr>
-        <w:tabs>
-          <w:tab w:val="num" w:pos="4320"/>
-        </w:tabs>
-        <w:ind w:left="4320" w:hanging="360"/>
-      </w:pPr>
-    </w:lvl>
-    <w:lvl w:ilvl="6" w:tentative="1">
-      <w:start w:val="1"/>
-      <w:numFmt w:val="decimal"/>
-      <w:lvlText w:val="%7."/>
-      <w:lvlJc w:val="left"/>
-      <w:pPr>
-        <w:tabs>
-          <w:tab w:val="num" w:pos="5040"/>
-        </w:tabs>
-        <w:ind w:left="5040" w:hanging="360"/>
-      </w:pPr>
-    </w:lvl>
-    <w:lvl w:ilvl="7" w:tentative="1">
-      <w:start w:val="1"/>
-      <w:numFmt w:val="decimal"/>
-      <w:lvlText w:val="%8."/>
-      <w:lvlJc w:val="left"/>
-      <w:pPr>
-        <w:tabs>
-          <w:tab w:val="num" w:pos="5760"/>
-        </w:tabs>
-        <w:ind w:left="5760" w:hanging="360"/>
-      </w:pPr>
-    </w:lvl>
-    <w:lvl w:ilvl="8" w:tentative="1">
-      <w:start w:val="1"/>
-      <w:numFmt w:val="decimal"/>
-      <w:lvlText w:val="%9."/>
-      <w:lvlJc w:val="left"/>
-      <w:pPr>
-        <w:tabs>
-          <w:tab w:val="num" w:pos="6480"/>
-        </w:tabs>
-        <w:ind w:left="6480" w:hanging="360"/>
-      </w:pPr>
-    </w:lvl>
-  </w:abstractNum>
-  <w:abstractNum w:abstractNumId="8" w15:restartNumberingAfterBreak="0">
-    <w:nsid w:val="1A8C267C"/>
-    <w:multiLevelType w:val="multilevel"/>
-    <w:tmpl w:val="56300A42"/>
-    <w:lvl w:ilvl="0">
-      <w:start w:val="1"/>
-      <w:numFmt w:val="decimal"/>
-      <w:lvlText w:val="%1."/>
-      <w:lvlJc w:val="left"/>
-      <w:pPr>
-        <w:tabs>
-          <w:tab w:val="num" w:pos="720"/>
-        </w:tabs>
-        <w:ind w:left="720" w:hanging="360"/>
-      </w:pPr>
-    </w:lvl>
-    <w:lvl w:ilvl="1" w:tentative="1">
-      <w:start w:val="1"/>
-      <w:numFmt w:val="decimal"/>
-      <w:lvlText w:val="%2."/>
-      <w:lvlJc w:val="left"/>
-      <w:pPr>
-        <w:tabs>
-          <w:tab w:val="num" w:pos="1440"/>
-        </w:tabs>
-        <w:ind w:left="1440" w:hanging="360"/>
-      </w:pPr>
-    </w:lvl>
-    <w:lvl w:ilvl="2" w:tentative="1">
-      <w:start w:val="1"/>
-      <w:numFmt w:val="decimal"/>
-      <w:lvlText w:val="%3."/>
-      <w:lvlJc w:val="left"/>
-      <w:pPr>
-        <w:tabs>
-          <w:tab w:val="num" w:pos="2160"/>
-        </w:tabs>
-        <w:ind w:left="2160" w:hanging="360"/>
-      </w:pPr>
-    </w:lvl>
-    <w:lvl w:ilvl="3" w:tentative="1">
-      <w:start w:val="1"/>
-      <w:numFmt w:val="decimal"/>
-      <w:lvlText w:val="%4."/>
-      <w:lvlJc w:val="left"/>
-      <w:pPr>
-        <w:tabs>
-          <w:tab w:val="num" w:pos="2880"/>
-        </w:tabs>
-        <w:ind w:left="2880" w:hanging="360"/>
-      </w:pPr>
-    </w:lvl>
-    <w:lvl w:ilvl="4" w:tentative="1">
-      <w:start w:val="1"/>
-      <w:numFmt w:val="decimal"/>
-      <w:lvlText w:val="%5."/>
-      <w:lvlJc w:val="left"/>
-      <w:pPr>
-        <w:tabs>
-          <w:tab w:val="num" w:pos="3600"/>
-        </w:tabs>
-        <w:ind w:left="3600" w:hanging="360"/>
-      </w:pPr>
-    </w:lvl>
-    <w:lvl w:ilvl="5" w:tentative="1">
-      <w:start w:val="1"/>
-      <w:numFmt w:val="decimal"/>
-      <w:lvlText w:val="%6."/>
-      <w:lvlJc w:val="left"/>
-      <w:pPr>
-        <w:tabs>
-          <w:tab w:val="num" w:pos="4320"/>
-        </w:tabs>
-        <w:ind w:left="4320" w:hanging="360"/>
-      </w:pPr>
-    </w:lvl>
-    <w:lvl w:ilvl="6" w:tentative="1">
-      <w:start w:val="1"/>
-      <w:numFmt w:val="decimal"/>
-      <w:lvlText w:val="%7."/>
-      <w:lvlJc w:val="left"/>
-      <w:pPr>
-        <w:tabs>
-          <w:tab w:val="num" w:pos="5040"/>
-        </w:tabs>
-        <w:ind w:left="5040" w:hanging="360"/>
-      </w:pPr>
-    </w:lvl>
-    <w:lvl w:ilvl="7" w:tentative="1">
-      <w:start w:val="1"/>
-      <w:numFmt w:val="decimal"/>
-      <w:lvlText w:val="%8."/>
-      <w:lvlJc w:val="left"/>
-      <w:pPr>
-        <w:tabs>
-          <w:tab w:val="num" w:pos="5760"/>
-        </w:tabs>
-        <w:ind w:left="5760" w:hanging="360"/>
-      </w:pPr>
-    </w:lvl>
-    <w:lvl w:ilvl="8" w:tentative="1">
-      <w:start w:val="1"/>
-      <w:numFmt w:val="decimal"/>
-      <w:lvlText w:val="%9."/>
-      <w:lvlJc w:val="left"/>
-      <w:pPr>
-        <w:tabs>
-          <w:tab w:val="num" w:pos="6480"/>
-        </w:tabs>
-        <w:ind w:left="6480" w:hanging="360"/>
-      </w:pPr>
-    </w:lvl>
-  </w:abstractNum>
-  <w:abstractNum w:abstractNumId="9" w15:restartNumberingAfterBreak="0">
-    <w:nsid w:val="1AAB490D"/>
-    <w:multiLevelType w:val="multilevel"/>
-    <w:tmpl w:val="7696DA40"/>
-    <w:lvl w:ilvl="0">
-      <w:start w:val="1"/>
-      <w:numFmt w:val="decimal"/>
-      <w:lvlText w:val="%1."/>
-      <w:lvlJc w:val="left"/>
-      <w:pPr>
-        <w:tabs>
-          <w:tab w:val="num" w:pos="720"/>
-        </w:tabs>
-        <w:ind w:left="720" w:hanging="360"/>
-      </w:pPr>
-    </w:lvl>
-    <w:lvl w:ilvl="1" w:tentative="1">
-      <w:start w:val="1"/>
-      <w:numFmt w:val="decimal"/>
-      <w:lvlText w:val="%2."/>
-      <w:lvlJc w:val="left"/>
-      <w:pPr>
-        <w:tabs>
-          <w:tab w:val="num" w:pos="1440"/>
-        </w:tabs>
-        <w:ind w:left="1440" w:hanging="360"/>
-      </w:pPr>
-    </w:lvl>
-    <w:lvl w:ilvl="2" w:tentative="1">
-      <w:start w:val="1"/>
-      <w:numFmt w:val="decimal"/>
-      <w:lvlText w:val="%3."/>
-      <w:lvlJc w:val="left"/>
-      <w:pPr>
-        <w:tabs>
-          <w:tab w:val="num" w:pos="2160"/>
-        </w:tabs>
-        <w:ind w:left="2160" w:hanging="360"/>
-      </w:pPr>
-    </w:lvl>
-    <w:lvl w:ilvl="3" w:tentative="1">
-      <w:start w:val="1"/>
-      <w:numFmt w:val="decimal"/>
-      <w:lvlText w:val="%4."/>
-      <w:lvlJc w:val="left"/>
-      <w:pPr>
-        <w:tabs>
-          <w:tab w:val="num" w:pos="2880"/>
-        </w:tabs>
-        <w:ind w:left="2880" w:hanging="360"/>
-      </w:pPr>
-    </w:lvl>
-    <w:lvl w:ilvl="4" w:tentative="1">
-      <w:start w:val="1"/>
-      <w:numFmt w:val="decimal"/>
-      <w:lvlText w:val="%5."/>
-      <w:lvlJc w:val="left"/>
-      <w:pPr>
-        <w:tabs>
-          <w:tab w:val="num" w:pos="3600"/>
-        </w:tabs>
-        <w:ind w:left="3600" w:hanging="360"/>
-      </w:pPr>
-    </w:lvl>
-    <w:lvl w:ilvl="5" w:tentative="1">
-      <w:start w:val="1"/>
-      <w:numFmt w:val="decimal"/>
-      <w:lvlText w:val="%6."/>
-      <w:lvlJc w:val="left"/>
-      <w:pPr>
-        <w:tabs>
-          <w:tab w:val="num" w:pos="4320"/>
-        </w:tabs>
-        <w:ind w:left="4320" w:hanging="360"/>
-      </w:pPr>
-    </w:lvl>
-    <w:lvl w:ilvl="6" w:tentative="1">
-      <w:start w:val="1"/>
-      <w:numFmt w:val="decimal"/>
-      <w:lvlText w:val="%7."/>
-      <w:lvlJc w:val="left"/>
-      <w:pPr>
-        <w:tabs>
-          <w:tab w:val="num" w:pos="5040"/>
-        </w:tabs>
-        <w:ind w:left="5040" w:hanging="360"/>
-      </w:pPr>
-    </w:lvl>
-    <w:lvl w:ilvl="7" w:tentative="1">
-      <w:start w:val="1"/>
-      <w:numFmt w:val="decimal"/>
-      <w:lvlText w:val="%8."/>
-      <w:lvlJc w:val="left"/>
-      <w:pPr>
-        <w:tabs>
-          <w:tab w:val="num" w:pos="5760"/>
-        </w:tabs>
-        <w:ind w:left="5760" w:hanging="360"/>
-      </w:pPr>
-    </w:lvl>
-    <w:lvl w:ilvl="8" w:tentative="1">
-      <w:start w:val="1"/>
-      <w:numFmt w:val="decimal"/>
-      <w:lvlText w:val="%9."/>
-      <w:lvlJc w:val="left"/>
-      <w:pPr>
-        <w:tabs>
-          <w:tab w:val="num" w:pos="6480"/>
-        </w:tabs>
-        <w:ind w:left="6480" w:hanging="360"/>
-      </w:pPr>
-    </w:lvl>
-  </w:abstractNum>
-  <w:abstractNum w:abstractNumId="10" w15:restartNumberingAfterBreak="0">
-    <w:nsid w:val="1B84433F"/>
-    <w:multiLevelType w:val="multilevel"/>
-    <w:tmpl w:val="226871AC"/>
-    <w:lvl w:ilvl="0">
-      <w:start w:val="1"/>
-      <w:numFmt w:val="decimal"/>
-      <w:lvlText w:val="%1."/>
-      <w:lvlJc w:val="left"/>
-      <w:pPr>
-        <w:tabs>
-          <w:tab w:val="num" w:pos="720"/>
-        </w:tabs>
-        <w:ind w:left="720" w:hanging="360"/>
-      </w:pPr>
-    </w:lvl>
-    <w:lvl w:ilvl="1" w:tentative="1">
-      <w:start w:val="1"/>
-      <w:numFmt w:val="decimal"/>
-      <w:lvlText w:val="%2."/>
-      <w:lvlJc w:val="left"/>
-      <w:pPr>
-        <w:tabs>
-          <w:tab w:val="num" w:pos="1440"/>
-        </w:tabs>
-        <w:ind w:left="1440" w:hanging="360"/>
-      </w:pPr>
-    </w:lvl>
-    <w:lvl w:ilvl="2" w:tentative="1">
-      <w:start w:val="1"/>
-      <w:numFmt w:val="decimal"/>
-      <w:lvlText w:val="%3."/>
-      <w:lvlJc w:val="left"/>
-      <w:pPr>
-        <w:tabs>
-          <w:tab w:val="num" w:pos="2160"/>
-        </w:tabs>
-        <w:ind w:left="2160" w:hanging="360"/>
-      </w:pPr>
-    </w:lvl>
-    <w:lvl w:ilvl="3" w:tentative="1">
-      <w:start w:val="1"/>
-      <w:numFmt w:val="decimal"/>
-      <w:lvlText w:val="%4."/>
-      <w:lvlJc w:val="left"/>
-      <w:pPr>
-        <w:tabs>
-          <w:tab w:val="num" w:pos="2880"/>
-        </w:tabs>
-        <w:ind w:left="2880" w:hanging="360"/>
-      </w:pPr>
-    </w:lvl>
-    <w:lvl w:ilvl="4" w:tentative="1">
-      <w:start w:val="1"/>
-      <w:numFmt w:val="decimal"/>
-      <w:lvlText w:val="%5."/>
-      <w:lvlJc w:val="left"/>
-      <w:pPr>
-        <w:tabs>
-          <w:tab w:val="num" w:pos="3600"/>
-        </w:tabs>
-        <w:ind w:left="3600" w:hanging="360"/>
-      </w:pPr>
-    </w:lvl>
-    <w:lvl w:ilvl="5" w:tentative="1">
-      <w:start w:val="1"/>
-      <w:numFmt w:val="decimal"/>
-      <w:lvlText w:val="%6."/>
-      <w:lvlJc w:val="left"/>
-      <w:pPr>
-        <w:tabs>
-          <w:tab w:val="num" w:pos="4320"/>
-        </w:tabs>
-        <w:ind w:left="4320" w:hanging="360"/>
-      </w:pPr>
-    </w:lvl>
-    <w:lvl w:ilvl="6" w:tentative="1">
-      <w:start w:val="1"/>
-      <w:numFmt w:val="decimal"/>
-      <w:lvlText w:val="%7."/>
-      <w:lvlJc w:val="left"/>
-      <w:pPr>
-        <w:tabs>
-          <w:tab w:val="num" w:pos="5040"/>
-        </w:tabs>
-        <w:ind w:left="5040" w:hanging="360"/>
-      </w:pPr>
-    </w:lvl>
-    <w:lvl w:ilvl="7" w:tentative="1">
-      <w:start w:val="1"/>
-      <w:numFmt w:val="decimal"/>
-      <w:lvlText w:val="%8."/>
-      <w:lvlJc w:val="left"/>
-      <w:pPr>
-        <w:tabs>
-          <w:tab w:val="num" w:pos="5760"/>
-        </w:tabs>
-        <w:ind w:left="5760" w:hanging="360"/>
-      </w:pPr>
-    </w:lvl>
-    <w:lvl w:ilvl="8" w:tentative="1">
-      <w:start w:val="1"/>
-      <w:numFmt w:val="decimal"/>
-      <w:lvlText w:val="%9."/>
-      <w:lvlJc w:val="left"/>
-      <w:pPr>
-        <w:tabs>
-          <w:tab w:val="num" w:pos="6480"/>
-        </w:tabs>
-        <w:ind w:left="6480" w:hanging="360"/>
-      </w:pPr>
-    </w:lvl>
-  </w:abstractNum>
-  <w:abstractNum w:abstractNumId="11" w15:restartNumberingAfterBreak="0">
-    <w:nsid w:val="1ECF32C9"/>
-    <w:multiLevelType w:val="multilevel"/>
-    <w:tmpl w:val="EF624B08"/>
+    <w:tmpl w:val="346C829A"/>
     <w:lvl w:ilvl="0">
       <w:start w:val="1"/>
       <w:numFmt w:val="bullet"/>
@@ -12403,688 +12516,10 @@
       </w:rPr>
     </w:lvl>
   </w:abstractNum>
-  <w:abstractNum w:abstractNumId="12" w15:restartNumberingAfterBreak="0">
-    <w:nsid w:val="26640B40"/>
+  <w:abstractNum w:abstractNumId="13" w15:restartNumberingAfterBreak="0">
+    <w:nsid w:val="38A00761"/>
     <w:multiLevelType w:val="multilevel"/>
-    <w:tmpl w:val="75A4B6D6"/>
-    <w:lvl w:ilvl="0">
-      <w:start w:val="1"/>
-      <w:numFmt w:val="decimal"/>
-      <w:lvlText w:val="%1."/>
-      <w:lvlJc w:val="left"/>
-      <w:pPr>
-        <w:tabs>
-          <w:tab w:val="num" w:pos="720"/>
-        </w:tabs>
-        <w:ind w:left="720" w:hanging="360"/>
-      </w:pPr>
-    </w:lvl>
-    <w:lvl w:ilvl="1" w:tentative="1">
-      <w:start w:val="1"/>
-      <w:numFmt w:val="decimal"/>
-      <w:lvlText w:val="%2."/>
-      <w:lvlJc w:val="left"/>
-      <w:pPr>
-        <w:tabs>
-          <w:tab w:val="num" w:pos="1440"/>
-        </w:tabs>
-        <w:ind w:left="1440" w:hanging="360"/>
-      </w:pPr>
-    </w:lvl>
-    <w:lvl w:ilvl="2" w:tentative="1">
-      <w:start w:val="1"/>
-      <w:numFmt w:val="decimal"/>
-      <w:lvlText w:val="%3."/>
-      <w:lvlJc w:val="left"/>
-      <w:pPr>
-        <w:tabs>
-          <w:tab w:val="num" w:pos="2160"/>
-        </w:tabs>
-        <w:ind w:left="2160" w:hanging="360"/>
-      </w:pPr>
-    </w:lvl>
-    <w:lvl w:ilvl="3" w:tentative="1">
-      <w:start w:val="1"/>
-      <w:numFmt w:val="decimal"/>
-      <w:lvlText w:val="%4."/>
-      <w:lvlJc w:val="left"/>
-      <w:pPr>
-        <w:tabs>
-          <w:tab w:val="num" w:pos="2880"/>
-        </w:tabs>
-        <w:ind w:left="2880" w:hanging="360"/>
-      </w:pPr>
-    </w:lvl>
-    <w:lvl w:ilvl="4" w:tentative="1">
-      <w:start w:val="1"/>
-      <w:numFmt w:val="decimal"/>
-      <w:lvlText w:val="%5."/>
-      <w:lvlJc w:val="left"/>
-      <w:pPr>
-        <w:tabs>
-          <w:tab w:val="num" w:pos="3600"/>
-        </w:tabs>
-        <w:ind w:left="3600" w:hanging="360"/>
-      </w:pPr>
-    </w:lvl>
-    <w:lvl w:ilvl="5" w:tentative="1">
-      <w:start w:val="1"/>
-      <w:numFmt w:val="decimal"/>
-      <w:lvlText w:val="%6."/>
-      <w:lvlJc w:val="left"/>
-      <w:pPr>
-        <w:tabs>
-          <w:tab w:val="num" w:pos="4320"/>
-        </w:tabs>
-        <w:ind w:left="4320" w:hanging="360"/>
-      </w:pPr>
-    </w:lvl>
-    <w:lvl w:ilvl="6" w:tentative="1">
-      <w:start w:val="1"/>
-      <w:numFmt w:val="decimal"/>
-      <w:lvlText w:val="%7."/>
-      <w:lvlJc w:val="left"/>
-      <w:pPr>
-        <w:tabs>
-          <w:tab w:val="num" w:pos="5040"/>
-        </w:tabs>
-        <w:ind w:left="5040" w:hanging="360"/>
-      </w:pPr>
-    </w:lvl>
-    <w:lvl w:ilvl="7" w:tentative="1">
-      <w:start w:val="1"/>
-      <w:numFmt w:val="decimal"/>
-      <w:lvlText w:val="%8."/>
-      <w:lvlJc w:val="left"/>
-      <w:pPr>
-        <w:tabs>
-          <w:tab w:val="num" w:pos="5760"/>
-        </w:tabs>
-        <w:ind w:left="5760" w:hanging="360"/>
-      </w:pPr>
-    </w:lvl>
-    <w:lvl w:ilvl="8" w:tentative="1">
-      <w:start w:val="1"/>
-      <w:numFmt w:val="decimal"/>
-      <w:lvlText w:val="%9."/>
-      <w:lvlJc w:val="left"/>
-      <w:pPr>
-        <w:tabs>
-          <w:tab w:val="num" w:pos="6480"/>
-        </w:tabs>
-        <w:ind w:left="6480" w:hanging="360"/>
-      </w:pPr>
-    </w:lvl>
-  </w:abstractNum>
-  <w:abstractNum w:abstractNumId="13" w15:restartNumberingAfterBreak="0">
-    <w:nsid w:val="269B5279"/>
-    <w:multiLevelType w:val="multilevel"/>
-    <w:tmpl w:val="51A0D5CA"/>
-    <w:lvl w:ilvl="0">
-      <w:start w:val="1"/>
-      <w:numFmt w:val="decimal"/>
-      <w:lvlText w:val="%1."/>
-      <w:lvlJc w:val="left"/>
-      <w:pPr>
-        <w:tabs>
-          <w:tab w:val="num" w:pos="720"/>
-        </w:tabs>
-        <w:ind w:left="720" w:hanging="360"/>
-      </w:pPr>
-    </w:lvl>
-    <w:lvl w:ilvl="1" w:tentative="1">
-      <w:start w:val="1"/>
-      <w:numFmt w:val="decimal"/>
-      <w:lvlText w:val="%2."/>
-      <w:lvlJc w:val="left"/>
-      <w:pPr>
-        <w:tabs>
-          <w:tab w:val="num" w:pos="1440"/>
-        </w:tabs>
-        <w:ind w:left="1440" w:hanging="360"/>
-      </w:pPr>
-    </w:lvl>
-    <w:lvl w:ilvl="2" w:tentative="1">
-      <w:start w:val="1"/>
-      <w:numFmt w:val="decimal"/>
-      <w:lvlText w:val="%3."/>
-      <w:lvlJc w:val="left"/>
-      <w:pPr>
-        <w:tabs>
-          <w:tab w:val="num" w:pos="2160"/>
-        </w:tabs>
-        <w:ind w:left="2160" w:hanging="360"/>
-      </w:pPr>
-    </w:lvl>
-    <w:lvl w:ilvl="3" w:tentative="1">
-      <w:start w:val="1"/>
-      <w:numFmt w:val="decimal"/>
-      <w:lvlText w:val="%4."/>
-      <w:lvlJc w:val="left"/>
-      <w:pPr>
-        <w:tabs>
-          <w:tab w:val="num" w:pos="2880"/>
-        </w:tabs>
-        <w:ind w:left="2880" w:hanging="360"/>
-      </w:pPr>
-    </w:lvl>
-    <w:lvl w:ilvl="4" w:tentative="1">
-      <w:start w:val="1"/>
-      <w:numFmt w:val="decimal"/>
-      <w:lvlText w:val="%5."/>
-      <w:lvlJc w:val="left"/>
-      <w:pPr>
-        <w:tabs>
-          <w:tab w:val="num" w:pos="3600"/>
-        </w:tabs>
-        <w:ind w:left="3600" w:hanging="360"/>
-      </w:pPr>
-    </w:lvl>
-    <w:lvl w:ilvl="5" w:tentative="1">
-      <w:start w:val="1"/>
-      <w:numFmt w:val="decimal"/>
-      <w:lvlText w:val="%6."/>
-      <w:lvlJc w:val="left"/>
-      <w:pPr>
-        <w:tabs>
-          <w:tab w:val="num" w:pos="4320"/>
-        </w:tabs>
-        <w:ind w:left="4320" w:hanging="360"/>
-      </w:pPr>
-    </w:lvl>
-    <w:lvl w:ilvl="6" w:tentative="1">
-      <w:start w:val="1"/>
-      <w:numFmt w:val="decimal"/>
-      <w:lvlText w:val="%7."/>
-      <w:lvlJc w:val="left"/>
-      <w:pPr>
-        <w:tabs>
-          <w:tab w:val="num" w:pos="5040"/>
-        </w:tabs>
-        <w:ind w:left="5040" w:hanging="360"/>
-      </w:pPr>
-    </w:lvl>
-    <w:lvl w:ilvl="7" w:tentative="1">
-      <w:start w:val="1"/>
-      <w:numFmt w:val="decimal"/>
-      <w:lvlText w:val="%8."/>
-      <w:lvlJc w:val="left"/>
-      <w:pPr>
-        <w:tabs>
-          <w:tab w:val="num" w:pos="5760"/>
-        </w:tabs>
-        <w:ind w:left="5760" w:hanging="360"/>
-      </w:pPr>
-    </w:lvl>
-    <w:lvl w:ilvl="8" w:tentative="1">
-      <w:start w:val="1"/>
-      <w:numFmt w:val="decimal"/>
-      <w:lvlText w:val="%9."/>
-      <w:lvlJc w:val="left"/>
-      <w:pPr>
-        <w:tabs>
-          <w:tab w:val="num" w:pos="6480"/>
-        </w:tabs>
-        <w:ind w:left="6480" w:hanging="360"/>
-      </w:pPr>
-    </w:lvl>
-  </w:abstractNum>
-  <w:abstractNum w:abstractNumId="14" w15:restartNumberingAfterBreak="0">
-    <w:nsid w:val="2A28746A"/>
-    <w:multiLevelType w:val="multilevel"/>
-    <w:tmpl w:val="9B767EA2"/>
-    <w:lvl w:ilvl="0">
-      <w:start w:val="1"/>
-      <w:numFmt w:val="decimal"/>
-      <w:lvlText w:val="%1."/>
-      <w:lvlJc w:val="left"/>
-      <w:pPr>
-        <w:tabs>
-          <w:tab w:val="num" w:pos="720"/>
-        </w:tabs>
-        <w:ind w:left="720" w:hanging="360"/>
-      </w:pPr>
-    </w:lvl>
-    <w:lvl w:ilvl="1" w:tentative="1">
-      <w:start w:val="1"/>
-      <w:numFmt w:val="decimal"/>
-      <w:lvlText w:val="%2."/>
-      <w:lvlJc w:val="left"/>
-      <w:pPr>
-        <w:tabs>
-          <w:tab w:val="num" w:pos="1440"/>
-        </w:tabs>
-        <w:ind w:left="1440" w:hanging="360"/>
-      </w:pPr>
-    </w:lvl>
-    <w:lvl w:ilvl="2" w:tentative="1">
-      <w:start w:val="1"/>
-      <w:numFmt w:val="decimal"/>
-      <w:lvlText w:val="%3."/>
-      <w:lvlJc w:val="left"/>
-      <w:pPr>
-        <w:tabs>
-          <w:tab w:val="num" w:pos="2160"/>
-        </w:tabs>
-        <w:ind w:left="2160" w:hanging="360"/>
-      </w:pPr>
-    </w:lvl>
-    <w:lvl w:ilvl="3" w:tentative="1">
-      <w:start w:val="1"/>
-      <w:numFmt w:val="decimal"/>
-      <w:lvlText w:val="%4."/>
-      <w:lvlJc w:val="left"/>
-      <w:pPr>
-        <w:tabs>
-          <w:tab w:val="num" w:pos="2880"/>
-        </w:tabs>
-        <w:ind w:left="2880" w:hanging="360"/>
-      </w:pPr>
-    </w:lvl>
-    <w:lvl w:ilvl="4" w:tentative="1">
-      <w:start w:val="1"/>
-      <w:numFmt w:val="decimal"/>
-      <w:lvlText w:val="%5."/>
-      <w:lvlJc w:val="left"/>
-      <w:pPr>
-        <w:tabs>
-          <w:tab w:val="num" w:pos="3600"/>
-        </w:tabs>
-        <w:ind w:left="3600" w:hanging="360"/>
-      </w:pPr>
-    </w:lvl>
-    <w:lvl w:ilvl="5" w:tentative="1">
-      <w:start w:val="1"/>
-      <w:numFmt w:val="decimal"/>
-      <w:lvlText w:val="%6."/>
-      <w:lvlJc w:val="left"/>
-      <w:pPr>
-        <w:tabs>
-          <w:tab w:val="num" w:pos="4320"/>
-        </w:tabs>
-        <w:ind w:left="4320" w:hanging="360"/>
-      </w:pPr>
-    </w:lvl>
-    <w:lvl w:ilvl="6" w:tentative="1">
-      <w:start w:val="1"/>
-      <w:numFmt w:val="decimal"/>
-      <w:lvlText w:val="%7."/>
-      <w:lvlJc w:val="left"/>
-      <w:pPr>
-        <w:tabs>
-          <w:tab w:val="num" w:pos="5040"/>
-        </w:tabs>
-        <w:ind w:left="5040" w:hanging="360"/>
-      </w:pPr>
-    </w:lvl>
-    <w:lvl w:ilvl="7" w:tentative="1">
-      <w:start w:val="1"/>
-      <w:numFmt w:val="decimal"/>
-      <w:lvlText w:val="%8."/>
-      <w:lvlJc w:val="left"/>
-      <w:pPr>
-        <w:tabs>
-          <w:tab w:val="num" w:pos="5760"/>
-        </w:tabs>
-        <w:ind w:left="5760" w:hanging="360"/>
-      </w:pPr>
-    </w:lvl>
-    <w:lvl w:ilvl="8" w:tentative="1">
-      <w:start w:val="1"/>
-      <w:numFmt w:val="decimal"/>
-      <w:lvlText w:val="%9."/>
-      <w:lvlJc w:val="left"/>
-      <w:pPr>
-        <w:tabs>
-          <w:tab w:val="num" w:pos="6480"/>
-        </w:tabs>
-        <w:ind w:left="6480" w:hanging="360"/>
-      </w:pPr>
-    </w:lvl>
-  </w:abstractNum>
-  <w:abstractNum w:abstractNumId="15" w15:restartNumberingAfterBreak="0">
-    <w:nsid w:val="2C6315CA"/>
-    <w:multiLevelType w:val="multilevel"/>
-    <w:tmpl w:val="2CF4E754"/>
-    <w:lvl w:ilvl="0">
-      <w:start w:val="1"/>
-      <w:numFmt w:val="decimal"/>
-      <w:lvlText w:val="%1."/>
-      <w:lvlJc w:val="left"/>
-      <w:pPr>
-        <w:tabs>
-          <w:tab w:val="num" w:pos="720"/>
-        </w:tabs>
-        <w:ind w:left="720" w:hanging="360"/>
-      </w:pPr>
-    </w:lvl>
-    <w:lvl w:ilvl="1" w:tentative="1">
-      <w:start w:val="1"/>
-      <w:numFmt w:val="decimal"/>
-      <w:lvlText w:val="%2."/>
-      <w:lvlJc w:val="left"/>
-      <w:pPr>
-        <w:tabs>
-          <w:tab w:val="num" w:pos="1440"/>
-        </w:tabs>
-        <w:ind w:left="1440" w:hanging="360"/>
-      </w:pPr>
-    </w:lvl>
-    <w:lvl w:ilvl="2" w:tentative="1">
-      <w:start w:val="1"/>
-      <w:numFmt w:val="decimal"/>
-      <w:lvlText w:val="%3."/>
-      <w:lvlJc w:val="left"/>
-      <w:pPr>
-        <w:tabs>
-          <w:tab w:val="num" w:pos="2160"/>
-        </w:tabs>
-        <w:ind w:left="2160" w:hanging="360"/>
-      </w:pPr>
-    </w:lvl>
-    <w:lvl w:ilvl="3" w:tentative="1">
-      <w:start w:val="1"/>
-      <w:numFmt w:val="decimal"/>
-      <w:lvlText w:val="%4."/>
-      <w:lvlJc w:val="left"/>
-      <w:pPr>
-        <w:tabs>
-          <w:tab w:val="num" w:pos="2880"/>
-        </w:tabs>
-        <w:ind w:left="2880" w:hanging="360"/>
-      </w:pPr>
-    </w:lvl>
-    <w:lvl w:ilvl="4" w:tentative="1">
-      <w:start w:val="1"/>
-      <w:numFmt w:val="decimal"/>
-      <w:lvlText w:val="%5."/>
-      <w:lvlJc w:val="left"/>
-      <w:pPr>
-        <w:tabs>
-          <w:tab w:val="num" w:pos="3600"/>
-        </w:tabs>
-        <w:ind w:left="3600" w:hanging="360"/>
-      </w:pPr>
-    </w:lvl>
-    <w:lvl w:ilvl="5" w:tentative="1">
-      <w:start w:val="1"/>
-      <w:numFmt w:val="decimal"/>
-      <w:lvlText w:val="%6."/>
-      <w:lvlJc w:val="left"/>
-      <w:pPr>
-        <w:tabs>
-          <w:tab w:val="num" w:pos="4320"/>
-        </w:tabs>
-        <w:ind w:left="4320" w:hanging="360"/>
-      </w:pPr>
-    </w:lvl>
-    <w:lvl w:ilvl="6" w:tentative="1">
-      <w:start w:val="1"/>
-      <w:numFmt w:val="decimal"/>
-      <w:lvlText w:val="%7."/>
-      <w:lvlJc w:val="left"/>
-      <w:pPr>
-        <w:tabs>
-          <w:tab w:val="num" w:pos="5040"/>
-        </w:tabs>
-        <w:ind w:left="5040" w:hanging="360"/>
-      </w:pPr>
-    </w:lvl>
-    <w:lvl w:ilvl="7" w:tentative="1">
-      <w:start w:val="1"/>
-      <w:numFmt w:val="decimal"/>
-      <w:lvlText w:val="%8."/>
-      <w:lvlJc w:val="left"/>
-      <w:pPr>
-        <w:tabs>
-          <w:tab w:val="num" w:pos="5760"/>
-        </w:tabs>
-        <w:ind w:left="5760" w:hanging="360"/>
-      </w:pPr>
-    </w:lvl>
-    <w:lvl w:ilvl="8" w:tentative="1">
-      <w:start w:val="1"/>
-      <w:numFmt w:val="decimal"/>
-      <w:lvlText w:val="%9."/>
-      <w:lvlJc w:val="left"/>
-      <w:pPr>
-        <w:tabs>
-          <w:tab w:val="num" w:pos="6480"/>
-        </w:tabs>
-        <w:ind w:left="6480" w:hanging="360"/>
-      </w:pPr>
-    </w:lvl>
-  </w:abstractNum>
-  <w:abstractNum w:abstractNumId="16" w15:restartNumberingAfterBreak="0">
-    <w:nsid w:val="2C65600A"/>
-    <w:multiLevelType w:val="multilevel"/>
-    <w:tmpl w:val="31FE4A4C"/>
-    <w:lvl w:ilvl="0">
-      <w:start w:val="1"/>
-      <w:numFmt w:val="decimal"/>
-      <w:lvlText w:val="%1."/>
-      <w:lvlJc w:val="left"/>
-      <w:pPr>
-        <w:tabs>
-          <w:tab w:val="num" w:pos="720"/>
-        </w:tabs>
-        <w:ind w:left="720" w:hanging="360"/>
-      </w:pPr>
-    </w:lvl>
-    <w:lvl w:ilvl="1" w:tentative="1">
-      <w:start w:val="1"/>
-      <w:numFmt w:val="decimal"/>
-      <w:lvlText w:val="%2."/>
-      <w:lvlJc w:val="left"/>
-      <w:pPr>
-        <w:tabs>
-          <w:tab w:val="num" w:pos="1440"/>
-        </w:tabs>
-        <w:ind w:left="1440" w:hanging="360"/>
-      </w:pPr>
-    </w:lvl>
-    <w:lvl w:ilvl="2" w:tentative="1">
-      <w:start w:val="1"/>
-      <w:numFmt w:val="decimal"/>
-      <w:lvlText w:val="%3."/>
-      <w:lvlJc w:val="left"/>
-      <w:pPr>
-        <w:tabs>
-          <w:tab w:val="num" w:pos="2160"/>
-        </w:tabs>
-        <w:ind w:left="2160" w:hanging="360"/>
-      </w:pPr>
-    </w:lvl>
-    <w:lvl w:ilvl="3" w:tentative="1">
-      <w:start w:val="1"/>
-      <w:numFmt w:val="decimal"/>
-      <w:lvlText w:val="%4."/>
-      <w:lvlJc w:val="left"/>
-      <w:pPr>
-        <w:tabs>
-          <w:tab w:val="num" w:pos="2880"/>
-        </w:tabs>
-        <w:ind w:left="2880" w:hanging="360"/>
-      </w:pPr>
-    </w:lvl>
-    <w:lvl w:ilvl="4" w:tentative="1">
-      <w:start w:val="1"/>
-      <w:numFmt w:val="decimal"/>
-      <w:lvlText w:val="%5."/>
-      <w:lvlJc w:val="left"/>
-      <w:pPr>
-        <w:tabs>
-          <w:tab w:val="num" w:pos="3600"/>
-        </w:tabs>
-        <w:ind w:left="3600" w:hanging="360"/>
-      </w:pPr>
-    </w:lvl>
-    <w:lvl w:ilvl="5" w:tentative="1">
-      <w:start w:val="1"/>
-      <w:numFmt w:val="decimal"/>
-      <w:lvlText w:val="%6."/>
-      <w:lvlJc w:val="left"/>
-      <w:pPr>
-        <w:tabs>
-          <w:tab w:val="num" w:pos="4320"/>
-        </w:tabs>
-        <w:ind w:left="4320" w:hanging="360"/>
-      </w:pPr>
-    </w:lvl>
-    <w:lvl w:ilvl="6" w:tentative="1">
-      <w:start w:val="1"/>
-      <w:numFmt w:val="decimal"/>
-      <w:lvlText w:val="%7."/>
-      <w:lvlJc w:val="left"/>
-      <w:pPr>
-        <w:tabs>
-          <w:tab w:val="num" w:pos="5040"/>
-        </w:tabs>
-        <w:ind w:left="5040" w:hanging="360"/>
-      </w:pPr>
-    </w:lvl>
-    <w:lvl w:ilvl="7" w:tentative="1">
-      <w:start w:val="1"/>
-      <w:numFmt w:val="decimal"/>
-      <w:lvlText w:val="%8."/>
-      <w:lvlJc w:val="left"/>
-      <w:pPr>
-        <w:tabs>
-          <w:tab w:val="num" w:pos="5760"/>
-        </w:tabs>
-        <w:ind w:left="5760" w:hanging="360"/>
-      </w:pPr>
-    </w:lvl>
-    <w:lvl w:ilvl="8" w:tentative="1">
-      <w:start w:val="1"/>
-      <w:numFmt w:val="decimal"/>
-      <w:lvlText w:val="%9."/>
-      <w:lvlJc w:val="left"/>
-      <w:pPr>
-        <w:tabs>
-          <w:tab w:val="num" w:pos="6480"/>
-        </w:tabs>
-        <w:ind w:left="6480" w:hanging="360"/>
-      </w:pPr>
-    </w:lvl>
-  </w:abstractNum>
-  <w:abstractNum w:abstractNumId="17" w15:restartNumberingAfterBreak="0">
-    <w:nsid w:val="2D123E75"/>
-    <w:multiLevelType w:val="multilevel"/>
-    <w:tmpl w:val="8A4AC85C"/>
-    <w:lvl w:ilvl="0">
-      <w:start w:val="1"/>
-      <w:numFmt w:val="decimal"/>
-      <w:lvlText w:val="%1."/>
-      <w:lvlJc w:val="left"/>
-      <w:pPr>
-        <w:tabs>
-          <w:tab w:val="num" w:pos="720"/>
-        </w:tabs>
-        <w:ind w:left="720" w:hanging="360"/>
-      </w:pPr>
-    </w:lvl>
-    <w:lvl w:ilvl="1" w:tentative="1">
-      <w:start w:val="1"/>
-      <w:numFmt w:val="decimal"/>
-      <w:lvlText w:val="%2."/>
-      <w:lvlJc w:val="left"/>
-      <w:pPr>
-        <w:tabs>
-          <w:tab w:val="num" w:pos="1440"/>
-        </w:tabs>
-        <w:ind w:left="1440" w:hanging="360"/>
-      </w:pPr>
-    </w:lvl>
-    <w:lvl w:ilvl="2" w:tentative="1">
-      <w:start w:val="1"/>
-      <w:numFmt w:val="decimal"/>
-      <w:lvlText w:val="%3."/>
-      <w:lvlJc w:val="left"/>
-      <w:pPr>
-        <w:tabs>
-          <w:tab w:val="num" w:pos="2160"/>
-        </w:tabs>
-        <w:ind w:left="2160" w:hanging="360"/>
-      </w:pPr>
-    </w:lvl>
-    <w:lvl w:ilvl="3" w:tentative="1">
-      <w:start w:val="1"/>
-      <w:numFmt w:val="decimal"/>
-      <w:lvlText w:val="%4."/>
-      <w:lvlJc w:val="left"/>
-      <w:pPr>
-        <w:tabs>
-          <w:tab w:val="num" w:pos="2880"/>
-        </w:tabs>
-        <w:ind w:left="2880" w:hanging="360"/>
-      </w:pPr>
-    </w:lvl>
-    <w:lvl w:ilvl="4" w:tentative="1">
-      <w:start w:val="1"/>
-      <w:numFmt w:val="decimal"/>
-      <w:lvlText w:val="%5."/>
-      <w:lvlJc w:val="left"/>
-      <w:pPr>
-        <w:tabs>
-          <w:tab w:val="num" w:pos="3600"/>
-        </w:tabs>
-        <w:ind w:left="3600" w:hanging="360"/>
-      </w:pPr>
-    </w:lvl>
-    <w:lvl w:ilvl="5" w:tentative="1">
-      <w:start w:val="1"/>
-      <w:numFmt w:val="decimal"/>
-      <w:lvlText w:val="%6."/>
-      <w:lvlJc w:val="left"/>
-      <w:pPr>
-        <w:tabs>
-          <w:tab w:val="num" w:pos="4320"/>
-        </w:tabs>
-        <w:ind w:left="4320" w:hanging="360"/>
-      </w:pPr>
-    </w:lvl>
-    <w:lvl w:ilvl="6" w:tentative="1">
-      <w:start w:val="1"/>
-      <w:numFmt w:val="decimal"/>
-      <w:lvlText w:val="%7."/>
-      <w:lvlJc w:val="left"/>
-      <w:pPr>
-        <w:tabs>
-          <w:tab w:val="num" w:pos="5040"/>
-        </w:tabs>
-        <w:ind w:left="5040" w:hanging="360"/>
-      </w:pPr>
-    </w:lvl>
-    <w:lvl w:ilvl="7" w:tentative="1">
-      <w:start w:val="1"/>
-      <w:numFmt w:val="decimal"/>
-      <w:lvlText w:val="%8."/>
-      <w:lvlJc w:val="left"/>
-      <w:pPr>
-        <w:tabs>
-          <w:tab w:val="num" w:pos="5760"/>
-        </w:tabs>
-        <w:ind w:left="5760" w:hanging="360"/>
-      </w:pPr>
-    </w:lvl>
-    <w:lvl w:ilvl="8" w:tentative="1">
-      <w:start w:val="1"/>
-      <w:numFmt w:val="decimal"/>
-      <w:lvlText w:val="%9."/>
-      <w:lvlJc w:val="left"/>
-      <w:pPr>
-        <w:tabs>
-          <w:tab w:val="num" w:pos="6480"/>
-        </w:tabs>
-        <w:ind w:left="6480" w:hanging="360"/>
-      </w:pPr>
-    </w:lvl>
-  </w:abstractNum>
-  <w:abstractNum w:abstractNumId="18" w15:restartNumberingAfterBreak="0">
-    <w:nsid w:val="33D24FB8"/>
-    <w:multiLevelType w:val="multilevel"/>
-    <w:tmpl w:val="0048252A"/>
+    <w:tmpl w:val="9766A590"/>
     <w:lvl w:ilvl="0">
       <w:start w:val="1"/>
       <w:numFmt w:val="bullet"/>
@@ -13230,10 +12665,10 @@
       </w:rPr>
     </w:lvl>
   </w:abstractNum>
-  <w:abstractNum w:abstractNumId="19" w15:restartNumberingAfterBreak="0">
-    <w:nsid w:val="385D0235"/>
+  <w:abstractNum w:abstractNumId="14" w15:restartNumberingAfterBreak="0">
+    <w:nsid w:val="3B172976"/>
     <w:multiLevelType w:val="multilevel"/>
-    <w:tmpl w:val="B1F464A0"/>
+    <w:tmpl w:val="8372567E"/>
     <w:lvl w:ilvl="0">
       <w:start w:val="1"/>
       <w:numFmt w:val="decimal"/>
@@ -13343,10 +12778,123 @@
       </w:pPr>
     </w:lvl>
   </w:abstractNum>
-  <w:abstractNum w:abstractNumId="20" w15:restartNumberingAfterBreak="0">
-    <w:nsid w:val="3ABD1FC3"/>
+  <w:abstractNum w:abstractNumId="15" w15:restartNumberingAfterBreak="0">
+    <w:nsid w:val="3DDC6B8B"/>
     <w:multiLevelType w:val="multilevel"/>
-    <w:tmpl w:val="5F665926"/>
+    <w:tmpl w:val="ECF4F75E"/>
+    <w:lvl w:ilvl="0">
+      <w:start w:val="1"/>
+      <w:numFmt w:val="decimal"/>
+      <w:lvlText w:val="%1."/>
+      <w:lvlJc w:val="left"/>
+      <w:pPr>
+        <w:tabs>
+          <w:tab w:val="num" w:pos="720"/>
+        </w:tabs>
+        <w:ind w:left="720" w:hanging="360"/>
+      </w:pPr>
+    </w:lvl>
+    <w:lvl w:ilvl="1" w:tentative="1">
+      <w:start w:val="1"/>
+      <w:numFmt w:val="decimal"/>
+      <w:lvlText w:val="%2."/>
+      <w:lvlJc w:val="left"/>
+      <w:pPr>
+        <w:tabs>
+          <w:tab w:val="num" w:pos="1440"/>
+        </w:tabs>
+        <w:ind w:left="1440" w:hanging="360"/>
+      </w:pPr>
+    </w:lvl>
+    <w:lvl w:ilvl="2" w:tentative="1">
+      <w:start w:val="1"/>
+      <w:numFmt w:val="decimal"/>
+      <w:lvlText w:val="%3."/>
+      <w:lvlJc w:val="left"/>
+      <w:pPr>
+        <w:tabs>
+          <w:tab w:val="num" w:pos="2160"/>
+        </w:tabs>
+        <w:ind w:left="2160" w:hanging="360"/>
+      </w:pPr>
+    </w:lvl>
+    <w:lvl w:ilvl="3" w:tentative="1">
+      <w:start w:val="1"/>
+      <w:numFmt w:val="decimal"/>
+      <w:lvlText w:val="%4."/>
+      <w:lvlJc w:val="left"/>
+      <w:pPr>
+        <w:tabs>
+          <w:tab w:val="num" w:pos="2880"/>
+        </w:tabs>
+        <w:ind w:left="2880" w:hanging="360"/>
+      </w:pPr>
+    </w:lvl>
+    <w:lvl w:ilvl="4" w:tentative="1">
+      <w:start w:val="1"/>
+      <w:numFmt w:val="decimal"/>
+      <w:lvlText w:val="%5."/>
+      <w:lvlJc w:val="left"/>
+      <w:pPr>
+        <w:tabs>
+          <w:tab w:val="num" w:pos="3600"/>
+        </w:tabs>
+        <w:ind w:left="3600" w:hanging="360"/>
+      </w:pPr>
+    </w:lvl>
+    <w:lvl w:ilvl="5" w:tentative="1">
+      <w:start w:val="1"/>
+      <w:numFmt w:val="decimal"/>
+      <w:lvlText w:val="%6."/>
+      <w:lvlJc w:val="left"/>
+      <w:pPr>
+        <w:tabs>
+          <w:tab w:val="num" w:pos="4320"/>
+        </w:tabs>
+        <w:ind w:left="4320" w:hanging="360"/>
+      </w:pPr>
+    </w:lvl>
+    <w:lvl w:ilvl="6" w:tentative="1">
+      <w:start w:val="1"/>
+      <w:numFmt w:val="decimal"/>
+      <w:lvlText w:val="%7."/>
+      <w:lvlJc w:val="left"/>
+      <w:pPr>
+        <w:tabs>
+          <w:tab w:val="num" w:pos="5040"/>
+        </w:tabs>
+        <w:ind w:left="5040" w:hanging="360"/>
+      </w:pPr>
+    </w:lvl>
+    <w:lvl w:ilvl="7" w:tentative="1">
+      <w:start w:val="1"/>
+      <w:numFmt w:val="decimal"/>
+      <w:lvlText w:val="%8."/>
+      <w:lvlJc w:val="left"/>
+      <w:pPr>
+        <w:tabs>
+          <w:tab w:val="num" w:pos="5760"/>
+        </w:tabs>
+        <w:ind w:left="5760" w:hanging="360"/>
+      </w:pPr>
+    </w:lvl>
+    <w:lvl w:ilvl="8" w:tentative="1">
+      <w:start w:val="1"/>
+      <w:numFmt w:val="decimal"/>
+      <w:lvlText w:val="%9."/>
+      <w:lvlJc w:val="left"/>
+      <w:pPr>
+        <w:tabs>
+          <w:tab w:val="num" w:pos="6480"/>
+        </w:tabs>
+        <w:ind w:left="6480" w:hanging="360"/>
+      </w:pPr>
+    </w:lvl>
+  </w:abstractNum>
+  <w:abstractNum w:abstractNumId="16" w15:restartNumberingAfterBreak="0">
+    <w:nsid w:val="3E6858E7"/>
+    <w:multiLevelType w:val="multilevel"/>
+    <w:tmpl w:val="CDF4B6C8"/>
     <w:lvl w:ilvl="0">
       <w:start w:val="1"/>
       <w:numFmt w:val="bullet"/>
@@ -13492,10 +13040,10 @@
       </w:rPr>
     </w:lvl>
   </w:abstractNum>
-  <w:abstractNum w:abstractNumId="21" w15:restartNumberingAfterBreak="0">
-    <w:nsid w:val="3EB4358C"/>
+  <w:abstractNum w:abstractNumId="17" w15:restartNumberingAfterBreak="0">
+    <w:nsid w:val="405B3216"/>
     <w:multiLevelType w:val="multilevel"/>
-    <w:tmpl w:val="FE127B6E"/>
+    <w:tmpl w:val="566A9732"/>
     <w:lvl w:ilvl="0">
       <w:start w:val="1"/>
       <w:numFmt w:val="bullet"/>
@@ -13641,10 +13189,575 @@
       </w:rPr>
     </w:lvl>
   </w:abstractNum>
+  <w:abstractNum w:abstractNumId="18" w15:restartNumberingAfterBreak="0">
+    <w:nsid w:val="407500D7"/>
+    <w:multiLevelType w:val="multilevel"/>
+    <w:tmpl w:val="EAC429E8"/>
+    <w:lvl w:ilvl="0">
+      <w:start w:val="1"/>
+      <w:numFmt w:val="decimal"/>
+      <w:lvlText w:val="%1."/>
+      <w:lvlJc w:val="left"/>
+      <w:pPr>
+        <w:tabs>
+          <w:tab w:val="num" w:pos="720"/>
+        </w:tabs>
+        <w:ind w:left="720" w:hanging="360"/>
+      </w:pPr>
+    </w:lvl>
+    <w:lvl w:ilvl="1" w:tentative="1">
+      <w:start w:val="1"/>
+      <w:numFmt w:val="decimal"/>
+      <w:lvlText w:val="%2."/>
+      <w:lvlJc w:val="left"/>
+      <w:pPr>
+        <w:tabs>
+          <w:tab w:val="num" w:pos="1440"/>
+        </w:tabs>
+        <w:ind w:left="1440" w:hanging="360"/>
+      </w:pPr>
+    </w:lvl>
+    <w:lvl w:ilvl="2" w:tentative="1">
+      <w:start w:val="1"/>
+      <w:numFmt w:val="decimal"/>
+      <w:lvlText w:val="%3."/>
+      <w:lvlJc w:val="left"/>
+      <w:pPr>
+        <w:tabs>
+          <w:tab w:val="num" w:pos="2160"/>
+        </w:tabs>
+        <w:ind w:left="2160" w:hanging="360"/>
+      </w:pPr>
+    </w:lvl>
+    <w:lvl w:ilvl="3" w:tentative="1">
+      <w:start w:val="1"/>
+      <w:numFmt w:val="decimal"/>
+      <w:lvlText w:val="%4."/>
+      <w:lvlJc w:val="left"/>
+      <w:pPr>
+        <w:tabs>
+          <w:tab w:val="num" w:pos="2880"/>
+        </w:tabs>
+        <w:ind w:left="2880" w:hanging="360"/>
+      </w:pPr>
+    </w:lvl>
+    <w:lvl w:ilvl="4" w:tentative="1">
+      <w:start w:val="1"/>
+      <w:numFmt w:val="decimal"/>
+      <w:lvlText w:val="%5."/>
+      <w:lvlJc w:val="left"/>
+      <w:pPr>
+        <w:tabs>
+          <w:tab w:val="num" w:pos="3600"/>
+        </w:tabs>
+        <w:ind w:left="3600" w:hanging="360"/>
+      </w:pPr>
+    </w:lvl>
+    <w:lvl w:ilvl="5" w:tentative="1">
+      <w:start w:val="1"/>
+      <w:numFmt w:val="decimal"/>
+      <w:lvlText w:val="%6."/>
+      <w:lvlJc w:val="left"/>
+      <w:pPr>
+        <w:tabs>
+          <w:tab w:val="num" w:pos="4320"/>
+        </w:tabs>
+        <w:ind w:left="4320" w:hanging="360"/>
+      </w:pPr>
+    </w:lvl>
+    <w:lvl w:ilvl="6" w:tentative="1">
+      <w:start w:val="1"/>
+      <w:numFmt w:val="decimal"/>
+      <w:lvlText w:val="%7."/>
+      <w:lvlJc w:val="left"/>
+      <w:pPr>
+        <w:tabs>
+          <w:tab w:val="num" w:pos="5040"/>
+        </w:tabs>
+        <w:ind w:left="5040" w:hanging="360"/>
+      </w:pPr>
+    </w:lvl>
+    <w:lvl w:ilvl="7" w:tentative="1">
+      <w:start w:val="1"/>
+      <w:numFmt w:val="decimal"/>
+      <w:lvlText w:val="%8."/>
+      <w:lvlJc w:val="left"/>
+      <w:pPr>
+        <w:tabs>
+          <w:tab w:val="num" w:pos="5760"/>
+        </w:tabs>
+        <w:ind w:left="5760" w:hanging="360"/>
+      </w:pPr>
+    </w:lvl>
+    <w:lvl w:ilvl="8" w:tentative="1">
+      <w:start w:val="1"/>
+      <w:numFmt w:val="decimal"/>
+      <w:lvlText w:val="%9."/>
+      <w:lvlJc w:val="left"/>
+      <w:pPr>
+        <w:tabs>
+          <w:tab w:val="num" w:pos="6480"/>
+        </w:tabs>
+        <w:ind w:left="6480" w:hanging="360"/>
+      </w:pPr>
+    </w:lvl>
+  </w:abstractNum>
+  <w:abstractNum w:abstractNumId="19" w15:restartNumberingAfterBreak="0">
+    <w:nsid w:val="41575F9F"/>
+    <w:multiLevelType w:val="multilevel"/>
+    <w:tmpl w:val="6978AC60"/>
+    <w:lvl w:ilvl="0">
+      <w:start w:val="1"/>
+      <w:numFmt w:val="decimal"/>
+      <w:lvlText w:val="%1."/>
+      <w:lvlJc w:val="left"/>
+      <w:pPr>
+        <w:tabs>
+          <w:tab w:val="num" w:pos="720"/>
+        </w:tabs>
+        <w:ind w:left="720" w:hanging="360"/>
+      </w:pPr>
+    </w:lvl>
+    <w:lvl w:ilvl="1" w:tentative="1">
+      <w:start w:val="1"/>
+      <w:numFmt w:val="decimal"/>
+      <w:lvlText w:val="%2."/>
+      <w:lvlJc w:val="left"/>
+      <w:pPr>
+        <w:tabs>
+          <w:tab w:val="num" w:pos="1440"/>
+        </w:tabs>
+        <w:ind w:left="1440" w:hanging="360"/>
+      </w:pPr>
+    </w:lvl>
+    <w:lvl w:ilvl="2" w:tentative="1">
+      <w:start w:val="1"/>
+      <w:numFmt w:val="decimal"/>
+      <w:lvlText w:val="%3."/>
+      <w:lvlJc w:val="left"/>
+      <w:pPr>
+        <w:tabs>
+          <w:tab w:val="num" w:pos="2160"/>
+        </w:tabs>
+        <w:ind w:left="2160" w:hanging="360"/>
+      </w:pPr>
+    </w:lvl>
+    <w:lvl w:ilvl="3" w:tentative="1">
+      <w:start w:val="1"/>
+      <w:numFmt w:val="decimal"/>
+      <w:lvlText w:val="%4."/>
+      <w:lvlJc w:val="left"/>
+      <w:pPr>
+        <w:tabs>
+          <w:tab w:val="num" w:pos="2880"/>
+        </w:tabs>
+        <w:ind w:left="2880" w:hanging="360"/>
+      </w:pPr>
+    </w:lvl>
+    <w:lvl w:ilvl="4" w:tentative="1">
+      <w:start w:val="1"/>
+      <w:numFmt w:val="decimal"/>
+      <w:lvlText w:val="%5."/>
+      <w:lvlJc w:val="left"/>
+      <w:pPr>
+        <w:tabs>
+          <w:tab w:val="num" w:pos="3600"/>
+        </w:tabs>
+        <w:ind w:left="3600" w:hanging="360"/>
+      </w:pPr>
+    </w:lvl>
+    <w:lvl w:ilvl="5" w:tentative="1">
+      <w:start w:val="1"/>
+      <w:numFmt w:val="decimal"/>
+      <w:lvlText w:val="%6."/>
+      <w:lvlJc w:val="left"/>
+      <w:pPr>
+        <w:tabs>
+          <w:tab w:val="num" w:pos="4320"/>
+        </w:tabs>
+        <w:ind w:left="4320" w:hanging="360"/>
+      </w:pPr>
+    </w:lvl>
+    <w:lvl w:ilvl="6" w:tentative="1">
+      <w:start w:val="1"/>
+      <w:numFmt w:val="decimal"/>
+      <w:lvlText w:val="%7."/>
+      <w:lvlJc w:val="left"/>
+      <w:pPr>
+        <w:tabs>
+          <w:tab w:val="num" w:pos="5040"/>
+        </w:tabs>
+        <w:ind w:left="5040" w:hanging="360"/>
+      </w:pPr>
+    </w:lvl>
+    <w:lvl w:ilvl="7" w:tentative="1">
+      <w:start w:val="1"/>
+      <w:numFmt w:val="decimal"/>
+      <w:lvlText w:val="%8."/>
+      <w:lvlJc w:val="left"/>
+      <w:pPr>
+        <w:tabs>
+          <w:tab w:val="num" w:pos="5760"/>
+        </w:tabs>
+        <w:ind w:left="5760" w:hanging="360"/>
+      </w:pPr>
+    </w:lvl>
+    <w:lvl w:ilvl="8" w:tentative="1">
+      <w:start w:val="1"/>
+      <w:numFmt w:val="decimal"/>
+      <w:lvlText w:val="%9."/>
+      <w:lvlJc w:val="left"/>
+      <w:pPr>
+        <w:tabs>
+          <w:tab w:val="num" w:pos="6480"/>
+        </w:tabs>
+        <w:ind w:left="6480" w:hanging="360"/>
+      </w:pPr>
+    </w:lvl>
+  </w:abstractNum>
+  <w:abstractNum w:abstractNumId="20" w15:restartNumberingAfterBreak="0">
+    <w:nsid w:val="41EB236D"/>
+    <w:multiLevelType w:val="multilevel"/>
+    <w:tmpl w:val="66AC5A16"/>
+    <w:lvl w:ilvl="0">
+      <w:start w:val="1"/>
+      <w:numFmt w:val="decimal"/>
+      <w:lvlText w:val="%1."/>
+      <w:lvlJc w:val="left"/>
+      <w:pPr>
+        <w:tabs>
+          <w:tab w:val="num" w:pos="720"/>
+        </w:tabs>
+        <w:ind w:left="720" w:hanging="360"/>
+      </w:pPr>
+    </w:lvl>
+    <w:lvl w:ilvl="1" w:tentative="1">
+      <w:start w:val="1"/>
+      <w:numFmt w:val="decimal"/>
+      <w:lvlText w:val="%2."/>
+      <w:lvlJc w:val="left"/>
+      <w:pPr>
+        <w:tabs>
+          <w:tab w:val="num" w:pos="1440"/>
+        </w:tabs>
+        <w:ind w:left="1440" w:hanging="360"/>
+      </w:pPr>
+    </w:lvl>
+    <w:lvl w:ilvl="2" w:tentative="1">
+      <w:start w:val="1"/>
+      <w:numFmt w:val="decimal"/>
+      <w:lvlText w:val="%3."/>
+      <w:lvlJc w:val="left"/>
+      <w:pPr>
+        <w:tabs>
+          <w:tab w:val="num" w:pos="2160"/>
+        </w:tabs>
+        <w:ind w:left="2160" w:hanging="360"/>
+      </w:pPr>
+    </w:lvl>
+    <w:lvl w:ilvl="3" w:tentative="1">
+      <w:start w:val="1"/>
+      <w:numFmt w:val="decimal"/>
+      <w:lvlText w:val="%4."/>
+      <w:lvlJc w:val="left"/>
+      <w:pPr>
+        <w:tabs>
+          <w:tab w:val="num" w:pos="2880"/>
+        </w:tabs>
+        <w:ind w:left="2880" w:hanging="360"/>
+      </w:pPr>
+    </w:lvl>
+    <w:lvl w:ilvl="4" w:tentative="1">
+      <w:start w:val="1"/>
+      <w:numFmt w:val="decimal"/>
+      <w:lvlText w:val="%5."/>
+      <w:lvlJc w:val="left"/>
+      <w:pPr>
+        <w:tabs>
+          <w:tab w:val="num" w:pos="3600"/>
+        </w:tabs>
+        <w:ind w:left="3600" w:hanging="360"/>
+      </w:pPr>
+    </w:lvl>
+    <w:lvl w:ilvl="5" w:tentative="1">
+      <w:start w:val="1"/>
+      <w:numFmt w:val="decimal"/>
+      <w:lvlText w:val="%6."/>
+      <w:lvlJc w:val="left"/>
+      <w:pPr>
+        <w:tabs>
+          <w:tab w:val="num" w:pos="4320"/>
+        </w:tabs>
+        <w:ind w:left="4320" w:hanging="360"/>
+      </w:pPr>
+    </w:lvl>
+    <w:lvl w:ilvl="6" w:tentative="1">
+      <w:start w:val="1"/>
+      <w:numFmt w:val="decimal"/>
+      <w:lvlText w:val="%7."/>
+      <w:lvlJc w:val="left"/>
+      <w:pPr>
+        <w:tabs>
+          <w:tab w:val="num" w:pos="5040"/>
+        </w:tabs>
+        <w:ind w:left="5040" w:hanging="360"/>
+      </w:pPr>
+    </w:lvl>
+    <w:lvl w:ilvl="7" w:tentative="1">
+      <w:start w:val="1"/>
+      <w:numFmt w:val="decimal"/>
+      <w:lvlText w:val="%8."/>
+      <w:lvlJc w:val="left"/>
+      <w:pPr>
+        <w:tabs>
+          <w:tab w:val="num" w:pos="5760"/>
+        </w:tabs>
+        <w:ind w:left="5760" w:hanging="360"/>
+      </w:pPr>
+    </w:lvl>
+    <w:lvl w:ilvl="8" w:tentative="1">
+      <w:start w:val="1"/>
+      <w:numFmt w:val="decimal"/>
+      <w:lvlText w:val="%9."/>
+      <w:lvlJc w:val="left"/>
+      <w:pPr>
+        <w:tabs>
+          <w:tab w:val="num" w:pos="6480"/>
+        </w:tabs>
+        <w:ind w:left="6480" w:hanging="360"/>
+      </w:pPr>
+    </w:lvl>
+  </w:abstractNum>
+  <w:abstractNum w:abstractNumId="21" w15:restartNumberingAfterBreak="0">
+    <w:nsid w:val="423654B3"/>
+    <w:multiLevelType w:val="multilevel"/>
+    <w:tmpl w:val="329A9F3C"/>
+    <w:lvl w:ilvl="0">
+      <w:start w:val="1"/>
+      <w:numFmt w:val="decimal"/>
+      <w:lvlText w:val="%1."/>
+      <w:lvlJc w:val="left"/>
+      <w:pPr>
+        <w:tabs>
+          <w:tab w:val="num" w:pos="720"/>
+        </w:tabs>
+        <w:ind w:left="720" w:hanging="360"/>
+      </w:pPr>
+    </w:lvl>
+    <w:lvl w:ilvl="1" w:tentative="1">
+      <w:start w:val="1"/>
+      <w:numFmt w:val="decimal"/>
+      <w:lvlText w:val="%2."/>
+      <w:lvlJc w:val="left"/>
+      <w:pPr>
+        <w:tabs>
+          <w:tab w:val="num" w:pos="1440"/>
+        </w:tabs>
+        <w:ind w:left="1440" w:hanging="360"/>
+      </w:pPr>
+    </w:lvl>
+    <w:lvl w:ilvl="2" w:tentative="1">
+      <w:start w:val="1"/>
+      <w:numFmt w:val="decimal"/>
+      <w:lvlText w:val="%3."/>
+      <w:lvlJc w:val="left"/>
+      <w:pPr>
+        <w:tabs>
+          <w:tab w:val="num" w:pos="2160"/>
+        </w:tabs>
+        <w:ind w:left="2160" w:hanging="360"/>
+      </w:pPr>
+    </w:lvl>
+    <w:lvl w:ilvl="3" w:tentative="1">
+      <w:start w:val="1"/>
+      <w:numFmt w:val="decimal"/>
+      <w:lvlText w:val="%4."/>
+      <w:lvlJc w:val="left"/>
+      <w:pPr>
+        <w:tabs>
+          <w:tab w:val="num" w:pos="2880"/>
+        </w:tabs>
+        <w:ind w:left="2880" w:hanging="360"/>
+      </w:pPr>
+    </w:lvl>
+    <w:lvl w:ilvl="4" w:tentative="1">
+      <w:start w:val="1"/>
+      <w:numFmt w:val="decimal"/>
+      <w:lvlText w:val="%5."/>
+      <w:lvlJc w:val="left"/>
+      <w:pPr>
+        <w:tabs>
+          <w:tab w:val="num" w:pos="3600"/>
+        </w:tabs>
+        <w:ind w:left="3600" w:hanging="360"/>
+      </w:pPr>
+    </w:lvl>
+    <w:lvl w:ilvl="5" w:tentative="1">
+      <w:start w:val="1"/>
+      <w:numFmt w:val="decimal"/>
+      <w:lvlText w:val="%6."/>
+      <w:lvlJc w:val="left"/>
+      <w:pPr>
+        <w:tabs>
+          <w:tab w:val="num" w:pos="4320"/>
+        </w:tabs>
+        <w:ind w:left="4320" w:hanging="360"/>
+      </w:pPr>
+    </w:lvl>
+    <w:lvl w:ilvl="6" w:tentative="1">
+      <w:start w:val="1"/>
+      <w:numFmt w:val="decimal"/>
+      <w:lvlText w:val="%7."/>
+      <w:lvlJc w:val="left"/>
+      <w:pPr>
+        <w:tabs>
+          <w:tab w:val="num" w:pos="5040"/>
+        </w:tabs>
+        <w:ind w:left="5040" w:hanging="360"/>
+      </w:pPr>
+    </w:lvl>
+    <w:lvl w:ilvl="7" w:tentative="1">
+      <w:start w:val="1"/>
+      <w:numFmt w:val="decimal"/>
+      <w:lvlText w:val="%8."/>
+      <w:lvlJc w:val="left"/>
+      <w:pPr>
+        <w:tabs>
+          <w:tab w:val="num" w:pos="5760"/>
+        </w:tabs>
+        <w:ind w:left="5760" w:hanging="360"/>
+      </w:pPr>
+    </w:lvl>
+    <w:lvl w:ilvl="8" w:tentative="1">
+      <w:start w:val="1"/>
+      <w:numFmt w:val="decimal"/>
+      <w:lvlText w:val="%9."/>
+      <w:lvlJc w:val="left"/>
+      <w:pPr>
+        <w:tabs>
+          <w:tab w:val="num" w:pos="6480"/>
+        </w:tabs>
+        <w:ind w:left="6480" w:hanging="360"/>
+      </w:pPr>
+    </w:lvl>
+  </w:abstractNum>
   <w:abstractNum w:abstractNumId="22" w15:restartNumberingAfterBreak="0">
-    <w:nsid w:val="425A2839"/>
+    <w:nsid w:val="4D9630E7"/>
     <w:multiLevelType w:val="multilevel"/>
-    <w:tmpl w:val="A8009F28"/>
+    <w:tmpl w:val="A3625A24"/>
+    <w:lvl w:ilvl="0">
+      <w:start w:val="1"/>
+      <w:numFmt w:val="decimal"/>
+      <w:lvlText w:val="%1."/>
+      <w:lvlJc w:val="left"/>
+      <w:pPr>
+        <w:tabs>
+          <w:tab w:val="num" w:pos="720"/>
+        </w:tabs>
+        <w:ind w:left="720" w:hanging="360"/>
+      </w:pPr>
+    </w:lvl>
+    <w:lvl w:ilvl="1" w:tentative="1">
+      <w:start w:val="1"/>
+      <w:numFmt w:val="decimal"/>
+      <w:lvlText w:val="%2."/>
+      <w:lvlJc w:val="left"/>
+      <w:pPr>
+        <w:tabs>
+          <w:tab w:val="num" w:pos="1440"/>
+        </w:tabs>
+        <w:ind w:left="1440" w:hanging="360"/>
+      </w:pPr>
+    </w:lvl>
+    <w:lvl w:ilvl="2" w:tentative="1">
+      <w:start w:val="1"/>
+      <w:numFmt w:val="decimal"/>
+      <w:lvlText w:val="%3."/>
+      <w:lvlJc w:val="left"/>
+      <w:pPr>
+        <w:tabs>
+          <w:tab w:val="num" w:pos="2160"/>
+        </w:tabs>
+        <w:ind w:left="2160" w:hanging="360"/>
+      </w:pPr>
+    </w:lvl>
+    <w:lvl w:ilvl="3" w:tentative="1">
+      <w:start w:val="1"/>
+      <w:numFmt w:val="decimal"/>
+      <w:lvlText w:val="%4."/>
+      <w:lvlJc w:val="left"/>
+      <w:pPr>
+        <w:tabs>
+          <w:tab w:val="num" w:pos="2880"/>
+        </w:tabs>
+        <w:ind w:left="2880" w:hanging="360"/>
+      </w:pPr>
+    </w:lvl>
+    <w:lvl w:ilvl="4" w:tentative="1">
+      <w:start w:val="1"/>
+      <w:numFmt w:val="decimal"/>
+      <w:lvlText w:val="%5."/>
+      <w:lvlJc w:val="left"/>
+      <w:pPr>
+        <w:tabs>
+          <w:tab w:val="num" w:pos="3600"/>
+        </w:tabs>
+        <w:ind w:left="3600" w:hanging="360"/>
+      </w:pPr>
+    </w:lvl>
+    <w:lvl w:ilvl="5" w:tentative="1">
+      <w:start w:val="1"/>
+      <w:numFmt w:val="decimal"/>
+      <w:lvlText w:val="%6."/>
+      <w:lvlJc w:val="left"/>
+      <w:pPr>
+        <w:tabs>
+          <w:tab w:val="num" w:pos="4320"/>
+        </w:tabs>
+        <w:ind w:left="4320" w:hanging="360"/>
+      </w:pPr>
+    </w:lvl>
+    <w:lvl w:ilvl="6" w:tentative="1">
+      <w:start w:val="1"/>
+      <w:numFmt w:val="decimal"/>
+      <w:lvlText w:val="%7."/>
+      <w:lvlJc w:val="left"/>
+      <w:pPr>
+        <w:tabs>
+          <w:tab w:val="num" w:pos="5040"/>
+        </w:tabs>
+        <w:ind w:left="5040" w:hanging="360"/>
+      </w:pPr>
+    </w:lvl>
+    <w:lvl w:ilvl="7" w:tentative="1">
+      <w:start w:val="1"/>
+      <w:numFmt w:val="decimal"/>
+      <w:lvlText w:val="%8."/>
+      <w:lvlJc w:val="left"/>
+      <w:pPr>
+        <w:tabs>
+          <w:tab w:val="num" w:pos="5760"/>
+        </w:tabs>
+        <w:ind w:left="5760" w:hanging="360"/>
+      </w:pPr>
+    </w:lvl>
+    <w:lvl w:ilvl="8" w:tentative="1">
+      <w:start w:val="1"/>
+      <w:numFmt w:val="decimal"/>
+      <w:lvlText w:val="%9."/>
+      <w:lvlJc w:val="left"/>
+      <w:pPr>
+        <w:tabs>
+          <w:tab w:val="num" w:pos="6480"/>
+        </w:tabs>
+        <w:ind w:left="6480" w:hanging="360"/>
+      </w:pPr>
+    </w:lvl>
+  </w:abstractNum>
+  <w:abstractNum w:abstractNumId="23" w15:restartNumberingAfterBreak="0">
+    <w:nsid w:val="4EED15AA"/>
+    <w:multiLevelType w:val="multilevel"/>
+    <w:tmpl w:val="C2AE3408"/>
     <w:lvl w:ilvl="0">
       <w:start w:val="1"/>
       <w:numFmt w:val="bullet"/>
@@ -13790,123 +13903,10 @@
       </w:rPr>
     </w:lvl>
   </w:abstractNum>
-  <w:abstractNum w:abstractNumId="23" w15:restartNumberingAfterBreak="0">
-    <w:nsid w:val="497B43FD"/>
+  <w:abstractNum w:abstractNumId="24" w15:restartNumberingAfterBreak="0">
+    <w:nsid w:val="525A040F"/>
     <w:multiLevelType w:val="multilevel"/>
-    <w:tmpl w:val="17F8E7EC"/>
-    <w:lvl w:ilvl="0">
-      <w:start w:val="1"/>
-      <w:numFmt w:val="decimal"/>
-      <w:lvlText w:val="%1."/>
-      <w:lvlJc w:val="left"/>
-      <w:pPr>
-        <w:tabs>
-          <w:tab w:val="num" w:pos="720"/>
-        </w:tabs>
-        <w:ind w:left="720" w:hanging="360"/>
-      </w:pPr>
-    </w:lvl>
-    <w:lvl w:ilvl="1" w:tentative="1">
-      <w:start w:val="1"/>
-      <w:numFmt w:val="decimal"/>
-      <w:lvlText w:val="%2."/>
-      <w:lvlJc w:val="left"/>
-      <w:pPr>
-        <w:tabs>
-          <w:tab w:val="num" w:pos="1440"/>
-        </w:tabs>
-        <w:ind w:left="1440" w:hanging="360"/>
-      </w:pPr>
-    </w:lvl>
-    <w:lvl w:ilvl="2" w:tentative="1">
-      <w:start w:val="1"/>
-      <w:numFmt w:val="decimal"/>
-      <w:lvlText w:val="%3."/>
-      <w:lvlJc w:val="left"/>
-      <w:pPr>
-        <w:tabs>
-          <w:tab w:val="num" w:pos="2160"/>
-        </w:tabs>
-        <w:ind w:left="2160" w:hanging="360"/>
-      </w:pPr>
-    </w:lvl>
-    <w:lvl w:ilvl="3" w:tentative="1">
-      <w:start w:val="1"/>
-      <w:numFmt w:val="decimal"/>
-      <w:lvlText w:val="%4."/>
-      <w:lvlJc w:val="left"/>
-      <w:pPr>
-        <w:tabs>
-          <w:tab w:val="num" w:pos="2880"/>
-        </w:tabs>
-        <w:ind w:left="2880" w:hanging="360"/>
-      </w:pPr>
-    </w:lvl>
-    <w:lvl w:ilvl="4" w:tentative="1">
-      <w:start w:val="1"/>
-      <w:numFmt w:val="decimal"/>
-      <w:lvlText w:val="%5."/>
-      <w:lvlJc w:val="left"/>
-      <w:pPr>
-        <w:tabs>
-          <w:tab w:val="num" w:pos="3600"/>
-        </w:tabs>
-        <w:ind w:left="3600" w:hanging="360"/>
-      </w:pPr>
-    </w:lvl>
-    <w:lvl w:ilvl="5" w:tentative="1">
-      <w:start w:val="1"/>
-      <w:numFmt w:val="decimal"/>
-      <w:lvlText w:val="%6."/>
-      <w:lvlJc w:val="left"/>
-      <w:pPr>
-        <w:tabs>
-          <w:tab w:val="num" w:pos="4320"/>
-        </w:tabs>
-        <w:ind w:left="4320" w:hanging="360"/>
-      </w:pPr>
-    </w:lvl>
-    <w:lvl w:ilvl="6" w:tentative="1">
-      <w:start w:val="1"/>
-      <w:numFmt w:val="decimal"/>
-      <w:lvlText w:val="%7."/>
-      <w:lvlJc w:val="left"/>
-      <w:pPr>
-        <w:tabs>
-          <w:tab w:val="num" w:pos="5040"/>
-        </w:tabs>
-        <w:ind w:left="5040" w:hanging="360"/>
-      </w:pPr>
-    </w:lvl>
-    <w:lvl w:ilvl="7" w:tentative="1">
-      <w:start w:val="1"/>
-      <w:numFmt w:val="decimal"/>
-      <w:lvlText w:val="%8."/>
-      <w:lvlJc w:val="left"/>
-      <w:pPr>
-        <w:tabs>
-          <w:tab w:val="num" w:pos="5760"/>
-        </w:tabs>
-        <w:ind w:left="5760" w:hanging="360"/>
-      </w:pPr>
-    </w:lvl>
-    <w:lvl w:ilvl="8" w:tentative="1">
-      <w:start w:val="1"/>
-      <w:numFmt w:val="decimal"/>
-      <w:lvlText w:val="%9."/>
-      <w:lvlJc w:val="left"/>
-      <w:pPr>
-        <w:tabs>
-          <w:tab w:val="num" w:pos="6480"/>
-        </w:tabs>
-        <w:ind w:left="6480" w:hanging="360"/>
-      </w:pPr>
-    </w:lvl>
-  </w:abstractNum>
-  <w:abstractNum w:abstractNumId="24" w15:restartNumberingAfterBreak="0">
-    <w:nsid w:val="4E793A92"/>
-    <w:multiLevelType w:val="multilevel"/>
-    <w:tmpl w:val="74149348"/>
+    <w:tmpl w:val="DF4AA4A8"/>
     <w:lvl w:ilvl="0">
       <w:start w:val="1"/>
       <w:numFmt w:val="decimal"/>
@@ -14017,9 +14017,235 @@
     </w:lvl>
   </w:abstractNum>
   <w:abstractNum w:abstractNumId="25" w15:restartNumberingAfterBreak="0">
-    <w:nsid w:val="4EFE3DAB"/>
+    <w:nsid w:val="5AAA7665"/>
     <w:multiLevelType w:val="multilevel"/>
-    <w:tmpl w:val="F634B7A2"/>
+    <w:tmpl w:val="BBDEA7E0"/>
+    <w:lvl w:ilvl="0">
+      <w:start w:val="1"/>
+      <w:numFmt w:val="decimal"/>
+      <w:lvlText w:val="%1."/>
+      <w:lvlJc w:val="left"/>
+      <w:pPr>
+        <w:tabs>
+          <w:tab w:val="num" w:pos="720"/>
+        </w:tabs>
+        <w:ind w:left="720" w:hanging="360"/>
+      </w:pPr>
+    </w:lvl>
+    <w:lvl w:ilvl="1" w:tentative="1">
+      <w:start w:val="1"/>
+      <w:numFmt w:val="decimal"/>
+      <w:lvlText w:val="%2."/>
+      <w:lvlJc w:val="left"/>
+      <w:pPr>
+        <w:tabs>
+          <w:tab w:val="num" w:pos="1440"/>
+        </w:tabs>
+        <w:ind w:left="1440" w:hanging="360"/>
+      </w:pPr>
+    </w:lvl>
+    <w:lvl w:ilvl="2" w:tentative="1">
+      <w:start w:val="1"/>
+      <w:numFmt w:val="decimal"/>
+      <w:lvlText w:val="%3."/>
+      <w:lvlJc w:val="left"/>
+      <w:pPr>
+        <w:tabs>
+          <w:tab w:val="num" w:pos="2160"/>
+        </w:tabs>
+        <w:ind w:left="2160" w:hanging="360"/>
+      </w:pPr>
+    </w:lvl>
+    <w:lvl w:ilvl="3" w:tentative="1">
+      <w:start w:val="1"/>
+      <w:numFmt w:val="decimal"/>
+      <w:lvlText w:val="%4."/>
+      <w:lvlJc w:val="left"/>
+      <w:pPr>
+        <w:tabs>
+          <w:tab w:val="num" w:pos="2880"/>
+        </w:tabs>
+        <w:ind w:left="2880" w:hanging="360"/>
+      </w:pPr>
+    </w:lvl>
+    <w:lvl w:ilvl="4" w:tentative="1">
+      <w:start w:val="1"/>
+      <w:numFmt w:val="decimal"/>
+      <w:lvlText w:val="%5."/>
+      <w:lvlJc w:val="left"/>
+      <w:pPr>
+        <w:tabs>
+          <w:tab w:val="num" w:pos="3600"/>
+        </w:tabs>
+        <w:ind w:left="3600" w:hanging="360"/>
+      </w:pPr>
+    </w:lvl>
+    <w:lvl w:ilvl="5" w:tentative="1">
+      <w:start w:val="1"/>
+      <w:numFmt w:val="decimal"/>
+      <w:lvlText w:val="%6."/>
+      <w:lvlJc w:val="left"/>
+      <w:pPr>
+        <w:tabs>
+          <w:tab w:val="num" w:pos="4320"/>
+        </w:tabs>
+        <w:ind w:left="4320" w:hanging="360"/>
+      </w:pPr>
+    </w:lvl>
+    <w:lvl w:ilvl="6" w:tentative="1">
+      <w:start w:val="1"/>
+      <w:numFmt w:val="decimal"/>
+      <w:lvlText w:val="%7."/>
+      <w:lvlJc w:val="left"/>
+      <w:pPr>
+        <w:tabs>
+          <w:tab w:val="num" w:pos="5040"/>
+        </w:tabs>
+        <w:ind w:left="5040" w:hanging="360"/>
+      </w:pPr>
+    </w:lvl>
+    <w:lvl w:ilvl="7" w:tentative="1">
+      <w:start w:val="1"/>
+      <w:numFmt w:val="decimal"/>
+      <w:lvlText w:val="%8."/>
+      <w:lvlJc w:val="left"/>
+      <w:pPr>
+        <w:tabs>
+          <w:tab w:val="num" w:pos="5760"/>
+        </w:tabs>
+        <w:ind w:left="5760" w:hanging="360"/>
+      </w:pPr>
+    </w:lvl>
+    <w:lvl w:ilvl="8" w:tentative="1">
+      <w:start w:val="1"/>
+      <w:numFmt w:val="decimal"/>
+      <w:lvlText w:val="%9."/>
+      <w:lvlJc w:val="left"/>
+      <w:pPr>
+        <w:tabs>
+          <w:tab w:val="num" w:pos="6480"/>
+        </w:tabs>
+        <w:ind w:left="6480" w:hanging="360"/>
+      </w:pPr>
+    </w:lvl>
+  </w:abstractNum>
+  <w:abstractNum w:abstractNumId="26" w15:restartNumberingAfterBreak="0">
+    <w:nsid w:val="5D5725E7"/>
+    <w:multiLevelType w:val="multilevel"/>
+    <w:tmpl w:val="8FD43D70"/>
+    <w:lvl w:ilvl="0">
+      <w:start w:val="1"/>
+      <w:numFmt w:val="decimal"/>
+      <w:lvlText w:val="%1."/>
+      <w:lvlJc w:val="left"/>
+      <w:pPr>
+        <w:tabs>
+          <w:tab w:val="num" w:pos="720"/>
+        </w:tabs>
+        <w:ind w:left="720" w:hanging="360"/>
+      </w:pPr>
+    </w:lvl>
+    <w:lvl w:ilvl="1" w:tentative="1">
+      <w:start w:val="1"/>
+      <w:numFmt w:val="decimal"/>
+      <w:lvlText w:val="%2."/>
+      <w:lvlJc w:val="left"/>
+      <w:pPr>
+        <w:tabs>
+          <w:tab w:val="num" w:pos="1440"/>
+        </w:tabs>
+        <w:ind w:left="1440" w:hanging="360"/>
+      </w:pPr>
+    </w:lvl>
+    <w:lvl w:ilvl="2" w:tentative="1">
+      <w:start w:val="1"/>
+      <w:numFmt w:val="decimal"/>
+      <w:lvlText w:val="%3."/>
+      <w:lvlJc w:val="left"/>
+      <w:pPr>
+        <w:tabs>
+          <w:tab w:val="num" w:pos="2160"/>
+        </w:tabs>
+        <w:ind w:left="2160" w:hanging="360"/>
+      </w:pPr>
+    </w:lvl>
+    <w:lvl w:ilvl="3" w:tentative="1">
+      <w:start w:val="1"/>
+      <w:numFmt w:val="decimal"/>
+      <w:lvlText w:val="%4."/>
+      <w:lvlJc w:val="left"/>
+      <w:pPr>
+        <w:tabs>
+          <w:tab w:val="num" w:pos="2880"/>
+        </w:tabs>
+        <w:ind w:left="2880" w:hanging="360"/>
+      </w:pPr>
+    </w:lvl>
+    <w:lvl w:ilvl="4" w:tentative="1">
+      <w:start w:val="1"/>
+      <w:numFmt w:val="decimal"/>
+      <w:lvlText w:val="%5."/>
+      <w:lvlJc w:val="left"/>
+      <w:pPr>
+        <w:tabs>
+          <w:tab w:val="num" w:pos="3600"/>
+        </w:tabs>
+        <w:ind w:left="3600" w:hanging="360"/>
+      </w:pPr>
+    </w:lvl>
+    <w:lvl w:ilvl="5" w:tentative="1">
+      <w:start w:val="1"/>
+      <w:numFmt w:val="decimal"/>
+      <w:lvlText w:val="%6."/>
+      <w:lvlJc w:val="left"/>
+      <w:pPr>
+        <w:tabs>
+          <w:tab w:val="num" w:pos="4320"/>
+        </w:tabs>
+        <w:ind w:left="4320" w:hanging="360"/>
+      </w:pPr>
+    </w:lvl>
+    <w:lvl w:ilvl="6" w:tentative="1">
+      <w:start w:val="1"/>
+      <w:numFmt w:val="decimal"/>
+      <w:lvlText w:val="%7."/>
+      <w:lvlJc w:val="left"/>
+      <w:pPr>
+        <w:tabs>
+          <w:tab w:val="num" w:pos="5040"/>
+        </w:tabs>
+        <w:ind w:left="5040" w:hanging="360"/>
+      </w:pPr>
+    </w:lvl>
+    <w:lvl w:ilvl="7" w:tentative="1">
+      <w:start w:val="1"/>
+      <w:numFmt w:val="decimal"/>
+      <w:lvlText w:val="%8."/>
+      <w:lvlJc w:val="left"/>
+      <w:pPr>
+        <w:tabs>
+          <w:tab w:val="num" w:pos="5760"/>
+        </w:tabs>
+        <w:ind w:left="5760" w:hanging="360"/>
+      </w:pPr>
+    </w:lvl>
+    <w:lvl w:ilvl="8" w:tentative="1">
+      <w:start w:val="1"/>
+      <w:numFmt w:val="decimal"/>
+      <w:lvlText w:val="%9."/>
+      <w:lvlJc w:val="left"/>
+      <w:pPr>
+        <w:tabs>
+          <w:tab w:val="num" w:pos="6480"/>
+        </w:tabs>
+        <w:ind w:left="6480" w:hanging="360"/>
+      </w:pPr>
+    </w:lvl>
+  </w:abstractNum>
+  <w:abstractNum w:abstractNumId="27" w15:restartNumberingAfterBreak="0">
+    <w:nsid w:val="5DBB1689"/>
+    <w:multiLevelType w:val="multilevel"/>
+    <w:tmpl w:val="96E07C9E"/>
     <w:lvl w:ilvl="0">
       <w:start w:val="1"/>
       <w:numFmt w:val="bullet"/>
@@ -14165,236 +14391,10 @@
       </w:rPr>
     </w:lvl>
   </w:abstractNum>
-  <w:abstractNum w:abstractNumId="26" w15:restartNumberingAfterBreak="0">
-    <w:nsid w:val="50076EB8"/>
+  <w:abstractNum w:abstractNumId="28" w15:restartNumberingAfterBreak="0">
+    <w:nsid w:val="659E31E2"/>
     <w:multiLevelType w:val="multilevel"/>
-    <w:tmpl w:val="BD38AB06"/>
-    <w:lvl w:ilvl="0">
-      <w:start w:val="1"/>
-      <w:numFmt w:val="decimal"/>
-      <w:lvlText w:val="%1."/>
-      <w:lvlJc w:val="left"/>
-      <w:pPr>
-        <w:tabs>
-          <w:tab w:val="num" w:pos="720"/>
-        </w:tabs>
-        <w:ind w:left="720" w:hanging="360"/>
-      </w:pPr>
-    </w:lvl>
-    <w:lvl w:ilvl="1" w:tentative="1">
-      <w:start w:val="1"/>
-      <w:numFmt w:val="decimal"/>
-      <w:lvlText w:val="%2."/>
-      <w:lvlJc w:val="left"/>
-      <w:pPr>
-        <w:tabs>
-          <w:tab w:val="num" w:pos="1440"/>
-        </w:tabs>
-        <w:ind w:left="1440" w:hanging="360"/>
-      </w:pPr>
-    </w:lvl>
-    <w:lvl w:ilvl="2" w:tentative="1">
-      <w:start w:val="1"/>
-      <w:numFmt w:val="decimal"/>
-      <w:lvlText w:val="%3."/>
-      <w:lvlJc w:val="left"/>
-      <w:pPr>
-        <w:tabs>
-          <w:tab w:val="num" w:pos="2160"/>
-        </w:tabs>
-        <w:ind w:left="2160" w:hanging="360"/>
-      </w:pPr>
-    </w:lvl>
-    <w:lvl w:ilvl="3" w:tentative="1">
-      <w:start w:val="1"/>
-      <w:numFmt w:val="decimal"/>
-      <w:lvlText w:val="%4."/>
-      <w:lvlJc w:val="left"/>
-      <w:pPr>
-        <w:tabs>
-          <w:tab w:val="num" w:pos="2880"/>
-        </w:tabs>
-        <w:ind w:left="2880" w:hanging="360"/>
-      </w:pPr>
-    </w:lvl>
-    <w:lvl w:ilvl="4" w:tentative="1">
-      <w:start w:val="1"/>
-      <w:numFmt w:val="decimal"/>
-      <w:lvlText w:val="%5."/>
-      <w:lvlJc w:val="left"/>
-      <w:pPr>
-        <w:tabs>
-          <w:tab w:val="num" w:pos="3600"/>
-        </w:tabs>
-        <w:ind w:left="3600" w:hanging="360"/>
-      </w:pPr>
-    </w:lvl>
-    <w:lvl w:ilvl="5" w:tentative="1">
-      <w:start w:val="1"/>
-      <w:numFmt w:val="decimal"/>
-      <w:lvlText w:val="%6."/>
-      <w:lvlJc w:val="left"/>
-      <w:pPr>
-        <w:tabs>
-          <w:tab w:val="num" w:pos="4320"/>
-        </w:tabs>
-        <w:ind w:left="4320" w:hanging="360"/>
-      </w:pPr>
-    </w:lvl>
-    <w:lvl w:ilvl="6" w:tentative="1">
-      <w:start w:val="1"/>
-      <w:numFmt w:val="decimal"/>
-      <w:lvlText w:val="%7."/>
-      <w:lvlJc w:val="left"/>
-      <w:pPr>
-        <w:tabs>
-          <w:tab w:val="num" w:pos="5040"/>
-        </w:tabs>
-        <w:ind w:left="5040" w:hanging="360"/>
-      </w:pPr>
-    </w:lvl>
-    <w:lvl w:ilvl="7" w:tentative="1">
-      <w:start w:val="1"/>
-      <w:numFmt w:val="decimal"/>
-      <w:lvlText w:val="%8."/>
-      <w:lvlJc w:val="left"/>
-      <w:pPr>
-        <w:tabs>
-          <w:tab w:val="num" w:pos="5760"/>
-        </w:tabs>
-        <w:ind w:left="5760" w:hanging="360"/>
-      </w:pPr>
-    </w:lvl>
-    <w:lvl w:ilvl="8" w:tentative="1">
-      <w:start w:val="1"/>
-      <w:numFmt w:val="decimal"/>
-      <w:lvlText w:val="%9."/>
-      <w:lvlJc w:val="left"/>
-      <w:pPr>
-        <w:tabs>
-          <w:tab w:val="num" w:pos="6480"/>
-        </w:tabs>
-        <w:ind w:left="6480" w:hanging="360"/>
-      </w:pPr>
-    </w:lvl>
-  </w:abstractNum>
-  <w:abstractNum w:abstractNumId="27" w15:restartNumberingAfterBreak="0">
-    <w:nsid w:val="5162637D"/>
-    <w:multiLevelType w:val="multilevel"/>
-    <w:tmpl w:val="05FCE456"/>
-    <w:lvl w:ilvl="0">
-      <w:start w:val="1"/>
-      <w:numFmt w:val="decimal"/>
-      <w:lvlText w:val="%1."/>
-      <w:lvlJc w:val="left"/>
-      <w:pPr>
-        <w:tabs>
-          <w:tab w:val="num" w:pos="720"/>
-        </w:tabs>
-        <w:ind w:left="720" w:hanging="360"/>
-      </w:pPr>
-    </w:lvl>
-    <w:lvl w:ilvl="1" w:tentative="1">
-      <w:start w:val="1"/>
-      <w:numFmt w:val="decimal"/>
-      <w:lvlText w:val="%2."/>
-      <w:lvlJc w:val="left"/>
-      <w:pPr>
-        <w:tabs>
-          <w:tab w:val="num" w:pos="1440"/>
-        </w:tabs>
-        <w:ind w:left="1440" w:hanging="360"/>
-      </w:pPr>
-    </w:lvl>
-    <w:lvl w:ilvl="2" w:tentative="1">
-      <w:start w:val="1"/>
-      <w:numFmt w:val="decimal"/>
-      <w:lvlText w:val="%3."/>
-      <w:lvlJc w:val="left"/>
-      <w:pPr>
-        <w:tabs>
-          <w:tab w:val="num" w:pos="2160"/>
-        </w:tabs>
-        <w:ind w:left="2160" w:hanging="360"/>
-      </w:pPr>
-    </w:lvl>
-    <w:lvl w:ilvl="3" w:tentative="1">
-      <w:start w:val="1"/>
-      <w:numFmt w:val="decimal"/>
-      <w:lvlText w:val="%4."/>
-      <w:lvlJc w:val="left"/>
-      <w:pPr>
-        <w:tabs>
-          <w:tab w:val="num" w:pos="2880"/>
-        </w:tabs>
-        <w:ind w:left="2880" w:hanging="360"/>
-      </w:pPr>
-    </w:lvl>
-    <w:lvl w:ilvl="4" w:tentative="1">
-      <w:start w:val="1"/>
-      <w:numFmt w:val="decimal"/>
-      <w:lvlText w:val="%5."/>
-      <w:lvlJc w:val="left"/>
-      <w:pPr>
-        <w:tabs>
-          <w:tab w:val="num" w:pos="3600"/>
-        </w:tabs>
-        <w:ind w:left="3600" w:hanging="360"/>
-      </w:pPr>
-    </w:lvl>
-    <w:lvl w:ilvl="5" w:tentative="1">
-      <w:start w:val="1"/>
-      <w:numFmt w:val="decimal"/>
-      <w:lvlText w:val="%6."/>
-      <w:lvlJc w:val="left"/>
-      <w:pPr>
-        <w:tabs>
-          <w:tab w:val="num" w:pos="4320"/>
-        </w:tabs>
-        <w:ind w:left="4320" w:hanging="360"/>
-      </w:pPr>
-    </w:lvl>
-    <w:lvl w:ilvl="6" w:tentative="1">
-      <w:start w:val="1"/>
-      <w:numFmt w:val="decimal"/>
-      <w:lvlText w:val="%7."/>
-      <w:lvlJc w:val="left"/>
-      <w:pPr>
-        <w:tabs>
-          <w:tab w:val="num" w:pos="5040"/>
-        </w:tabs>
-        <w:ind w:left="5040" w:hanging="360"/>
-      </w:pPr>
-    </w:lvl>
-    <w:lvl w:ilvl="7" w:tentative="1">
-      <w:start w:val="1"/>
-      <w:numFmt w:val="decimal"/>
-      <w:lvlText w:val="%8."/>
-      <w:lvlJc w:val="left"/>
-      <w:pPr>
-        <w:tabs>
-          <w:tab w:val="num" w:pos="5760"/>
-        </w:tabs>
-        <w:ind w:left="5760" w:hanging="360"/>
-      </w:pPr>
-    </w:lvl>
-    <w:lvl w:ilvl="8" w:tentative="1">
-      <w:start w:val="1"/>
-      <w:numFmt w:val="decimal"/>
-      <w:lvlText w:val="%9."/>
-      <w:lvlJc w:val="left"/>
-      <w:pPr>
-        <w:tabs>
-          <w:tab w:val="num" w:pos="6480"/>
-        </w:tabs>
-        <w:ind w:left="6480" w:hanging="360"/>
-      </w:pPr>
-    </w:lvl>
-  </w:abstractNum>
-  <w:abstractNum w:abstractNumId="28" w15:restartNumberingAfterBreak="0">
-    <w:nsid w:val="54C13B82"/>
-    <w:multiLevelType w:val="multilevel"/>
-    <w:tmpl w:val="3EF6B774"/>
+    <w:tmpl w:val="CAAA988A"/>
     <w:lvl w:ilvl="0">
       <w:start w:val="1"/>
       <w:numFmt w:val="decimal"/>
@@ -14505,9 +14505,9 @@
     </w:lvl>
   </w:abstractNum>
   <w:abstractNum w:abstractNumId="29" w15:restartNumberingAfterBreak="0">
-    <w:nsid w:val="58B30EBD"/>
+    <w:nsid w:val="66E524A8"/>
     <w:multiLevelType w:val="multilevel"/>
-    <w:tmpl w:val="54FA55F8"/>
+    <w:tmpl w:val="E80831CC"/>
     <w:lvl w:ilvl="0">
       <w:start w:val="1"/>
       <w:numFmt w:val="bullet"/>
@@ -14654,9 +14654,122 @@
     </w:lvl>
   </w:abstractNum>
   <w:abstractNum w:abstractNumId="30" w15:restartNumberingAfterBreak="0">
-    <w:nsid w:val="5BD011A1"/>
+    <w:nsid w:val="689901A4"/>
     <w:multiLevelType w:val="multilevel"/>
-    <w:tmpl w:val="EAA45946"/>
+    <w:tmpl w:val="4412CDEC"/>
+    <w:lvl w:ilvl="0">
+      <w:start w:val="1"/>
+      <w:numFmt w:val="decimal"/>
+      <w:lvlText w:val="%1."/>
+      <w:lvlJc w:val="left"/>
+      <w:pPr>
+        <w:tabs>
+          <w:tab w:val="num" w:pos="720"/>
+        </w:tabs>
+        <w:ind w:left="720" w:hanging="360"/>
+      </w:pPr>
+    </w:lvl>
+    <w:lvl w:ilvl="1" w:tentative="1">
+      <w:start w:val="1"/>
+      <w:numFmt w:val="decimal"/>
+      <w:lvlText w:val="%2."/>
+      <w:lvlJc w:val="left"/>
+      <w:pPr>
+        <w:tabs>
+          <w:tab w:val="num" w:pos="1440"/>
+        </w:tabs>
+        <w:ind w:left="1440" w:hanging="360"/>
+      </w:pPr>
+    </w:lvl>
+    <w:lvl w:ilvl="2" w:tentative="1">
+      <w:start w:val="1"/>
+      <w:numFmt w:val="decimal"/>
+      <w:lvlText w:val="%3."/>
+      <w:lvlJc w:val="left"/>
+      <w:pPr>
+        <w:tabs>
+          <w:tab w:val="num" w:pos="2160"/>
+        </w:tabs>
+        <w:ind w:left="2160" w:hanging="360"/>
+      </w:pPr>
+    </w:lvl>
+    <w:lvl w:ilvl="3" w:tentative="1">
+      <w:start w:val="1"/>
+      <w:numFmt w:val="decimal"/>
+      <w:lvlText w:val="%4."/>
+      <w:lvlJc w:val="left"/>
+      <w:pPr>
+        <w:tabs>
+          <w:tab w:val="num" w:pos="2880"/>
+        </w:tabs>
+        <w:ind w:left="2880" w:hanging="360"/>
+      </w:pPr>
+    </w:lvl>
+    <w:lvl w:ilvl="4" w:tentative="1">
+      <w:start w:val="1"/>
+      <w:numFmt w:val="decimal"/>
+      <w:lvlText w:val="%5."/>
+      <w:lvlJc w:val="left"/>
+      <w:pPr>
+        <w:tabs>
+          <w:tab w:val="num" w:pos="3600"/>
+        </w:tabs>
+        <w:ind w:left="3600" w:hanging="360"/>
+      </w:pPr>
+    </w:lvl>
+    <w:lvl w:ilvl="5" w:tentative="1">
+      <w:start w:val="1"/>
+      <w:numFmt w:val="decimal"/>
+      <w:lvlText w:val="%6."/>
+      <w:lvlJc w:val="left"/>
+      <w:pPr>
+        <w:tabs>
+          <w:tab w:val="num" w:pos="4320"/>
+        </w:tabs>
+        <w:ind w:left="4320" w:hanging="360"/>
+      </w:pPr>
+    </w:lvl>
+    <w:lvl w:ilvl="6" w:tentative="1">
+      <w:start w:val="1"/>
+      <w:numFmt w:val="decimal"/>
+      <w:lvlText w:val="%7."/>
+      <w:lvlJc w:val="left"/>
+      <w:pPr>
+        <w:tabs>
+          <w:tab w:val="num" w:pos="5040"/>
+        </w:tabs>
+        <w:ind w:left="5040" w:hanging="360"/>
+      </w:pPr>
+    </w:lvl>
+    <w:lvl w:ilvl="7" w:tentative="1">
+      <w:start w:val="1"/>
+      <w:numFmt w:val="decimal"/>
+      <w:lvlText w:val="%8."/>
+      <w:lvlJc w:val="left"/>
+      <w:pPr>
+        <w:tabs>
+          <w:tab w:val="num" w:pos="5760"/>
+        </w:tabs>
+        <w:ind w:left="5760" w:hanging="360"/>
+      </w:pPr>
+    </w:lvl>
+    <w:lvl w:ilvl="8" w:tentative="1">
+      <w:start w:val="1"/>
+      <w:numFmt w:val="decimal"/>
+      <w:lvlText w:val="%9."/>
+      <w:lvlJc w:val="left"/>
+      <w:pPr>
+        <w:tabs>
+          <w:tab w:val="num" w:pos="6480"/>
+        </w:tabs>
+        <w:ind w:left="6480" w:hanging="360"/>
+      </w:pPr>
+    </w:lvl>
+  </w:abstractNum>
+  <w:abstractNum w:abstractNumId="31" w15:restartNumberingAfterBreak="0">
+    <w:nsid w:val="69D970C2"/>
+    <w:multiLevelType w:val="multilevel"/>
+    <w:tmpl w:val="1B968DEE"/>
     <w:lvl w:ilvl="0">
       <w:start w:val="1"/>
       <w:numFmt w:val="bullet"/>
@@ -14802,123 +14915,10 @@
       </w:rPr>
     </w:lvl>
   </w:abstractNum>
-  <w:abstractNum w:abstractNumId="31" w15:restartNumberingAfterBreak="0">
-    <w:nsid w:val="60F85B77"/>
+  <w:abstractNum w:abstractNumId="32" w15:restartNumberingAfterBreak="0">
+    <w:nsid w:val="6A31357A"/>
     <w:multiLevelType w:val="multilevel"/>
-    <w:tmpl w:val="4AB0D4D2"/>
-    <w:lvl w:ilvl="0">
-      <w:start w:val="1"/>
-      <w:numFmt w:val="decimal"/>
-      <w:lvlText w:val="%1."/>
-      <w:lvlJc w:val="left"/>
-      <w:pPr>
-        <w:tabs>
-          <w:tab w:val="num" w:pos="720"/>
-        </w:tabs>
-        <w:ind w:left="720" w:hanging="360"/>
-      </w:pPr>
-    </w:lvl>
-    <w:lvl w:ilvl="1" w:tentative="1">
-      <w:start w:val="1"/>
-      <w:numFmt w:val="decimal"/>
-      <w:lvlText w:val="%2."/>
-      <w:lvlJc w:val="left"/>
-      <w:pPr>
-        <w:tabs>
-          <w:tab w:val="num" w:pos="1440"/>
-        </w:tabs>
-        <w:ind w:left="1440" w:hanging="360"/>
-      </w:pPr>
-    </w:lvl>
-    <w:lvl w:ilvl="2" w:tentative="1">
-      <w:start w:val="1"/>
-      <w:numFmt w:val="decimal"/>
-      <w:lvlText w:val="%3."/>
-      <w:lvlJc w:val="left"/>
-      <w:pPr>
-        <w:tabs>
-          <w:tab w:val="num" w:pos="2160"/>
-        </w:tabs>
-        <w:ind w:left="2160" w:hanging="360"/>
-      </w:pPr>
-    </w:lvl>
-    <w:lvl w:ilvl="3" w:tentative="1">
-      <w:start w:val="1"/>
-      <w:numFmt w:val="decimal"/>
-      <w:lvlText w:val="%4."/>
-      <w:lvlJc w:val="left"/>
-      <w:pPr>
-        <w:tabs>
-          <w:tab w:val="num" w:pos="2880"/>
-        </w:tabs>
-        <w:ind w:left="2880" w:hanging="360"/>
-      </w:pPr>
-    </w:lvl>
-    <w:lvl w:ilvl="4" w:tentative="1">
-      <w:start w:val="1"/>
-      <w:numFmt w:val="decimal"/>
-      <w:lvlText w:val="%5."/>
-      <w:lvlJc w:val="left"/>
-      <w:pPr>
-        <w:tabs>
-          <w:tab w:val="num" w:pos="3600"/>
-        </w:tabs>
-        <w:ind w:left="3600" w:hanging="360"/>
-      </w:pPr>
-    </w:lvl>
-    <w:lvl w:ilvl="5" w:tentative="1">
-      <w:start w:val="1"/>
-      <w:numFmt w:val="decimal"/>
-      <w:lvlText w:val="%6."/>
-      <w:lvlJc w:val="left"/>
-      <w:pPr>
-        <w:tabs>
-          <w:tab w:val="num" w:pos="4320"/>
-        </w:tabs>
-        <w:ind w:left="4320" w:hanging="360"/>
-      </w:pPr>
-    </w:lvl>
-    <w:lvl w:ilvl="6" w:tentative="1">
-      <w:start w:val="1"/>
-      <w:numFmt w:val="decimal"/>
-      <w:lvlText w:val="%7."/>
-      <w:lvlJc w:val="left"/>
-      <w:pPr>
-        <w:tabs>
-          <w:tab w:val="num" w:pos="5040"/>
-        </w:tabs>
-        <w:ind w:left="5040" w:hanging="360"/>
-      </w:pPr>
-    </w:lvl>
-    <w:lvl w:ilvl="7" w:tentative="1">
-      <w:start w:val="1"/>
-      <w:numFmt w:val="decimal"/>
-      <w:lvlText w:val="%8."/>
-      <w:lvlJc w:val="left"/>
-      <w:pPr>
-        <w:tabs>
-          <w:tab w:val="num" w:pos="5760"/>
-        </w:tabs>
-        <w:ind w:left="5760" w:hanging="360"/>
-      </w:pPr>
-    </w:lvl>
-    <w:lvl w:ilvl="8" w:tentative="1">
-      <w:start w:val="1"/>
-      <w:numFmt w:val="decimal"/>
-      <w:lvlText w:val="%9."/>
-      <w:lvlJc w:val="left"/>
-      <w:pPr>
-        <w:tabs>
-          <w:tab w:val="num" w:pos="6480"/>
-        </w:tabs>
-        <w:ind w:left="6480" w:hanging="360"/>
-      </w:pPr>
-    </w:lvl>
-  </w:abstractNum>
-  <w:abstractNum w:abstractNumId="32" w15:restartNumberingAfterBreak="0">
-    <w:nsid w:val="66267DC9"/>
-    <w:multiLevelType w:val="multilevel"/>
-    <w:tmpl w:val="D60042DA"/>
+    <w:tmpl w:val="9616607A"/>
     <w:lvl w:ilvl="0">
       <w:start w:val="1"/>
       <w:numFmt w:val="decimal"/>
@@ -15029,9 +15029,9 @@
     </w:lvl>
   </w:abstractNum>
   <w:abstractNum w:abstractNumId="33" w15:restartNumberingAfterBreak="0">
-    <w:nsid w:val="67976149"/>
+    <w:nsid w:val="6CCE5E06"/>
     <w:multiLevelType w:val="multilevel"/>
-    <w:tmpl w:val="F872B336"/>
+    <w:tmpl w:val="B3FC4210"/>
     <w:lvl w:ilvl="0">
       <w:start w:val="1"/>
       <w:numFmt w:val="decimal"/>
@@ -15142,9 +15142,9 @@
     </w:lvl>
   </w:abstractNum>
   <w:abstractNum w:abstractNumId="34" w15:restartNumberingAfterBreak="0">
-    <w:nsid w:val="6F402D4E"/>
+    <w:nsid w:val="72335839"/>
     <w:multiLevelType w:val="multilevel"/>
-    <w:tmpl w:val="AD8444AA"/>
+    <w:tmpl w:val="9A7ABC88"/>
     <w:lvl w:ilvl="0">
       <w:start w:val="1"/>
       <w:numFmt w:val="decimal"/>
@@ -15255,9 +15255,9 @@
     </w:lvl>
   </w:abstractNum>
   <w:abstractNum w:abstractNumId="35" w15:restartNumberingAfterBreak="0">
-    <w:nsid w:val="734D26DB"/>
+    <w:nsid w:val="7237763A"/>
     <w:multiLevelType w:val="multilevel"/>
-    <w:tmpl w:val="9B7423A8"/>
+    <w:tmpl w:val="BD920148"/>
     <w:lvl w:ilvl="0">
       <w:start w:val="1"/>
       <w:numFmt w:val="decimal"/>
@@ -15368,9 +15368,9 @@
     </w:lvl>
   </w:abstractNum>
   <w:abstractNum w:abstractNumId="36" w15:restartNumberingAfterBreak="0">
-    <w:nsid w:val="7350110F"/>
+    <w:nsid w:val="74D134FB"/>
     <w:multiLevelType w:val="multilevel"/>
-    <w:tmpl w:val="427015EE"/>
+    <w:tmpl w:val="A0D242C0"/>
     <w:lvl w:ilvl="0">
       <w:start w:val="1"/>
       <w:numFmt w:val="decimal"/>
@@ -15481,9 +15481,9 @@
     </w:lvl>
   </w:abstractNum>
   <w:abstractNum w:abstractNumId="37" w15:restartNumberingAfterBreak="0">
-    <w:nsid w:val="75353C5A"/>
+    <w:nsid w:val="75045E27"/>
     <w:multiLevelType w:val="multilevel"/>
-    <w:tmpl w:val="1A6056A4"/>
+    <w:tmpl w:val="97BEE092"/>
     <w:lvl w:ilvl="0">
       <w:start w:val="1"/>
       <w:numFmt w:val="bullet"/>
@@ -15630,9 +15630,9 @@
     </w:lvl>
   </w:abstractNum>
   <w:abstractNum w:abstractNumId="38" w15:restartNumberingAfterBreak="0">
-    <w:nsid w:val="75813190"/>
+    <w:nsid w:val="75674ACC"/>
     <w:multiLevelType w:val="multilevel"/>
-    <w:tmpl w:val="53323012"/>
+    <w:tmpl w:val="4D4A906E"/>
     <w:lvl w:ilvl="0">
       <w:start w:val="1"/>
       <w:numFmt w:val="decimal"/>
@@ -15743,9 +15743,9 @@
     </w:lvl>
   </w:abstractNum>
   <w:abstractNum w:abstractNumId="39" w15:restartNumberingAfterBreak="0">
-    <w:nsid w:val="77A671B8"/>
+    <w:nsid w:val="77651F6D"/>
     <w:multiLevelType w:val="multilevel"/>
-    <w:tmpl w:val="D778C6AE"/>
+    <w:tmpl w:val="BEA8B528"/>
     <w:lvl w:ilvl="0">
       <w:start w:val="1"/>
       <w:numFmt w:val="decimal"/>
@@ -15856,9 +15856,9 @@
     </w:lvl>
   </w:abstractNum>
   <w:abstractNum w:abstractNumId="40" w15:restartNumberingAfterBreak="0">
-    <w:nsid w:val="7891156B"/>
+    <w:nsid w:val="7A4501A9"/>
     <w:multiLevelType w:val="multilevel"/>
-    <w:tmpl w:val="BB12445E"/>
+    <w:tmpl w:val="BF26BFF8"/>
     <w:lvl w:ilvl="0">
       <w:start w:val="1"/>
       <w:numFmt w:val="decimal"/>
@@ -15969,9 +15969,9 @@
     </w:lvl>
   </w:abstractNum>
   <w:abstractNum w:abstractNumId="41" w15:restartNumberingAfterBreak="0">
-    <w:nsid w:val="7D1C6033"/>
+    <w:nsid w:val="7CF35B6F"/>
     <w:multiLevelType w:val="multilevel"/>
-    <w:tmpl w:val="7F46067C"/>
+    <w:tmpl w:val="F432BDD8"/>
     <w:lvl w:ilvl="0">
       <w:start w:val="1"/>
       <w:numFmt w:val="decimal"/>
@@ -16081,131 +16081,131 @@
       </w:pPr>
     </w:lvl>
   </w:abstractNum>
-  <w:num w:numId="1" w16cid:durableId="618335905">
+  <w:num w:numId="1" w16cid:durableId="1314719284">
     <w:abstractNumId w:val="0"/>
   </w:num>
-  <w:num w:numId="2" w16cid:durableId="569197395">
+  <w:num w:numId="2" w16cid:durableId="2035962587">
+    <w:abstractNumId w:val="12"/>
+  </w:num>
+  <w:num w:numId="3" w16cid:durableId="949630115">
+    <w:abstractNumId w:val="31"/>
+  </w:num>
+  <w:num w:numId="4" w16cid:durableId="758522267">
+    <w:abstractNumId w:val="21"/>
+  </w:num>
+  <w:num w:numId="5" w16cid:durableId="755131131">
+    <w:abstractNumId w:val="27"/>
+  </w:num>
+  <w:num w:numId="6" w16cid:durableId="1116944712">
+    <w:abstractNumId w:val="22"/>
+  </w:num>
+  <w:num w:numId="7" w16cid:durableId="1013846406">
+    <w:abstractNumId w:val="20"/>
+  </w:num>
+  <w:num w:numId="8" w16cid:durableId="1198471537">
+    <w:abstractNumId w:val="30"/>
+  </w:num>
+  <w:num w:numId="9" w16cid:durableId="496963465">
+    <w:abstractNumId w:val="24"/>
+  </w:num>
+  <w:num w:numId="10" w16cid:durableId="1793087086">
+    <w:abstractNumId w:val="33"/>
+  </w:num>
+  <w:num w:numId="11" w16cid:durableId="639381789">
+    <w:abstractNumId w:val="36"/>
+  </w:num>
+  <w:num w:numId="12" w16cid:durableId="879710481">
+    <w:abstractNumId w:val="26"/>
+  </w:num>
+  <w:num w:numId="13" w16cid:durableId="615912581">
+    <w:abstractNumId w:val="19"/>
+  </w:num>
+  <w:num w:numId="14" w16cid:durableId="442657033">
+    <w:abstractNumId w:val="39"/>
+  </w:num>
+  <w:num w:numId="15" w16cid:durableId="462309774">
     <w:abstractNumId w:val="4"/>
   </w:num>
-  <w:num w:numId="3" w16cid:durableId="1220744457">
+  <w:num w:numId="16" w16cid:durableId="754281384">
+    <w:abstractNumId w:val="1"/>
+  </w:num>
+  <w:num w:numId="17" w16cid:durableId="961769830">
+    <w:abstractNumId w:val="35"/>
+  </w:num>
+  <w:num w:numId="18" w16cid:durableId="911426862">
+    <w:abstractNumId w:val="8"/>
+  </w:num>
+  <w:num w:numId="19" w16cid:durableId="301732558">
+    <w:abstractNumId w:val="18"/>
+  </w:num>
+  <w:num w:numId="20" w16cid:durableId="1631129902">
+    <w:abstractNumId w:val="9"/>
+  </w:num>
+  <w:num w:numId="21" w16cid:durableId="1261258701">
+    <w:abstractNumId w:val="15"/>
+  </w:num>
+  <w:num w:numId="22" w16cid:durableId="1082139385">
+    <w:abstractNumId w:val="28"/>
+  </w:num>
+  <w:num w:numId="23" w16cid:durableId="1413700826">
+    <w:abstractNumId w:val="32"/>
+  </w:num>
+  <w:num w:numId="24" w16cid:durableId="1748066663">
     <w:abstractNumId w:val="5"/>
   </w:num>
-  <w:num w:numId="4" w16cid:durableId="780303006">
-    <w:abstractNumId w:val="28"/>
-  </w:num>
-  <w:num w:numId="5" w16cid:durableId="455099609">
-    <w:abstractNumId w:val="30"/>
-  </w:num>
-  <w:num w:numId="6" w16cid:durableId="451284179">
-    <w:abstractNumId w:val="41"/>
-  </w:num>
-  <w:num w:numId="7" w16cid:durableId="183129113">
-    <w:abstractNumId w:val="15"/>
-  </w:num>
-  <w:num w:numId="8" w16cid:durableId="594443495">
+  <w:num w:numId="25" w16cid:durableId="85614526">
     <w:abstractNumId w:val="40"/>
   </w:num>
-  <w:num w:numId="9" w16cid:durableId="1127356624">
+  <w:num w:numId="26" w16cid:durableId="1576164505">
+    <w:abstractNumId w:val="16"/>
+  </w:num>
+  <w:num w:numId="27" w16cid:durableId="1174151349">
     <w:abstractNumId w:val="3"/>
   </w:num>
-  <w:num w:numId="10" w16cid:durableId="1046954709">
-    <w:abstractNumId w:val="27"/>
+  <w:num w:numId="28" w16cid:durableId="2002850244">
+    <w:abstractNumId w:val="29"/>
   </w:num>
-  <w:num w:numId="11" w16cid:durableId="885802778">
+  <w:num w:numId="29" w16cid:durableId="1864899903">
+    <w:abstractNumId w:val="10"/>
+  </w:num>
+  <w:num w:numId="30" w16cid:durableId="391588196">
+    <w:abstractNumId w:val="13"/>
+  </w:num>
+  <w:num w:numId="31" w16cid:durableId="1820729954">
+    <w:abstractNumId w:val="7"/>
+  </w:num>
+  <w:num w:numId="32" w16cid:durableId="976565481">
+    <w:abstractNumId w:val="11"/>
+  </w:num>
+  <w:num w:numId="33" w16cid:durableId="509830765">
+    <w:abstractNumId w:val="2"/>
+  </w:num>
+  <w:num w:numId="34" w16cid:durableId="63571194">
+    <w:abstractNumId w:val="17"/>
+  </w:num>
+  <w:num w:numId="35" w16cid:durableId="118914675">
+    <w:abstractNumId w:val="6"/>
+  </w:num>
+  <w:num w:numId="36" w16cid:durableId="781346167">
+    <w:abstractNumId w:val="23"/>
+  </w:num>
+  <w:num w:numId="37" w16cid:durableId="1667903987">
+    <w:abstractNumId w:val="25"/>
+  </w:num>
+  <w:num w:numId="38" w16cid:durableId="2084983314">
+    <w:abstractNumId w:val="37"/>
+  </w:num>
+  <w:num w:numId="39" w16cid:durableId="1082264245">
     <w:abstractNumId w:val="14"/>
   </w:num>
-  <w:num w:numId="12" w16cid:durableId="1733000823">
-    <w:abstractNumId w:val="36"/>
-  </w:num>
-  <w:num w:numId="13" w16cid:durableId="26181127">
-    <w:abstractNumId w:val="31"/>
-  </w:num>
-  <w:num w:numId="14" w16cid:durableId="623777813">
-    <w:abstractNumId w:val="10"/>
-  </w:num>
-  <w:num w:numId="15" w16cid:durableId="2129200220">
-    <w:abstractNumId w:val="8"/>
-  </w:num>
-  <w:num w:numId="16" w16cid:durableId="1589850037">
-    <w:abstractNumId w:val="39"/>
-  </w:num>
-  <w:num w:numId="17" w16cid:durableId="1949966969">
-    <w:abstractNumId w:val="1"/>
-  </w:num>
-  <w:num w:numId="18" w16cid:durableId="1440953968">
+  <w:num w:numId="40" w16cid:durableId="357970460">
     <w:abstractNumId w:val="34"/>
   </w:num>
-  <w:num w:numId="19" w16cid:durableId="581108704">
-    <w:abstractNumId w:val="9"/>
-  </w:num>
-  <w:num w:numId="20" w16cid:durableId="1585215545">
-    <w:abstractNumId w:val="33"/>
-  </w:num>
-  <w:num w:numId="21" w16cid:durableId="851575914">
-    <w:abstractNumId w:val="35"/>
-  </w:num>
-  <w:num w:numId="22" w16cid:durableId="6910830">
-    <w:abstractNumId w:val="32"/>
-  </w:num>
-  <w:num w:numId="23" w16cid:durableId="1693605975">
-    <w:abstractNumId w:val="12"/>
-  </w:num>
-  <w:num w:numId="24" w16cid:durableId="773091187">
-    <w:abstractNumId w:val="22"/>
-  </w:num>
-  <w:num w:numId="25" w16cid:durableId="1356347719">
-    <w:abstractNumId w:val="24"/>
-  </w:num>
-  <w:num w:numId="26" w16cid:durableId="1745057182">
-    <w:abstractNumId w:val="11"/>
-  </w:num>
-  <w:num w:numId="27" w16cid:durableId="1341587456">
+  <w:num w:numId="41" w16cid:durableId="663557899">
     <w:abstractNumId w:val="38"/>
   </w:num>
-  <w:num w:numId="28" w16cid:durableId="742339688">
-    <w:abstractNumId w:val="20"/>
-  </w:num>
-  <w:num w:numId="29" w16cid:durableId="1688361955">
-    <w:abstractNumId w:val="23"/>
-  </w:num>
-  <w:num w:numId="30" w16cid:durableId="834297035">
-    <w:abstractNumId w:val="25"/>
-  </w:num>
-  <w:num w:numId="31" w16cid:durableId="1794131376">
-    <w:abstractNumId w:val="7"/>
-  </w:num>
-  <w:num w:numId="32" w16cid:durableId="1754736319">
-    <w:abstractNumId w:val="21"/>
-  </w:num>
-  <w:num w:numId="33" w16cid:durableId="716861154">
-    <w:abstractNumId w:val="13"/>
-  </w:num>
-  <w:num w:numId="34" w16cid:durableId="2143111407">
-    <w:abstractNumId w:val="18"/>
-  </w:num>
-  <w:num w:numId="35" w16cid:durableId="1525317389">
-    <w:abstractNumId w:val="26"/>
-  </w:num>
-  <w:num w:numId="36" w16cid:durableId="1157569278">
-    <w:abstractNumId w:val="29"/>
-  </w:num>
-  <w:num w:numId="37" w16cid:durableId="1695229903">
-    <w:abstractNumId w:val="19"/>
-  </w:num>
-  <w:num w:numId="38" w16cid:durableId="596251946">
-    <w:abstractNumId w:val="37"/>
-  </w:num>
-  <w:num w:numId="39" w16cid:durableId="1619292240">
-    <w:abstractNumId w:val="16"/>
-  </w:num>
-  <w:num w:numId="40" w16cid:durableId="2013415028">
-    <w:abstractNumId w:val="2"/>
-  </w:num>
-  <w:num w:numId="41" w16cid:durableId="317926508">
-    <w:abstractNumId w:val="17"/>
-  </w:num>
-  <w:num w:numId="42" w16cid:durableId="2068453619">
-    <w:abstractNumId w:val="6"/>
+  <w:num w:numId="42" w16cid:durableId="1193811790">
+    <w:abstractNumId w:val="41"/>
   </w:num>
 </w:numbering>
 </file>

</xml_diff>

<commit_message>
Manuales: autor y legajo corregidos, manual de usuario con capturas del sistema
- Portada de los tres manuales con el nombre y el legajo correctos.
- Manual de usuario: 15 capturas nuevas (Ventas, Produccion, Compras y stock, Logistica, Finanzas, Administracion).
- Imagenes del manual de usuario ajustadas al ancho de la hoja (antes se cortaban en el borde).

Co-Authored-By: Claude Sonnet 5.5 <noreply@anthropic.com>
</commit_message>
<xml_diff>
--- a/Documentacion/Manuales/Manual-de-instalacion.docx
+++ b/Documentacion/Manuales/Manual-de-instalacion.docx
@@ -117,7 +117,7 @@
           <w:sz w:val="22"/>
           <w:szCs w:val="22"/>
         </w:rPr>
-        <w:t>Autor: Dante Schlögl</w:t>
+        <w:t>Autor: Dante Alberto Luis Orihuela Schlögl - Legajo B00000555-VCO</w:t>
       </w:r>
     </w:p>
     <w:p>
@@ -10888,7 +10888,7 @@
           <w:sz w:val="22"/>
           <w:szCs w:val="22"/>
         </w:rPr>
-        <w:t>Autor: Dante Schlögl. Prácticas Profesionalizantes III. Código fuente, scripts y modelo en el repositorio del proyecto.</w:t>
+        <w:t>Autor: Dante Alberto Luis Orihuela Schlögl (Legajo B00000555-VCO). Prácticas Profesionalizantes III. Código fuente, scripts y modelo en el repositorio del proyecto.</w:t>
       </w:r>
     </w:p>
     <w:sectPr>

</xml_diff>

<commit_message>
Manuales: manual de instalacion con capturas del programa; captura de Roles y permisos sin ventana ajena; captura del administrador inicial limpia
Co-Authored-By: Claude Sonnet 5.5 <noreply@anthropic.com>
</commit_message>
<xml_diff>
--- a/Documentacion/Manuales/Manual-de-instalacion.docx
+++ b/Documentacion/Manuales/Manual-de-instalacion.docx
@@ -1863,16 +1863,7 @@
           <w:sz w:val="22"/>
           <w:szCs w:val="22"/>
         </w:rPr>
-        <w:t xml:space="preserve"> </w:t>
-      </w:r>
-      <w:r>
-        <w:rPr>
-          <w:rFonts w:ascii="Calibri" w:eastAsia="Times New Roman" w:hAnsi="Calibri" w:cs="Calibri"/>
-          <w:color w:val="1C2430"/>
-          <w:sz w:val="22"/>
-          <w:szCs w:val="22"/>
-        </w:rPr>
-        <w:t>SQL Server (LocalDB, Express, Standard o Enterprise).</w:t>
+        <w:t xml:space="preserve"> SQL Server (LocalDB, Express, Standard o Enterprise).</w:t>
       </w:r>
     </w:p>
     <w:p>
@@ -3618,16 +3609,7 @@
           <w:sz w:val="22"/>
           <w:szCs w:val="22"/>
         </w:rPr>
-        <w:t xml:space="preserve"> </w:t>
-      </w:r>
-      <w:r>
-        <w:rPr>
-          <w:rFonts w:ascii="Calibri" w:eastAsia="Times New Roman" w:hAnsi="Calibri" w:cs="Calibri"/>
-          <w:color w:val="1C2430"/>
-          <w:sz w:val="22"/>
-          <w:szCs w:val="22"/>
-        </w:rPr>
-        <w:t xml:space="preserve">(recomendada, automática) o </w:t>
+        <w:t xml:space="preserve"> (recomendada, automática) o </w:t>
       </w:r>
       <w:r>
         <w:rPr>
@@ -4111,6 +4093,72 @@
     </w:p>
     <w:p>
       <w:pPr>
+        <w:spacing w:before="120" w:after="120"/>
+        <w:jc w:val="center"/>
+        <w:rPr>
+          <w:rFonts w:ascii="Calibri" w:hAnsi="Calibri" w:cs="Calibri"/>
+          <w:sz w:val="22"/>
+        </w:rPr>
+      </w:pPr>
+      <w:r>
+        <w:rPr>
+          <w:rFonts w:ascii="Calibri" w:hAnsi="Calibri" w:cs="Calibri"/>
+          <w:noProof/>
+          <w:sz w:val="22"/>
+        </w:rPr>
+        <w:drawing>
+          <wp:inline distT="0" distB="0" distL="0" distR="0" wp14:anchorId="63841163" wp14:editId="22DBD885">
+            <wp:extent cx="5397500" cy="1750506"/>
+            <wp:effectExtent l="0" t="0" r="0" b="2540"/>
+            <wp:docPr id="1314766359" name="Picture 4"/>
+            <wp:cNvGraphicFramePr>
+              <a:graphicFrameLocks xmlns:a="http://schemas.openxmlformats.org/drawingml/2006/main" noChangeAspect="1"/>
+            </wp:cNvGraphicFramePr>
+            <a:graphic xmlns:a="http://schemas.openxmlformats.org/drawingml/2006/main">
+              <a:graphicData uri="http://schemas.openxmlformats.org/drawingml/2006/picture">
+                <pic:pic xmlns:pic="http://schemas.openxmlformats.org/drawingml/2006/picture">
+                  <pic:nvPicPr>
+                    <pic:cNvPr id="1314766359" name=""/>
+                    <pic:cNvPicPr/>
+                  </pic:nvPicPr>
+                  <pic:blipFill>
+                    <a:blip r:embed="rId5">
+                      <a:extLst>
+                        <a:ext uri="{28A0092B-C50C-407E-A947-70E740481C1C}">
+                          <a14:useLocalDpi xmlns:a14="http://schemas.microsoft.com/office/drawing/2010/main" val="0"/>
+                        </a:ext>
+                      </a:extLst>
+                    </a:blip>
+                    <a:stretch>
+                      <a:fillRect/>
+                    </a:stretch>
+                  </pic:blipFill>
+                  <pic:spPr>
+                    <a:xfrm>
+                      <a:off x="0" y="0"/>
+                      <a:ext cx="5397500" cy="1750506"/>
+                    </a:xfrm>
+                    <a:prstGeom prst="rect">
+                      <a:avLst/>
+                    </a:prstGeom>
+                  </pic:spPr>
+                </pic:pic>
+              </a:graphicData>
+            </a:graphic>
+          </wp:inline>
+        </w:drawing>
+      </w:r>
+      <w:r>
+        <w:rPr>
+          <w:rFonts w:ascii="Calibri" w:hAnsi="Calibri" w:cs="Calibri"/>
+          <w:sz w:val="22"/>
+        </w:rPr>
+        <w:br/>
+        <w:t>Resultado de la prueba de conexión con sqlcmd</w:t>
+      </w:r>
+    </w:p>
+    <w:p>
+      <w:pPr>
         <w:pStyle w:val="Heading2"/>
         <w:rPr>
           <w:rFonts w:ascii="Calibri" w:eastAsia="Times New Roman" w:hAnsi="Calibri" w:cs="Calibri"/>
@@ -5004,16 +5052,7 @@
           <w:sz w:val="22"/>
           <w:szCs w:val="22"/>
         </w:rPr>
-        <w:t xml:space="preserve"> </w:t>
-      </w:r>
-      <w:r>
-        <w:rPr>
-          <w:rFonts w:ascii="Calibri" w:eastAsia="Times New Roman" w:hAnsi="Calibri" w:cs="Calibri"/>
-          <w:color w:val="1C2430"/>
-          <w:sz w:val="22"/>
-          <w:szCs w:val="22"/>
-        </w:rPr>
-        <w:t xml:space="preserve">con Visual Studio y ejecutá con F5; o, si ya está compilado, ejecutá </w:t>
+        <w:t xml:space="preserve"> con Visual Studio y ejecutá con F5; o, si ya está compilado, ejecutá </w:t>
       </w:r>
       <w:r>
         <w:rPr>
@@ -6028,16 +6067,7 @@
           <w:sz w:val="22"/>
           <w:szCs w:val="22"/>
         </w:rPr>
-        <w:t xml:space="preserve"> </w:t>
-      </w:r>
-      <w:r>
-        <w:rPr>
-          <w:rFonts w:ascii="Calibri" w:eastAsia="Times New Roman" w:hAnsi="Calibri" w:cs="Calibri"/>
-          <w:color w:val="1C2430"/>
-          <w:sz w:val="22"/>
-          <w:szCs w:val="22"/>
-        </w:rPr>
-        <w:t>los siete roles: Administrador, Vendedor, Responsable de Producción, Responsable de Depósito, Responsable de Compras, Responsable de Logística y Supervisor.</w:t>
+        <w:t xml:space="preserve"> los siete roles: Administrador, Vendedor, Responsable de Producción, Responsable de Depósito, Responsable de Compras, Responsable de Logística y Supervisor.</w:t>
       </w:r>
     </w:p>
     <w:p>
@@ -7154,13 +7184,7 @@
         <w:rPr>
           <w:color w:val="1C2430"/>
         </w:rPr>
-        <w:t>&lt;</w:t>
-      </w:r>
-      <w:r>
-        <w:rPr>
-          <w:color w:val="1C2430"/>
-        </w:rPr>
-        <w:t>add key="SqlServerInstancia" value=".\SQLEXPRESS" /&gt;</w:t>
+        <w:t>&lt;add key="SqlServerInstancia" value=".\SQLEXPRESS" /&gt;</w:t>
       </w:r>
     </w:p>
     <w:p>
@@ -7765,6 +7789,8 @@
     <w:p>
       <w:pPr>
         <w:pStyle w:val="NormalWeb"/>
+        <w:spacing w:before="120" w:after="120"/>
+        <w:jc w:val="center"/>
         <w:rPr>
           <w:rFonts w:ascii="Calibri" w:hAnsi="Calibri" w:cs="Calibri"/>
           <w:color w:val="1C2430"/>
@@ -7775,35 +7801,16 @@
       <w:r>
         <w:rPr>
           <w:rFonts w:ascii="Calibri" w:hAnsi="Calibri" w:cs="Calibri"/>
-          <w:color w:val="1C2430"/>
-          <w:sz w:val="22"/>
-          <w:szCs w:val="22"/>
-        </w:rPr>
-        <w:t>En el modo SQL Server, si todavía no existe ningún administrador, aparece la pantalla para crearlo:</w:t>
-      </w:r>
-    </w:p>
-    <w:p>
-      <w:pPr>
-        <w:rPr>
-          <w:rFonts w:ascii="Calibri" w:eastAsia="Times New Roman" w:hAnsi="Calibri" w:cs="Calibri"/>
-          <w:color w:val="1C2430"/>
-          <w:sz w:val="22"/>
-          <w:szCs w:val="22"/>
-        </w:rPr>
-      </w:pPr>
-      <w:r>
-        <w:rPr>
-          <w:rFonts w:ascii="Calibri" w:eastAsia="Times New Roman" w:hAnsi="Calibri" w:cs="Calibri"/>
           <w:noProof/>
           <w:color w:val="1C2430"/>
           <w:sz w:val="22"/>
           <w:szCs w:val="22"/>
         </w:rPr>
         <w:drawing>
-          <wp:inline distT="0" distB="0" distL="0" distR="0">
-            <wp:extent cx="18249900" cy="9620250"/>
+          <wp:inline distT="0" distB="0" distL="0" distR="0" wp14:anchorId="1D85778C" wp14:editId="2D844425">
+            <wp:extent cx="4191000" cy="3228509"/>
             <wp:effectExtent l="0" t="0" r="0" b="0"/>
-            <wp:docPr id="1" name="Picture 1"/>
+            <wp:docPr id="1013994476" name="Picture 3"/>
             <wp:cNvGraphicFramePr>
               <a:graphicFrameLocks xmlns:a="http://schemas.openxmlformats.org/drawingml/2006/main" noChangeAspect="1"/>
             </wp:cNvGraphicFramePr>
@@ -7811,36 +7818,29 @@
               <a:graphicData uri="http://schemas.openxmlformats.org/drawingml/2006/picture">
                 <pic:pic xmlns:pic="http://schemas.openxmlformats.org/drawingml/2006/picture">
                   <pic:nvPicPr>
-                    <pic:cNvPr id="0" name="Picture 1"/>
-                    <pic:cNvPicPr>
-                      <a:picLocks noChangeAspect="1" noChangeArrowheads="1"/>
-                    </pic:cNvPicPr>
+                    <pic:cNvPr id="1013994476" name=""/>
+                    <pic:cNvPicPr/>
                   </pic:nvPicPr>
                   <pic:blipFill>
-                    <a:blip r:embed="rId5">
+                    <a:blip r:embed="rId6">
                       <a:extLst>
                         <a:ext uri="{28A0092B-C50C-407E-A947-70E740481C1C}">
                           <a14:useLocalDpi xmlns:a14="http://schemas.microsoft.com/office/drawing/2010/main" val="0"/>
                         </a:ext>
                       </a:extLst>
                     </a:blip>
-                    <a:srcRect/>
                     <a:stretch>
                       <a:fillRect/>
                     </a:stretch>
                   </pic:blipFill>
-                  <pic:spPr bwMode="auto">
+                  <pic:spPr>
                     <a:xfrm>
                       <a:off x="0" y="0"/>
-                      <a:ext cx="18249900" cy="9620250"/>
+                      <a:ext cx="4191000" cy="3228509"/>
                     </a:xfrm>
                     <a:prstGeom prst="rect">
                       <a:avLst/>
                     </a:prstGeom>
-                    <a:noFill/>
-                    <a:ln>
-                      <a:noFill/>
-                    </a:ln>
                   </pic:spPr>
                 </pic:pic>
               </a:graphicData>
@@ -7850,30 +7850,112 @@
       </w:r>
       <w:r>
         <w:rPr>
-          <w:rFonts w:ascii="Calibri" w:eastAsia="Times New Roman" w:hAnsi="Calibri" w:cs="Calibri"/>
-          <w:color w:val="1C2430"/>
-          <w:sz w:val="22"/>
-          <w:szCs w:val="22"/>
-        </w:rPr>
-        <w:t>Creación del administrador inicia</w:t>
-      </w:r>
-      <w:r>
-        <w:rPr>
-          <w:rFonts w:ascii="Calibri" w:eastAsia="Times New Roman" w:hAnsi="Calibri" w:cs="Calibri"/>
-          <w:color w:val="1C2430"/>
-          <w:sz w:val="22"/>
-          <w:szCs w:val="22"/>
-        </w:rPr>
-        <w:t>l</w:t>
-      </w:r>
-      <w:r>
-        <w:rPr>
-          <w:rFonts w:ascii="Calibri" w:eastAsia="Times New Roman" w:hAnsi="Calibri" w:cs="Calibri"/>
-          <w:color w:val="1C2430"/>
-          <w:sz w:val="22"/>
-          <w:szCs w:val="22"/>
-        </w:rPr>
-        <w:t xml:space="preserve"> </w:t>
+          <w:rFonts w:ascii="Calibri" w:hAnsi="Calibri" w:cs="Calibri"/>
+          <w:color w:val="1C2430"/>
+          <w:sz w:val="22"/>
+          <w:szCs w:val="22"/>
+        </w:rPr>
+        <w:br/>
+        <w:t>Pantalla de selección del modo de trabajo</w:t>
+      </w:r>
+    </w:p>
+    <w:p>
+      <w:pPr>
+        <w:pStyle w:val="NormalWeb"/>
+        <w:rPr>
+          <w:rFonts w:ascii="Calibri" w:hAnsi="Calibri" w:cs="Calibri"/>
+          <w:color w:val="1C2430"/>
+          <w:sz w:val="22"/>
+          <w:szCs w:val="22"/>
+        </w:rPr>
+      </w:pPr>
+      <w:r>
+        <w:rPr>
+          <w:rFonts w:ascii="Calibri" w:hAnsi="Calibri" w:cs="Calibri"/>
+          <w:color w:val="1C2430"/>
+          <w:sz w:val="22"/>
+          <w:szCs w:val="22"/>
+        </w:rPr>
+        <w:t>En el modo SQL Server, si todavía no existe ningún administrador, aparece la pantalla para crearlo:</w:t>
+      </w:r>
+    </w:p>
+    <w:p>
+      <w:pPr>
+        <w:jc w:val="center"/>
+        <w:rPr>
+          <w:rFonts w:ascii="Calibri" w:eastAsia="Times New Roman" w:hAnsi="Calibri" w:cs="Calibri"/>
+          <w:color w:val="1C2430"/>
+          <w:sz w:val="22"/>
+          <w:szCs w:val="22"/>
+        </w:rPr>
+      </w:pPr>
+      <w:r>
+        <w:rPr>
+          <w:rFonts w:ascii="Calibri" w:eastAsia="Times New Roman" w:hAnsi="Calibri" w:cs="Calibri"/>
+          <w:noProof/>
+          <w:color w:val="1C2430"/>
+          <w:sz w:val="22"/>
+          <w:szCs w:val="22"/>
+        </w:rPr>
+        <w:drawing>
+          <wp:inline distT="0" distB="0" distL="0" distR="0" wp14:anchorId="1E0B4401" wp14:editId="098E1BDE">
+            <wp:extent cx="3175000" cy="3022940"/>
+            <wp:effectExtent l="0" t="0" r="6350" b="6350"/>
+            <wp:docPr id="864528874" name="Picture 5"/>
+            <wp:cNvGraphicFramePr>
+              <a:graphicFrameLocks xmlns:a="http://schemas.openxmlformats.org/drawingml/2006/main" noChangeAspect="1"/>
+            </wp:cNvGraphicFramePr>
+            <a:graphic xmlns:a="http://schemas.openxmlformats.org/drawingml/2006/main">
+              <a:graphicData uri="http://schemas.openxmlformats.org/drawingml/2006/picture">
+                <pic:pic xmlns:pic="http://schemas.openxmlformats.org/drawingml/2006/picture">
+                  <pic:nvPicPr>
+                    <pic:cNvPr id="864528874" name=""/>
+                    <pic:cNvPicPr/>
+                  </pic:nvPicPr>
+                  <pic:blipFill>
+                    <a:blip r:embed="rId7">
+                      <a:extLst>
+                        <a:ext uri="{28A0092B-C50C-407E-A947-70E740481C1C}">
+                          <a14:useLocalDpi xmlns:a14="http://schemas.microsoft.com/office/drawing/2010/main" val="0"/>
+                        </a:ext>
+                      </a:extLst>
+                    </a:blip>
+                    <a:stretch>
+                      <a:fillRect/>
+                    </a:stretch>
+                  </pic:blipFill>
+                  <pic:spPr>
+                    <a:xfrm>
+                      <a:off x="0" y="0"/>
+                      <a:ext cx="3175000" cy="3022940"/>
+                    </a:xfrm>
+                    <a:prstGeom prst="rect">
+                      <a:avLst/>
+                    </a:prstGeom>
+                  </pic:spPr>
+                </pic:pic>
+              </a:graphicData>
+            </a:graphic>
+          </wp:inline>
+        </w:drawing>
+      </w:r>
+      <w:r>
+        <w:rPr>
+          <w:rFonts w:ascii="Calibri" w:eastAsia="Times New Roman" w:hAnsi="Calibri" w:cs="Calibri"/>
+          <w:color w:val="1C2430"/>
+          <w:sz w:val="22"/>
+          <w:szCs w:val="22"/>
+        </w:rPr>
+        <w:br/>
+      </w:r>
+      <w:r>
+        <w:rPr>
+          <w:rFonts w:ascii="Calibri" w:eastAsia="Times New Roman" w:hAnsi="Calibri" w:cs="Calibri"/>
+          <w:color w:val="1C2430"/>
+          <w:sz w:val="22"/>
+          <w:szCs w:val="22"/>
+        </w:rPr>
+        <w:t xml:space="preserve">Creación del administrador inicial </w:t>
       </w:r>
     </w:p>
     <w:p>
@@ -7999,6 +8081,79 @@
     <w:p>
       <w:pPr>
         <w:pStyle w:val="NormalWeb"/>
+        <w:spacing w:before="120" w:after="120"/>
+        <w:jc w:val="center"/>
+        <w:rPr>
+          <w:rFonts w:ascii="Calibri" w:hAnsi="Calibri" w:cs="Calibri"/>
+          <w:color w:val="1C2430"/>
+          <w:sz w:val="22"/>
+          <w:szCs w:val="22"/>
+        </w:rPr>
+      </w:pPr>
+      <w:r>
+        <w:rPr>
+          <w:rFonts w:ascii="Calibri" w:hAnsi="Calibri" w:cs="Calibri"/>
+          <w:noProof/>
+          <w:color w:val="1C2430"/>
+          <w:sz w:val="22"/>
+          <w:szCs w:val="22"/>
+        </w:rPr>
+        <w:drawing>
+          <wp:inline distT="0" distB="0" distL="0" distR="0" wp14:anchorId="20DD16F2" wp14:editId="45953E1F">
+            <wp:extent cx="5080000" cy="3361976"/>
+            <wp:effectExtent l="0" t="0" r="6350" b="0"/>
+            <wp:docPr id="1700946369" name="Picture 2"/>
+            <wp:cNvGraphicFramePr>
+              <a:graphicFrameLocks xmlns:a="http://schemas.openxmlformats.org/drawingml/2006/main" noChangeAspect="1"/>
+            </wp:cNvGraphicFramePr>
+            <a:graphic xmlns:a="http://schemas.openxmlformats.org/drawingml/2006/main">
+              <a:graphicData uri="http://schemas.openxmlformats.org/drawingml/2006/picture">
+                <pic:pic xmlns:pic="http://schemas.openxmlformats.org/drawingml/2006/picture">
+                  <pic:nvPicPr>
+                    <pic:cNvPr id="1700946369" name=""/>
+                    <pic:cNvPicPr/>
+                  </pic:nvPicPr>
+                  <pic:blipFill>
+                    <a:blip r:embed="rId8">
+                      <a:extLst>
+                        <a:ext uri="{28A0092B-C50C-407E-A947-70E740481C1C}">
+                          <a14:useLocalDpi xmlns:a14="http://schemas.microsoft.com/office/drawing/2010/main" val="0"/>
+                        </a:ext>
+                      </a:extLst>
+                    </a:blip>
+                    <a:stretch>
+                      <a:fillRect/>
+                    </a:stretch>
+                  </pic:blipFill>
+                  <pic:spPr>
+                    <a:xfrm>
+                      <a:off x="0" y="0"/>
+                      <a:ext cx="5080000" cy="3361976"/>
+                    </a:xfrm>
+                    <a:prstGeom prst="rect">
+                      <a:avLst/>
+                    </a:prstGeom>
+                  </pic:spPr>
+                </pic:pic>
+              </a:graphicData>
+            </a:graphic>
+          </wp:inline>
+        </w:drawing>
+      </w:r>
+      <w:r>
+        <w:rPr>
+          <w:rFonts w:ascii="Calibri" w:hAnsi="Calibri" w:cs="Calibri"/>
+          <w:color w:val="1C2430"/>
+          <w:sz w:val="22"/>
+          <w:szCs w:val="22"/>
+        </w:rPr>
+        <w:br/>
+        <w:t>Pantalla de inicio de sesión</w:t>
+      </w:r>
+    </w:p>
+    <w:p>
+      <w:pPr>
+        <w:pStyle w:val="NormalWeb"/>
         <w:rPr>
           <w:rFonts w:ascii="Calibri" w:hAnsi="Calibri" w:cs="Calibri"/>
           <w:color w:val="1C2430"/>
@@ -8342,6 +8497,78 @@
           <w:szCs w:val="22"/>
         </w:rPr>
         <w:t>Ingresá con el administrador.</w:t>
+      </w:r>
+    </w:p>
+    <w:p>
+      <w:pPr>
+        <w:spacing w:before="120" w:beforeAutospacing="1" w:after="120" w:afterAutospacing="1"/>
+        <w:jc w:val="center"/>
+        <w:rPr>
+          <w:rFonts w:ascii="Calibri" w:eastAsia="Times New Roman" w:hAnsi="Calibri" w:cs="Calibri"/>
+          <w:color w:val="1C2430"/>
+          <w:sz w:val="22"/>
+          <w:szCs w:val="22"/>
+        </w:rPr>
+      </w:pPr>
+      <w:r>
+        <w:rPr>
+          <w:rFonts w:ascii="Calibri" w:eastAsia="Times New Roman" w:hAnsi="Calibri" w:cs="Calibri"/>
+          <w:noProof/>
+          <w:color w:val="1C2430"/>
+          <w:sz w:val="22"/>
+          <w:szCs w:val="22"/>
+        </w:rPr>
+        <w:drawing>
+          <wp:inline distT="0" distB="0" distL="0" distR="0" wp14:anchorId="6142BFF3" wp14:editId="065CCCD8">
+            <wp:extent cx="5397500" cy="3078936"/>
+            <wp:effectExtent l="0" t="0" r="0" b="7620"/>
+            <wp:docPr id="1046379083" name="Picture 1"/>
+            <wp:cNvGraphicFramePr>
+              <a:graphicFrameLocks xmlns:a="http://schemas.openxmlformats.org/drawingml/2006/main" noChangeAspect="1"/>
+            </wp:cNvGraphicFramePr>
+            <a:graphic xmlns:a="http://schemas.openxmlformats.org/drawingml/2006/main">
+              <a:graphicData uri="http://schemas.openxmlformats.org/drawingml/2006/picture">
+                <pic:pic xmlns:pic="http://schemas.openxmlformats.org/drawingml/2006/picture">
+                  <pic:nvPicPr>
+                    <pic:cNvPr id="1046379083" name=""/>
+                    <pic:cNvPicPr/>
+                  </pic:nvPicPr>
+                  <pic:blipFill>
+                    <a:blip r:embed="rId9" cstate="print">
+                      <a:extLst>
+                        <a:ext uri="{28A0092B-C50C-407E-A947-70E740481C1C}">
+                          <a14:useLocalDpi xmlns:a14="http://schemas.microsoft.com/office/drawing/2010/main" val="0"/>
+                        </a:ext>
+                      </a:extLst>
+                    </a:blip>
+                    <a:stretch>
+                      <a:fillRect/>
+                    </a:stretch>
+                  </pic:blipFill>
+                  <pic:spPr>
+                    <a:xfrm>
+                      <a:off x="0" y="0"/>
+                      <a:ext cx="5397500" cy="3078936"/>
+                    </a:xfrm>
+                    <a:prstGeom prst="rect">
+                      <a:avLst/>
+                    </a:prstGeom>
+                  </pic:spPr>
+                </pic:pic>
+              </a:graphicData>
+            </a:graphic>
+          </wp:inline>
+        </w:drawing>
+      </w:r>
+      <w:r>
+        <w:rPr>
+          <w:rFonts w:ascii="Calibri" w:eastAsia="Times New Roman" w:hAnsi="Calibri" w:cs="Calibri"/>
+          <w:color w:val="1C2430"/>
+          <w:sz w:val="22"/>
+          <w:szCs w:val="22"/>
+        </w:rPr>
+        <w:br/>
+        <w:t>Panel general del programa después de iniciar sesión</w:t>
       </w:r>
     </w:p>
     <w:p>

</xml_diff>